<commit_message>
feat: Introduce new features
</commit_message>
<xml_diff>
--- a/docs/patent.docx
+++ b/docs/patent.docx
@@ -1,6 +1,6 @@
 
 <file path=word/document.xml><?xml version="1.0" encoding="utf-8"?>
-<w:document xmlns:wpc="http://schemas.microsoft.com/office/word/2010/wordprocessingCanvas" xmlns:cx="http://schemas.microsoft.com/office/drawing/2014/chartex" xmlns:cx1="http://schemas.microsoft.com/office/drawing/2015/9/8/chartex" xmlns:cx2="http://schemas.microsoft.com/office/drawing/2015/10/21/chartex" xmlns:cx3="http://schemas.microsoft.com/office/drawing/2016/5/9/chartex" xmlns:cx4="http://schemas.microsoft.com/office/drawing/2016/5/10/chartex" xmlns:cx5="http://schemas.microsoft.com/office/drawing/2016/5/11/chartex" xmlns:cx6="http://schemas.microsoft.com/office/drawing/2016/5/12/chartex" xmlns:cx7="http://schemas.microsoft.com/office/drawing/2016/5/13/chartex" xmlns:cx8="http://schemas.microsoft.com/office/drawing/2016/5/14/chartex" xmlns:mc="http://schemas.openxmlformats.org/markup-compatibility/2006" xmlns:m="http://schemas.openxmlformats.org/officeDocument/2006/math" xmlns:aink="http://schemas.microsoft.com/office/drawing/2016/ink" xmlns:am3d="http://schemas.microsoft.com/office/drawing/2017/model3d" xmlns:oel="http://schemas.microsoft.com/office/2019/extlst" xmlns:r="http://schemas.openxmlformats.org/officeDocument/2006/relationships" xmlns:wp14="http://schemas.microsoft.com/office/word/2010/wordprocessingDrawing" xmlns:wp="http://schemas.openxmlformats.org/drawingml/2006/wordprocessingDrawing" xmlns:wpg="http://schemas.microsoft.com/office/word/2010/wordprocessingGroup" xmlns:wpi="http://schemas.microsoft.com/office/word/2010/wordprocessingInk" xmlns:wps="http://schemas.microsoft.com/office/word/2010/wordprocessingShape" xmlns:o="urn:schemas-microsoft-com:office:office" xmlns:v="urn:schemas-microsoft-com:vml" xmlns:w10="urn:schemas-microsoft-com:office:word" xmlns:w="http://schemas.openxmlformats.org/wordprocessingml/2006/main" xmlns:w14="http://schemas.microsoft.com/office/word/2010/wordml" xmlns:w15="http://schemas.microsoft.com/office/word/2012/wordml" xmlns:w16cex="http://schemas.microsoft.com/office/word/2018/wordml/cex" xmlns:w16cid="http://schemas.microsoft.com/office/word/2016/wordml/cid" xmlns:w16="http://schemas.microsoft.com/office/word/2018/wordml" xmlns:w16sdtdh="http://schemas.microsoft.com/office/word/2020/wordml/sdtdatahash" xmlns:w16sdtfl="http://schemas.microsoft.com/office/word/2024/wordml/sdtformatlock" xmlns:w16se="http://schemas.microsoft.com/office/word/2015/wordml/symex" xmlns:w16du="http://schemas.microsoft.com/office/word/2023/wordml/word16du" xmlns:wne="http://schemas.microsoft.com/office/word/2006/wordml" mc:Ignorable="w14 w15 w16se w16cid w16 w16cex w16sdtdh w16sdtfl w16du wp14">
+<w:document xmlns:wpc="http://schemas.microsoft.com/office/word/2010/wordprocessingCanvas" xmlns:cx="http://schemas.microsoft.com/office/drawing/2014/chartex" xmlns:cx1="http://schemas.microsoft.com/office/drawing/2015/9/8/chartex" xmlns:cx2="http://schemas.microsoft.com/office/drawing/2015/10/21/chartex" xmlns:cx3="http://schemas.microsoft.com/office/drawing/2016/5/9/chartex" xmlns:cx4="http://schemas.microsoft.com/office/drawing/2016/5/10/chartex" xmlns:cx5="http://schemas.microsoft.com/office/drawing/2016/5/11/chartex" xmlns:cx6="http://schemas.microsoft.com/office/drawing/2016/5/12/chartex" xmlns:cx7="http://schemas.microsoft.com/office/drawing/2016/5/13/chartex" xmlns:cx8="http://schemas.microsoft.com/office/drawing/2016/5/14/chartex" xmlns:mc="http://schemas.openxmlformats.org/markup-compatibility/2006" xmlns:aink="http://schemas.microsoft.com/office/drawing/2016/ink" xmlns:am3d="http://schemas.microsoft.com/office/drawing/2017/model3d" xmlns:o="urn:schemas-microsoft-com:office:office" xmlns:oel="http://schemas.microsoft.com/office/2019/extlst" xmlns:r="http://schemas.openxmlformats.org/officeDocument/2006/relationships" xmlns:m="http://schemas.openxmlformats.org/officeDocument/2006/math" xmlns:v="urn:schemas-microsoft-com:vml" xmlns:wp14="http://schemas.microsoft.com/office/word/2010/wordprocessingDrawing" xmlns:wp="http://schemas.openxmlformats.org/drawingml/2006/wordprocessingDrawing" xmlns:w10="urn:schemas-microsoft-com:office:word" xmlns:w="http://schemas.openxmlformats.org/wordprocessingml/2006/main" xmlns:w14="http://schemas.microsoft.com/office/word/2010/wordml" xmlns:w15="http://schemas.microsoft.com/office/word/2012/wordml" xmlns:w16cex="http://schemas.microsoft.com/office/word/2018/wordml/cex" xmlns:w16cid="http://schemas.microsoft.com/office/word/2016/wordml/cid" xmlns:w16="http://schemas.microsoft.com/office/word/2018/wordml" xmlns:w16du="http://schemas.microsoft.com/office/word/2023/wordml/word16du" xmlns:w16sdtdh="http://schemas.microsoft.com/office/word/2020/wordml/sdtdatahash" xmlns:w16sdtfl="http://schemas.microsoft.com/office/word/2024/wordml/sdtformatlock" xmlns:w16se="http://schemas.microsoft.com/office/word/2015/wordml/symex" xmlns:wpg="http://schemas.microsoft.com/office/word/2010/wordprocessingGroup" xmlns:wpi="http://schemas.microsoft.com/office/word/2010/wordprocessingInk" xmlns:wne="http://schemas.microsoft.com/office/word/2006/wordml" xmlns:wps="http://schemas.microsoft.com/office/word/2010/wordprocessingShape" mc:Ignorable="w14 w15 w16se w16cid w16 w16cex w16sdtdh w16sdtfl w16du wp14">
   <w:body>
     <w:p>
       <w:pPr>
@@ -8,6 +8,9 @@
         <w:spacing w:line="360" w:lineRule="auto"/>
         <w:ind w:firstLine="562"/>
         <w:jc w:val="both"/>
+        <w:rPr>
+          <w:rFonts w:hint="eastAsia"/>
+        </w:rPr>
       </w:pPr>
       <w:r>
         <w:t>本发明公开了一种多信号融合的启发式自适应网络拥塞控制方法及系统。该方法包括三项相互配合的技术手段：其一，在传输层协议栈的多个回调点采集包含窗口、确认、在途数据、往返时延、拥塞避免状态、拥塞事件和显式拥塞通知状态的观测信息，对超时、显式拥塞通知和普通丢包进行语义分类，其中窗口增长回调中观察到的CE或ECE状态可触发显式拥塞通知类响应；其二，根据两倍最小往返时延确定并按预设上下界限制滑动时间窗，以累计确认字节增量计算交付速率，经窗口化最大值滤波得到带宽估计，并结合最小往返时延感知阈值、相对基线反馈和有界目标窗口跟踪形成确定性启发式决策；其三，通过差异化窗口保留、连续缩减保护、降窗后冻结、慢启动阈值锚定、窗口上下界及陈旧决策作废限制控制动作。本发明适用于远距离传输、手机、笔记本电脑、台式机及其他异构终端类别，以及端点、接入链路、路径RTT和业务负载存在差异的端到端传输条件。</w:t>
@@ -91,10 +94,10 @@
           <w:szCs w:val="24"/>
         </w:rPr>
         <w:drawing>
-          <wp:inline distT="0" distB="0" distL="0" distR="0" wp14:anchorId="53159368" wp14:editId="7D790535">
-            <wp:extent cx="5939790" cy="4423410"/>
-            <wp:effectExtent l="0" t="0" r="3810" b="0"/>
-            <wp:docPr id="1094615720" name="图片 1"/>
+          <wp:inline distT="0" distB="0" distL="0" distR="0" wp14:anchorId="4E227497" wp14:editId="4707033A">
+            <wp:extent cx="5935980" cy="4418965"/>
+            <wp:effectExtent l="0" t="0" r="7620" b="635"/>
+            <wp:docPr id="395168742" name="图片 1"/>
             <wp:cNvGraphicFramePr>
               <a:graphicFrameLocks xmlns:a="http://schemas.openxmlformats.org/drawingml/2006/main" noChangeAspect="1"/>
             </wp:cNvGraphicFramePr>
@@ -102,8 +105,10 @@
               <a:graphicData uri="http://schemas.openxmlformats.org/drawingml/2006/picture">
                 <pic:pic xmlns:pic="http://schemas.openxmlformats.org/drawingml/2006/picture">
                   <pic:nvPicPr>
-                    <pic:cNvPr id="1094615720" name="图片 1094615720"/>
-                    <pic:cNvPicPr/>
+                    <pic:cNvPr id="0" name="Picture 1"/>
+                    <pic:cNvPicPr>
+                      <a:picLocks noChangeAspect="1" noChangeArrowheads="1"/>
+                    </pic:cNvPicPr>
                   </pic:nvPicPr>
                   <pic:blipFill>
                     <a:blip r:embed="rId16" cstate="print">
@@ -113,18 +118,23 @@
                         </a:ext>
                       </a:extLst>
                     </a:blip>
+                    <a:srcRect/>
                     <a:stretch>
                       <a:fillRect/>
                     </a:stretch>
                   </pic:blipFill>
-                  <pic:spPr>
+                  <pic:spPr bwMode="auto">
                     <a:xfrm>
                       <a:off x="0" y="0"/>
-                      <a:ext cx="5939790" cy="4423410"/>
+                      <a:ext cx="5935980" cy="4418965"/>
                     </a:xfrm>
                     <a:prstGeom prst="rect">
                       <a:avLst/>
                     </a:prstGeom>
+                    <a:noFill/>
+                    <a:ln>
+                      <a:noFill/>
+                    </a:ln>
                   </pic:spPr>
                 </pic:pic>
               </a:graphicData>
@@ -136,9 +146,6 @@
     <w:p>
       <w:pPr>
         <w:ind w:firstLine="480"/>
-        <w:rPr>
-          <w:rFonts w:hint="eastAsia"/>
-        </w:rPr>
       </w:pPr>
       <w:r>
         <w:lastRenderedPageBreak/>
@@ -151,9 +158,6 @@
     <w:p>
       <w:pPr>
         <w:ind w:firstLine="480"/>
-        <w:rPr>
-          <w:rFonts w:hint="eastAsia"/>
-        </w:rPr>
       </w:pPr>
       <w:r>
         <w:t>S1</w:t>
@@ -177,9 +181,6 @@
     <w:p>
       <w:pPr>
         <w:ind w:firstLine="480"/>
-        <w:rPr>
-          <w:rFonts w:hint="eastAsia"/>
-        </w:rPr>
       </w:pPr>
       <w:r>
         <w:t>S2</w:t>
@@ -203,9 +204,6 @@
     <w:p>
       <w:pPr>
         <w:ind w:firstLine="480"/>
-        <w:rPr>
-          <w:rFonts w:hint="eastAsia"/>
-        </w:rPr>
       </w:pPr>
       <w:r>
         <w:t>S3</w:t>
@@ -217,9 +215,6 @@
     <w:p>
       <w:pPr>
         <w:ind w:firstLine="480"/>
-        <w:rPr>
-          <w:rFonts w:hint="eastAsia"/>
-        </w:rPr>
       </w:pPr>
       <w:r>
         <w:t>S4</w:t>
@@ -231,9 +226,6 @@
     <w:p>
       <w:pPr>
         <w:ind w:firstLine="480"/>
-        <w:rPr>
-          <w:rFonts w:hint="eastAsia"/>
-        </w:rPr>
       </w:pPr>
       <w:r>
         <w:t>S5</w:t>
@@ -245,9 +237,6 @@
     <w:p>
       <w:pPr>
         <w:ind w:firstLine="480"/>
-        <w:rPr>
-          <w:rFonts w:hint="eastAsia"/>
-        </w:rPr>
       </w:pPr>
       <w:r>
         <w:t>S6</w:t>
@@ -259,9 +248,6 @@
     <w:p>
       <w:pPr>
         <w:ind w:firstLine="480"/>
-        <w:rPr>
-          <w:rFonts w:hint="eastAsia"/>
-        </w:rPr>
       </w:pPr>
       <w:r>
         <w:t>其中，步骤</w:t>
@@ -306,9 +292,6 @@
     <w:p>
       <w:pPr>
         <w:ind w:firstLine="480"/>
-        <w:rPr>
-          <w:rFonts w:hint="eastAsia"/>
-        </w:rPr>
       </w:pPr>
       <w:r>
         <w:t>2.</w:t>
@@ -348,9 +331,6 @@
     <w:p>
       <w:pPr>
         <w:ind w:firstLine="480"/>
-        <w:rPr>
-          <w:rFonts w:hint="eastAsia"/>
-        </w:rPr>
       </w:pPr>
       <w:r>
         <w:t>所述采集在窗口缩减回调、窗口增长回调、确认报文处理回调、拥塞状态设置回调和拥塞窗口事件回调执行；</w:t>
@@ -359,9 +339,6 @@
     <w:p>
       <w:pPr>
         <w:ind w:firstLine="480"/>
-        <w:rPr>
-          <w:rFonts w:hint="eastAsia"/>
-        </w:rPr>
       </w:pPr>
       <w:r>
         <w:t>所述拥塞避免状态机状态包括开放状态、无序状态、拥塞窗口缩减状态、恢复状态和丢失状态，所述显式拥塞通知状态包括禁用、空闲、收到</w:t>
@@ -394,9 +371,6 @@
     <w:p>
       <w:pPr>
         <w:ind w:firstLine="480"/>
-        <w:rPr>
-          <w:rFonts w:hint="eastAsia"/>
-        </w:rPr>
       </w:pPr>
       <w:r>
         <w:t>3.</w:t>
@@ -420,9 +394,6 @@
     <w:p>
       <w:pPr>
         <w:ind w:firstLine="480"/>
-        <w:rPr>
-          <w:rFonts w:hint="eastAsia"/>
-        </w:rPr>
       </w:pPr>
       <w:r>
         <w:t>当窗口缩减回调被触发且所述拥塞避免状态机状态为丢失状态时，判定为超时类拥塞；</w:t>
@@ -431,9 +402,6 @@
     <w:p>
       <w:pPr>
         <w:ind w:firstLine="480"/>
-        <w:rPr>
-          <w:rFonts w:hint="eastAsia"/>
-        </w:rPr>
       </w:pPr>
       <w:r>
         <w:t>否则，当所述显式拥塞通知状态为收到</w:t>
@@ -454,9 +422,6 @@
     <w:p>
       <w:pPr>
         <w:ind w:firstLine="480"/>
-        <w:rPr>
-          <w:rFonts w:hint="eastAsia"/>
-        </w:rPr>
       </w:pPr>
       <w:r>
         <w:t>其余由窗口缩减回调触发的情况判定为普通丢包类拥塞；</w:t>
@@ -465,9 +430,6 @@
     <w:p>
       <w:pPr>
         <w:ind w:firstLine="480"/>
-        <w:rPr>
-          <w:rFonts w:hint="eastAsia"/>
-        </w:rPr>
       </w:pPr>
       <w:r>
         <w:t>在窗口增长回调中，收到</w:t>
@@ -488,9 +450,6 @@
     <w:p>
       <w:pPr>
         <w:ind w:firstLine="480"/>
-        <w:rPr>
-          <w:rFonts w:hint="eastAsia"/>
-        </w:rPr>
       </w:pPr>
       <w:r>
         <w:t>4.</w:t>
@@ -514,9 +473,6 @@
     <w:p>
       <w:pPr>
         <w:ind w:firstLine="480"/>
-        <w:rPr>
-          <w:rFonts w:hint="eastAsia"/>
-        </w:rPr>
       </w:pPr>
       <w:r>
         <w:t>5.</w:t>
@@ -552,9 +508,6 @@
     <w:p>
       <w:pPr>
         <w:ind w:firstLine="480"/>
-        <w:rPr>
-          <w:rFonts w:hint="eastAsia"/>
-        </w:rPr>
       </w:pPr>
       <w:r>
         <w:t>6.</w:t>
@@ -578,9 +531,6 @@
     <w:p>
       <w:pPr>
         <w:ind w:firstLine="480"/>
-        <w:rPr>
-          <w:rFonts w:hint="eastAsia"/>
-        </w:rPr>
       </w:pPr>
       <w:r>
         <w:t>维护累计已确认字节数，并在每次确认事件到达时记录由时刻与累计已确认字节数构成的样本；</w:t>
@@ -589,9 +539,6 @@
     <w:p>
       <w:pPr>
         <w:ind w:firstLine="480"/>
-        <w:rPr>
-          <w:rFonts w:hint="eastAsia"/>
-        </w:rPr>
       </w:pPr>
       <w:r>
         <w:t>将所述滑动时间窗的跨度取为最小往返时延的两倍并箝位于预设的时间下界与时间上界之间，逐出早于该时间窗的样本；</w:t>
@@ -600,9 +547,6 @@
     <w:p>
       <w:pPr>
         <w:ind w:firstLine="480"/>
-        <w:rPr>
-          <w:rFonts w:hint="eastAsia"/>
-        </w:rPr>
       </w:pPr>
       <w:r>
         <w:lastRenderedPageBreak/>
@@ -612,9 +556,6 @@
     <w:p>
       <w:pPr>
         <w:ind w:firstLine="480"/>
-        <w:rPr>
-          <w:rFonts w:hint="eastAsia"/>
-        </w:rPr>
       </w:pPr>
       <w:r>
         <w:t>维护往返时延采样队列并将全局最小往返时延更新为历史采样与协议栈提供的最小往返时延观测值中的最小者；</w:t>
@@ -623,9 +564,6 @@
     <w:p>
       <w:pPr>
         <w:ind w:firstLine="480"/>
-        <w:rPr>
-          <w:rFonts w:hint="eastAsia"/>
-        </w:rPr>
       </w:pPr>
       <w:r>
         <w:t>将所述瓶颈带宽估计值与所述全局最小往返时延相乘得到所述带宽延迟积估计值，当该估计值不可用时以当前拥塞窗口作为保守回退值。</w:t>
@@ -634,9 +572,6 @@
     <w:p>
       <w:pPr>
         <w:ind w:firstLine="480"/>
-        <w:rPr>
-          <w:rFonts w:hint="eastAsia"/>
-        </w:rPr>
       </w:pPr>
       <w:r>
         <w:t>7.</w:t>
@@ -672,9 +607,6 @@
     <w:p>
       <w:pPr>
         <w:ind w:firstLine="480"/>
-        <w:rPr>
-          <w:rFonts w:hint="eastAsia"/>
-        </w:rPr>
       </w:pPr>
       <w:r>
         <w:t>8.</w:t>
@@ -698,9 +630,6 @@
     <w:p>
       <w:pPr>
         <w:ind w:firstLine="480"/>
-        <w:rPr>
-          <w:rFonts w:hint="eastAsia"/>
-        </w:rPr>
       </w:pPr>
       <w:r>
         <w:t>所述往返时延膨胀比的判定采用随最小往返时延的平方根增长的松弛量构造低、中、高三级动态阈值，膨胀比低于低阈值时增大所述乘性增加因子并递增连续增长计数器，处于低阈值与中阈值之间时小幅增大所述乘性增加因子，高于高阈值时减小所述乘性增加因子并清零连续增长计数器；</w:t>
@@ -709,9 +638,6 @@
     <w:p>
       <w:pPr>
         <w:ind w:firstLine="480"/>
-        <w:rPr>
-          <w:rFonts w:hint="eastAsia"/>
-        </w:rPr>
       </w:pPr>
       <w:r>
         <w:t>所述环境性能反馈值的判定对反馈值序列同时维护快速指数移动平均与慢速基线指数移动平均，并由所述慢速基线的幅值构造自适应裕度，当所述快速指数移动平均高于所述慢速基线与所述自适应裕度之和时增大所述乘性增加因子，当所述快速指数移动平均低于所述慢速基线减去所述自适应裕度的预设倍数时减小所述乘性增加因子；</w:t>
@@ -720,9 +646,6 @@
     <w:p>
       <w:pPr>
         <w:ind w:firstLine="480"/>
-        <w:rPr>
-          <w:rFonts w:hint="eastAsia"/>
-        </w:rPr>
       </w:pPr>
       <w:r>
         <w:t>所述连续增长趋势的判定在所述连续增长计数器超过预设次数时进一步增大所述乘性增加因子。</w:t>
@@ -731,9 +654,6 @@
     <w:p>
       <w:pPr>
         <w:ind w:firstLine="480"/>
-        <w:rPr>
-          <w:rFonts w:hint="eastAsia"/>
-        </w:rPr>
       </w:pPr>
       <w:r>
         <w:t>9.</w:t>
@@ -769,9 +689,6 @@
     <w:p>
       <w:pPr>
         <w:ind w:firstLine="480"/>
-        <w:rPr>
-          <w:rFonts w:hint="eastAsia"/>
-        </w:rPr>
       </w:pPr>
       <w:r>
         <w:t>10.</w:t>
@@ -795,9 +712,6 @@
     <w:p>
       <w:pPr>
         <w:ind w:firstLine="480"/>
-        <w:rPr>
-          <w:rFonts w:hint="eastAsia"/>
-        </w:rPr>
       </w:pPr>
       <w:r>
         <w:t>当前拥塞窗口低于所述目标窗口时，按加性调节量、一个报文段大小以及当前拥塞窗口与所述目标窗口之差的预设分数三者中的最大值向上逼近，且逼近结果不超过所述目标窗口与所述加性调节量之和；</w:t>
@@ -806,9 +720,6 @@
     <w:p>
       <w:pPr>
         <w:ind w:firstLine="480"/>
-        <w:rPr>
-          <w:rFonts w:hint="eastAsia"/>
-        </w:rPr>
       </w:pPr>
       <w:r>
         <w:lastRenderedPageBreak/>
@@ -818,9 +729,6 @@
     <w:p>
       <w:pPr>
         <w:ind w:firstLine="480"/>
-        <w:rPr>
-          <w:rFonts w:hint="eastAsia"/>
-        </w:rPr>
       </w:pPr>
       <w:r>
         <w:t>当前拥塞窗口与所述目标窗口相等时，按所述加性调节量执行保守增长；</w:t>
@@ -829,9 +737,6 @@
     <w:p>
       <w:pPr>
         <w:ind w:firstLine="480"/>
-        <w:rPr>
-          <w:rFonts w:hint="eastAsia"/>
-        </w:rPr>
       </w:pPr>
       <w:r>
         <w:t>慢启动阶段以所述带宽延迟积估计值的预设倍数与报文段大小的预设倍数中的较大者作为目标窗口，且慢启动的退出判定所采用的往返时延膨胀容限随最小往返时延的增大而放宽。</w:t>
@@ -840,9 +745,6 @@
     <w:p>
       <w:pPr>
         <w:ind w:firstLine="480"/>
-        <w:rPr>
-          <w:rFonts w:hint="eastAsia"/>
-        </w:rPr>
       </w:pPr>
       <w:r>
         <w:t>11.</w:t>
@@ -866,9 +768,6 @@
     <w:p>
       <w:pPr>
         <w:ind w:firstLine="480"/>
-        <w:rPr>
-          <w:rFonts w:hint="eastAsia"/>
-        </w:rPr>
       </w:pPr>
       <w:r>
         <w:t>每次执行拥塞响应时递增连续缩减计数器并清零连续增长计数器；</w:t>
@@ -877,9 +776,6 @@
     <w:p>
       <w:pPr>
         <w:ind w:firstLine="480"/>
-        <w:rPr>
-          <w:rFonts w:hint="eastAsia"/>
-        </w:rPr>
       </w:pPr>
       <w:r>
         <w:t>当所述连续缩减计数器超过预设的最大连续缩减次数时，保持当前拥塞窗口不再继续缩减；</w:t>
@@ -888,9 +784,6 @@
     <w:p>
       <w:pPr>
         <w:ind w:firstLine="480"/>
-        <w:rPr>
-          <w:rFonts w:hint="eastAsia"/>
-        </w:rPr>
       </w:pPr>
       <w:r>
         <w:t>每次显式降窗后设置冻结计数器，在随后预设数量的确认事件内保持拥塞窗口不变；</w:t>
@@ -899,9 +792,6 @@
     <w:p>
       <w:pPr>
         <w:ind w:firstLine="480"/>
-        <w:rPr>
-          <w:rFonts w:hint="eastAsia"/>
-        </w:rPr>
       </w:pPr>
       <w:r>
         <w:t>所述连续缩减计数器在冻结结束并进入非拥塞窗口调整分支时清零。</w:t>
@@ -910,9 +800,6 @@
     <w:p>
       <w:pPr>
         <w:ind w:firstLine="480"/>
-        <w:rPr>
-          <w:rFonts w:hint="eastAsia"/>
-        </w:rPr>
       </w:pPr>
       <w:r>
         <w:t>12.</w:t>
@@ -936,9 +823,6 @@
     <w:p>
       <w:pPr>
         <w:ind w:firstLine="480"/>
-        <w:rPr>
-          <w:rFonts w:hint="eastAsia"/>
-        </w:rPr>
       </w:pPr>
       <w:r>
         <w:t>13.</w:t>
@@ -962,9 +846,6 @@
     <w:p>
       <w:pPr>
         <w:ind w:firstLine="480"/>
-        <w:rPr>
-          <w:rFonts w:hint="eastAsia"/>
-        </w:rPr>
       </w:pPr>
       <w:r>
         <w:t>14.</w:t>
@@ -988,9 +869,6 @@
     <w:p>
       <w:pPr>
         <w:ind w:firstLine="480"/>
-        <w:rPr>
-          <w:rFonts w:hint="eastAsia"/>
-        </w:rPr>
       </w:pPr>
       <w:r>
         <w:t>在只读的窗口缩减回调中将拥塞窗口决策写入待应用缓冲并置位待应用标志，仅返回新的慢启动阈值；</w:t>
@@ -999,9 +877,6 @@
     <w:p>
       <w:pPr>
         <w:ind w:firstLine="480"/>
-        <w:rPr>
-          <w:rFonts w:hint="eastAsia"/>
-        </w:rPr>
       </w:pPr>
       <w:r>
         <w:t>在后续的窗口增长回调中检测所述待应用标志，若已置位则将所述待应用缓冲中的值应用于连接状态并复位所述待应用标志；</w:t>
@@ -1010,9 +885,6 @@
     <w:p>
       <w:pPr>
         <w:ind w:firstLine="480"/>
-        <w:rPr>
-          <w:rFonts w:hint="eastAsia"/>
-        </w:rPr>
       </w:pPr>
       <w:r>
         <w:lastRenderedPageBreak/>
@@ -1022,9 +894,6 @@
     <w:p>
       <w:pPr>
         <w:ind w:firstLine="480"/>
-        <w:rPr>
-          <w:rFonts w:hint="eastAsia"/>
-        </w:rPr>
       </w:pPr>
       <w:r>
         <w:t>15.</w:t>
@@ -1042,9 +911,6 @@
     <w:p>
       <w:pPr>
         <w:ind w:firstLine="480"/>
-        <w:rPr>
-          <w:rFonts w:hint="eastAsia"/>
-        </w:rPr>
       </w:pPr>
       <w:r>
         <w:t>在确认事件对应的窗口增长回调中，所述环境性能反馈值由与已确认报文段数量成正比且设有上限的吞吐激励减去往返时延惩罚构成，所述往返时延惩罚仅在往返时延膨胀比超过预设阈值时生效且设有上限；</w:t>
@@ -1053,9 +919,6 @@
     <w:p>
       <w:pPr>
         <w:ind w:firstLine="480"/>
-        <w:rPr>
-          <w:rFonts w:hint="eastAsia"/>
-        </w:rPr>
       </w:pPr>
       <w:r>
         <w:t>在窗口缩减回调中按拥塞类型施加分级负向反馈，显式拥塞通知类拥塞的惩罚幅度小于普通丢包类拥塞的惩罚幅度，普通丢包类拥塞的惩罚幅度小于超时类拥塞的惩罚幅度。</w:t>
@@ -1064,9 +927,6 @@
     <w:p>
       <w:pPr>
         <w:ind w:firstLine="480"/>
-        <w:rPr>
-          <w:rFonts w:hint="eastAsia"/>
-        </w:rPr>
       </w:pPr>
       <w:r>
         <w:t>16.</w:t>
@@ -1078,9 +938,6 @@
     <w:p>
       <w:pPr>
         <w:ind w:firstLine="480"/>
-        <w:rPr>
-          <w:rFonts w:hint="eastAsia"/>
-        </w:rPr>
       </w:pPr>
       <w:r>
         <w:t>状态采集模块，用于在传输层协议栈的多个拥塞控制回调点采集权利要求</w:t>
@@ -1101,9 +958,6 @@
     <w:p>
       <w:pPr>
         <w:ind w:firstLine="480"/>
-        <w:rPr>
-          <w:rFonts w:hint="eastAsia"/>
-        </w:rPr>
       </w:pPr>
       <w:r>
         <w:t>决策模块，用于执行权利要求</w:t>
@@ -1118,9 +972,6 @@
     <w:p>
       <w:pPr>
         <w:ind w:firstLine="480"/>
-        <w:rPr>
-          <w:rFonts w:hint="eastAsia"/>
-        </w:rPr>
       </w:pPr>
       <w:r>
         <w:t>决策应用模块，用于将所述新的慢启动阈值与所述新的拥塞窗口应用于连接的传输控制参数，并实现延迟窗口应用与陈旧决策作废；</w:t>
@@ -1129,9 +980,6 @@
     <w:p>
       <w:pPr>
         <w:ind w:firstLine="480"/>
-        <w:rPr>
-          <w:rFonts w:hint="eastAsia"/>
-        </w:rPr>
       </w:pPr>
       <w:r>
         <w:t>通信模块，用于在所述状态采集模块与所述决策模块位于不同进程时按请求</w:t>
@@ -1146,9 +994,6 @@
     <w:p>
       <w:pPr>
         <w:ind w:firstLine="480"/>
-        <w:rPr>
-          <w:rFonts w:hint="eastAsia"/>
-        </w:rPr>
       </w:pPr>
       <w:r>
         <w:t>17.</w:t>
@@ -1166,9 +1011,6 @@
     <w:p>
       <w:pPr>
         <w:ind w:firstLine="480"/>
-        <w:rPr>
-          <w:rFonts w:hint="eastAsia"/>
-        </w:rPr>
       </w:pPr>
       <w:r>
         <w:t>观测空间定义单元，用于定义所述状态传输容器的元素数量、数据类型与取值范围；</w:t>
@@ -1177,9 +1019,6 @@
     <w:p>
       <w:pPr>
         <w:ind w:firstLine="480"/>
-        <w:rPr>
-          <w:rFonts w:hint="eastAsia"/>
-        </w:rPr>
       </w:pPr>
       <w:r>
         <w:t>状态采集单元，用于在窗口缩减回调、窗口增长回调、确认报文处理回调、拥塞状态设置回调和拥塞窗口事件回调采集状态参数；</w:t>
@@ -1188,9 +1027,6 @@
     <w:p>
       <w:pPr>
         <w:ind w:firstLine="480"/>
-        <w:rPr>
-          <w:rFonts w:hint="eastAsia"/>
-        </w:rPr>
       </w:pPr>
       <w:r>
         <w:t>显式拥塞通知事件处理单元，用于根据有</w:t>
@@ -1215,9 +1051,6 @@
     <w:p>
       <w:pPr>
         <w:ind w:firstLine="480"/>
-        <w:rPr>
-          <w:rFonts w:hint="eastAsia"/>
-        </w:rPr>
       </w:pPr>
       <w:r>
         <w:t>延迟窗口应用单元，用于在只读回调中缓存拥塞窗口决策并在后续可写回调中应用所述拥塞窗口决策；</w:t>
@@ -1226,9 +1059,6 @@
     <w:p>
       <w:pPr>
         <w:ind w:firstLine="480"/>
-        <w:rPr>
-          <w:rFonts w:hint="eastAsia"/>
-        </w:rPr>
       </w:pPr>
       <w:r>
         <w:t>陈旧决策作废单元，用于在协议栈进入丢失状态时丢弃尚未应用的拥塞窗口决策。</w:t>
@@ -1237,9 +1067,6 @@
     <w:p>
       <w:pPr>
         <w:ind w:firstLine="480"/>
-        <w:rPr>
-          <w:rFonts w:hint="eastAsia"/>
-        </w:rPr>
       </w:pPr>
       <w:r>
         <w:t>18.</w:t>
@@ -1263,9 +1090,6 @@
     <w:p>
       <w:pPr>
         <w:ind w:firstLine="480"/>
-        <w:rPr>
-          <w:rFonts w:hint="eastAsia"/>
-        </w:rPr>
       </w:pPr>
       <w:r>
         <w:t>19.</w:t>
@@ -1369,9 +1193,6 @@
     <w:p>
       <w:pPr>
         <w:ind w:firstLineChars="0" w:firstLine="0"/>
-        <w:rPr>
-          <w:rFonts w:hint="eastAsia"/>
-        </w:rPr>
       </w:pPr>
       <w:r>
         <w:t xml:space="preserve">[0002] </w:t>
@@ -1395,9 +1216,6 @@
     <w:p>
       <w:pPr>
         <w:ind w:firstLineChars="0" w:firstLine="0"/>
-        <w:rPr>
-          <w:rFonts w:hint="eastAsia"/>
-        </w:rPr>
       </w:pPr>
       <w:r>
         <w:t xml:space="preserve">[0003] </w:t>
@@ -1421,9 +1239,6 @@
     <w:p>
       <w:pPr>
         <w:ind w:firstLineChars="0" w:firstLine="0"/>
-        <w:rPr>
-          <w:rFonts w:hint="eastAsia"/>
-        </w:rPr>
       </w:pPr>
       <w:r>
         <w:t xml:space="preserve">[0004] </w:t>
@@ -1441,9 +1256,6 @@
     <w:p>
       <w:pPr>
         <w:ind w:firstLineChars="0" w:firstLine="0"/>
-        <w:rPr>
-          <w:rFonts w:hint="eastAsia"/>
-        </w:rPr>
       </w:pPr>
       <w:r>
         <w:t xml:space="preserve">[0005] </w:t>
@@ -1478,9 +1290,6 @@
     <w:p>
       <w:pPr>
         <w:ind w:firstLineChars="0" w:firstLine="0"/>
-        <w:rPr>
-          <w:rFonts w:hint="eastAsia"/>
-        </w:rPr>
       </w:pPr>
       <w:r>
         <w:lastRenderedPageBreak/>
@@ -1493,9 +1302,6 @@
     <w:p>
       <w:pPr>
         <w:ind w:firstLineChars="0" w:firstLine="0"/>
-        <w:rPr>
-          <w:rFonts w:hint="eastAsia"/>
-        </w:rPr>
       </w:pPr>
       <w:r>
         <w:t xml:space="preserve">[0007] </w:t>
@@ -1519,9 +1325,6 @@
     <w:p>
       <w:pPr>
         <w:ind w:firstLineChars="0" w:firstLine="0"/>
-        <w:rPr>
-          <w:rFonts w:hint="eastAsia"/>
-        </w:rPr>
       </w:pPr>
       <w:r>
         <w:t xml:space="preserve">[0008] </w:t>
@@ -1533,9 +1336,6 @@
     <w:p>
       <w:pPr>
         <w:ind w:firstLineChars="0" w:firstLine="0"/>
-        <w:rPr>
-          <w:rFonts w:hint="eastAsia"/>
-        </w:rPr>
       </w:pPr>
       <w:r>
         <w:t xml:space="preserve">[0009] </w:t>
@@ -1559,9 +1359,6 @@
     <w:p>
       <w:pPr>
         <w:ind w:firstLineChars="0" w:firstLine="0"/>
-        <w:rPr>
-          <w:rFonts w:hint="eastAsia"/>
-        </w:rPr>
       </w:pPr>
       <w:r>
         <w:t>[0010] RTT</w:t>
@@ -1579,9 +1376,6 @@
     <w:p>
       <w:pPr>
         <w:ind w:firstLineChars="0" w:firstLine="0"/>
-        <w:rPr>
-          <w:rFonts w:hint="eastAsia"/>
-        </w:rPr>
       </w:pPr>
       <w:r>
         <w:t xml:space="preserve">[0011] </w:t>
@@ -1593,9 +1387,6 @@
     <w:p>
       <w:pPr>
         <w:ind w:firstLineChars="0" w:firstLine="0"/>
-        <w:rPr>
-          <w:rFonts w:hint="eastAsia"/>
-        </w:rPr>
       </w:pPr>
       <w:r>
         <w:t xml:space="preserve">[0012] </w:t>
@@ -1613,9 +1404,6 @@
     <w:p>
       <w:pPr>
         <w:ind w:firstLineChars="0" w:firstLine="0"/>
-        <w:rPr>
-          <w:rFonts w:hint="eastAsia"/>
-        </w:rPr>
       </w:pPr>
       <w:r>
         <w:t xml:space="preserve">[0013] </w:t>
@@ -1645,9 +1433,6 @@
     <w:p>
       <w:pPr>
         <w:ind w:firstLineChars="0" w:firstLine="0"/>
-        <w:rPr>
-          <w:rFonts w:hint="eastAsia"/>
-        </w:rPr>
       </w:pPr>
       <w:r>
         <w:t xml:space="preserve">[0014] </w:t>
@@ -1701,9 +1486,6 @@
     <w:p>
       <w:pPr>
         <w:ind w:firstLineChars="0" w:firstLine="0"/>
-        <w:rPr>
-          <w:rFonts w:hint="eastAsia"/>
-        </w:rPr>
       </w:pPr>
       <w:r>
         <w:t xml:space="preserve">[0015] </w:t>
@@ -1746,9 +1528,6 @@
     <w:p>
       <w:pPr>
         <w:ind w:firstLineChars="0" w:firstLine="0"/>
-        <w:rPr>
-          <w:rFonts w:hint="eastAsia"/>
-        </w:rPr>
       </w:pPr>
       <w:r>
         <w:t xml:space="preserve">[0016] </w:t>
@@ -1760,9 +1539,6 @@
     <w:p>
       <w:pPr>
         <w:ind w:firstLineChars="0" w:firstLine="0"/>
-        <w:rPr>
-          <w:rFonts w:hint="eastAsia"/>
-        </w:rPr>
       </w:pPr>
       <w:r>
         <w:t xml:space="preserve">[0017] </w:t>
@@ -1774,9 +1550,6 @@
     <w:p>
       <w:pPr>
         <w:ind w:firstLineChars="0" w:firstLine="0"/>
-        <w:rPr>
-          <w:rFonts w:hint="eastAsia"/>
-        </w:rPr>
       </w:pPr>
       <w:r>
         <w:t xml:space="preserve">[0018] </w:t>
@@ -1788,9 +1561,6 @@
     <w:p>
       <w:pPr>
         <w:ind w:firstLineChars="0" w:firstLine="0"/>
-        <w:rPr>
-          <w:rFonts w:hint="eastAsia"/>
-        </w:rPr>
       </w:pPr>
       <w:r>
         <w:t xml:space="preserve">[0019] </w:t>
@@ -1829,9 +1599,6 @@
     <w:p>
       <w:pPr>
         <w:ind w:firstLineChars="0" w:firstLine="0"/>
-        <w:rPr>
-          <w:rFonts w:hint="eastAsia"/>
-        </w:rPr>
       </w:pPr>
       <w:r>
         <w:t xml:space="preserve">[0021] </w:t>
@@ -1843,9 +1610,6 @@
     <w:p>
       <w:pPr>
         <w:ind w:firstLineChars="0" w:firstLine="0"/>
-        <w:rPr>
-          <w:rFonts w:hint="eastAsia"/>
-        </w:rPr>
       </w:pPr>
       <w:r>
         <w:t xml:space="preserve">[0022] </w:t>
@@ -1861,9 +1625,6 @@
     <w:p>
       <w:pPr>
         <w:ind w:firstLineChars="0" w:firstLine="0"/>
-        <w:rPr>
-          <w:rFonts w:hint="eastAsia"/>
-        </w:rPr>
       </w:pPr>
       <w:r>
         <w:t>[0023] S1</w:t>
@@ -1881,9 +1642,6 @@
     <w:p>
       <w:pPr>
         <w:ind w:firstLineChars="0" w:firstLine="0"/>
-        <w:rPr>
-          <w:rFonts w:hint="eastAsia"/>
-        </w:rPr>
       </w:pPr>
       <w:r>
         <w:t>[0024] S2</w:t>
@@ -1907,9 +1665,6 @@
     <w:p>
       <w:pPr>
         <w:ind w:firstLineChars="0" w:firstLine="0"/>
-        <w:rPr>
-          <w:rFonts w:hint="eastAsia"/>
-        </w:rPr>
       </w:pPr>
       <w:r>
         <w:t>[0025] S3</w:t>
@@ -1921,9 +1676,6 @@
     <w:p>
       <w:pPr>
         <w:ind w:firstLineChars="0" w:firstLine="0"/>
-        <w:rPr>
-          <w:rFonts w:hint="eastAsia"/>
-        </w:rPr>
       </w:pPr>
       <w:r>
         <w:t>[0026] S4</w:t>
@@ -1935,9 +1687,6 @@
     <w:p>
       <w:pPr>
         <w:ind w:firstLineChars="0" w:firstLine="0"/>
-        <w:rPr>
-          <w:rFonts w:hint="eastAsia"/>
-        </w:rPr>
       </w:pPr>
       <w:r>
         <w:t>[0027] S5</w:t>
@@ -1949,9 +1698,6 @@
     <w:p>
       <w:pPr>
         <w:ind w:firstLineChars="0" w:firstLine="0"/>
-        <w:rPr>
-          <w:rFonts w:hint="eastAsia"/>
-        </w:rPr>
       </w:pPr>
       <w:r>
         <w:t>[0028] S6</w:t>
@@ -1967,9 +1713,6 @@
     <w:p>
       <w:pPr>
         <w:ind w:firstLineChars="0" w:firstLine="0"/>
-        <w:rPr>
-          <w:rFonts w:hint="eastAsia"/>
-        </w:rPr>
       </w:pPr>
       <w:r>
         <w:t xml:space="preserve">[0029] </w:t>
@@ -2041,9 +1784,6 @@
     <w:p>
       <w:pPr>
         <w:ind w:firstLineChars="0" w:firstLine="0"/>
-        <w:rPr>
-          <w:rFonts w:hint="eastAsia"/>
-        </w:rPr>
       </w:pPr>
       <w:r>
         <w:t xml:space="preserve">[0030] </w:t>
@@ -2061,9 +1801,6 @@
     <w:p>
       <w:pPr>
         <w:ind w:firstLineChars="0" w:firstLine="0"/>
-        <w:rPr>
-          <w:rFonts w:hint="eastAsia"/>
-        </w:rPr>
       </w:pPr>
       <w:r>
         <w:t xml:space="preserve">[0031] </w:t>
@@ -2105,9 +1842,6 @@
     <w:p>
       <w:pPr>
         <w:ind w:firstLineChars="0" w:firstLine="0"/>
-        <w:rPr>
-          <w:rFonts w:hint="eastAsia"/>
-        </w:rPr>
       </w:pPr>
       <w:r>
         <w:t xml:space="preserve">[0032] </w:t>
@@ -2147,9 +1881,6 @@
     <w:p>
       <w:pPr>
         <w:ind w:firstLineChars="0" w:firstLine="0"/>
-        <w:rPr>
-          <w:rFonts w:hint="eastAsia"/>
-        </w:rPr>
       </w:pPr>
       <w:r>
         <w:t xml:space="preserve">[0033] </w:t>
@@ -2167,9 +1898,6 @@
     <w:p>
       <w:pPr>
         <w:ind w:firstLineChars="0" w:firstLine="0"/>
-        <w:rPr>
-          <w:rFonts w:hint="eastAsia"/>
-        </w:rPr>
       </w:pPr>
       <w:r>
         <w:t>维护累计已确认字节数，并在每次确认事件到达时记录由时刻与累计已确认字节数构成的样本；</w:t>
@@ -2178,9 +1906,6 @@
     <w:p>
       <w:pPr>
         <w:ind w:firstLineChars="0" w:firstLine="0"/>
-        <w:rPr>
-          <w:rFonts w:hint="eastAsia"/>
-        </w:rPr>
       </w:pPr>
       <w:r>
         <w:t>将滑动时间窗的跨度取为最小往返时延的两倍，并将其箝位于预设的时间下界与时间上界之间，逐出早于该时间窗的样本；</w:t>
@@ -2189,9 +1914,6 @@
     <w:p>
       <w:pPr>
         <w:ind w:firstLineChars="0" w:firstLine="0"/>
-        <w:rPr>
-          <w:rFonts w:hint="eastAsia"/>
-        </w:rPr>
       </w:pPr>
       <w:r>
         <w:t>以时间窗内累计已确认字节数的增量除以该时间窗的实际跨度，得到一个交付速率样本；</w:t>
@@ -2200,9 +1922,6 @@
     <w:p>
       <w:pPr>
         <w:ind w:firstLineChars="0" w:firstLine="0"/>
-        <w:rPr>
-          <w:rFonts w:hint="eastAsia"/>
-        </w:rPr>
       </w:pPr>
       <w:r>
         <w:t>维护容量为预设长度的交付速率样本队列，取队列内最大值作为瓶颈带宽估计值；</w:t>
@@ -2211,9 +1930,6 @@
     <w:p>
       <w:pPr>
         <w:ind w:firstLineChars="0" w:firstLine="0"/>
-        <w:rPr>
-          <w:rFonts w:hint="eastAsia"/>
-        </w:rPr>
       </w:pPr>
       <w:r>
         <w:t>维护往返时延采样队列并跟踪全局最小往返时延，所述全局最小往返时延取历史采样与协议栈提供的最小往返时延观测值中的最小者；</w:t>
@@ -2222,9 +1938,6 @@
     <w:p>
       <w:pPr>
         <w:ind w:firstLineChars="0" w:firstLine="0"/>
-        <w:rPr>
-          <w:rFonts w:hint="eastAsia"/>
-        </w:rPr>
       </w:pPr>
       <w:r>
         <w:t>将瓶颈带宽估计值与所述全局最小往返时延相乘得到带宽延迟积估计值；当该估计值不可用时，以当前拥塞窗口作为保守回退值。</w:t>
@@ -2233,9 +1946,6 @@
     <w:p>
       <w:pPr>
         <w:ind w:firstLineChars="0" w:firstLine="0"/>
-        <w:rPr>
-          <w:rFonts w:hint="eastAsia"/>
-        </w:rPr>
       </w:pPr>
       <w:r>
         <w:t>作为优选，所述时间下界为</w:t>
@@ -2262,9 +1972,6 @@
     <w:p>
       <w:pPr>
         <w:ind w:firstLineChars="0" w:firstLine="0"/>
-        <w:rPr>
-          <w:rFonts w:hint="eastAsia"/>
-        </w:rPr>
       </w:pPr>
       <w:r>
         <w:t xml:space="preserve">[0034] </w:t>
@@ -2282,9 +1989,6 @@
     <w:p>
       <w:pPr>
         <w:ind w:firstLineChars="0" w:firstLine="0"/>
-        <w:rPr>
-          <w:rFonts w:hint="eastAsia"/>
-        </w:rPr>
       </w:pPr>
       <w:r>
         <w:t>因子一，路径感知的往返时延膨胀判定。以最小往返时延为依据构造松弛量，所述松弛量随最小往返时延的平方根增长；以该松弛量构造低、中、高三级动态阈值；当往返时延膨胀比低于低阈值时增大乘性增加因子并递增连续增长计数器，处于低阈值与中阈值之间时小幅增大乘性增加因子，高于高阈值时减小乘性增加因子并清零连续增长计数器。随最小往返时延增长的松弛量用于降低远距离长时延路径上的常规传播抖动触发过早抑制窗口的可能性。</w:t>
@@ -2293,9 +1997,6 @@
     <w:p>
       <w:pPr>
         <w:ind w:firstLineChars="0" w:firstLine="0"/>
-        <w:rPr>
-          <w:rFonts w:hint="eastAsia"/>
-        </w:rPr>
       </w:pPr>
       <w:r>
         <w:t>因子二，相对基线的性能反馈判定。对环境性能反馈值序列同时维护快速指数移动平均与慢速基线指数移动平均，并由所述慢速基线的幅值构造自适应裕度；当快速指数移动平均高于慢速基线加上所述裕度时增大乘性增加因子，当快速指数移动平均低于慢速基线减去所述裕度的预设倍数时减小乘性增加因子。鉴于正常确认处理产生的性能反馈值通常为正，</w:t>
@@ -2308,9 +2009,6 @@
     <w:p>
       <w:pPr>
         <w:ind w:firstLineChars="0" w:firstLine="0"/>
-        <w:rPr>
-          <w:rFonts w:hint="eastAsia"/>
-        </w:rPr>
       </w:pPr>
       <w:r>
         <w:t>因子三，连续增长稳定性反馈。当连续增长计数器超过预设次数时，进一步小幅增大乘性增加因子。</w:t>
@@ -2319,9 +2017,6 @@
     <w:p>
       <w:pPr>
         <w:ind w:firstLineChars="0" w:firstLine="0"/>
-        <w:rPr>
-          <w:rFonts w:hint="eastAsia"/>
-        </w:rPr>
       </w:pPr>
       <w:r>
         <w:t>作为优选，所述乘性增加因子的取值范围为</w:t>
@@ -2342,9 +2037,6 @@
     <w:p>
       <w:pPr>
         <w:ind w:firstLineChars="0" w:firstLine="0"/>
-        <w:rPr>
-          <w:rFonts w:hint="eastAsia"/>
-        </w:rPr>
       </w:pPr>
       <w:r>
         <w:t xml:space="preserve">[0035] </w:t>
@@ -2362,9 +2054,6 @@
     <w:p>
       <w:pPr>
         <w:ind w:firstLineChars="0" w:firstLine="0"/>
-        <w:rPr>
-          <w:rFonts w:hint="eastAsia"/>
-        </w:rPr>
       </w:pPr>
       <w:r>
         <w:t>在拥塞避免阶段，以乘性增加因子与带宽延迟积估计值之积作为目标窗口；</w:t>
@@ -2373,9 +2062,6 @@
     <w:p>
       <w:pPr>
         <w:ind w:firstLineChars="0" w:firstLine="0"/>
-        <w:rPr>
-          <w:rFonts w:hint="eastAsia"/>
-        </w:rPr>
       </w:pPr>
       <w:r>
         <w:t>当前拥塞窗口低于目标窗口时，按有界步长向上逼近，所述有界步长取加性调节量、一个报文段大小以及当前窗口与目标窗口之差的预设分数三者中的最大值，且逼近结果不超过目标窗口与加性调节量之和；</w:t>
@@ -2384,9 +2070,6 @@
     <w:p>
       <w:pPr>
         <w:ind w:firstLineChars="0" w:firstLine="0"/>
-        <w:rPr>
-          <w:rFonts w:hint="eastAsia"/>
-        </w:rPr>
       </w:pPr>
       <w:r>
         <w:t>当前拥塞窗口高于目标窗口时，按超出量的一半向下回落，且不低于目标窗口；</w:t>
@@ -2395,9 +2078,6 @@
     <w:p>
       <w:pPr>
         <w:ind w:firstLineChars="0" w:firstLine="0"/>
-        <w:rPr>
-          <w:rFonts w:hint="eastAsia"/>
-        </w:rPr>
       </w:pPr>
       <w:r>
         <w:t>当前拥塞窗口与目标窗口相等时，按加性调节量执行保守增长；</w:t>
@@ -2406,9 +2086,6 @@
     <w:p>
       <w:pPr>
         <w:ind w:firstLineChars="0" w:firstLine="0"/>
-        <w:rPr>
-          <w:rFonts w:hint="eastAsia"/>
-        </w:rPr>
       </w:pPr>
       <w:r>
         <w:t>慢启动阶段以带宽延迟积估计值的预设倍数与报文段大小的预设倍数中的较大者作为目标窗口，并在往返时延未出现明显膨胀且当前窗口显著低于带宽延迟积时采用加速增长；慢启动的退出判定采用随最小往返时延增大而放宽的往返时延膨胀容限，以降低远距离长时延路径过早退出慢启动的可能性。</w:t>
@@ -2417,9 +2094,6 @@
     <w:p>
       <w:pPr>
         <w:ind w:firstLineChars="0" w:firstLine="0"/>
-        <w:rPr>
-          <w:rFonts w:hint="eastAsia"/>
-        </w:rPr>
       </w:pPr>
       <w:r>
         <w:t xml:space="preserve">[0036] </w:t>
@@ -2449,9 +2123,6 @@
     <w:p>
       <w:pPr>
         <w:ind w:firstLineChars="0" w:firstLine="0"/>
-        <w:rPr>
-          <w:rFonts w:hint="eastAsia"/>
-        </w:rPr>
       </w:pPr>
       <w:r>
         <w:t xml:space="preserve">[0037] </w:t>
@@ -2469,9 +2140,6 @@
     <w:p>
       <w:pPr>
         <w:ind w:firstLineChars="0" w:firstLine="0"/>
-        <w:rPr>
-          <w:rFonts w:hint="eastAsia"/>
-        </w:rPr>
       </w:pPr>
       <w:r>
         <w:lastRenderedPageBreak/>
@@ -2490,9 +2158,6 @@
     <w:p>
       <w:pPr>
         <w:ind w:firstLineChars="0" w:firstLine="0"/>
-        <w:rPr>
-          <w:rFonts w:hint="eastAsia"/>
-        </w:rPr>
       </w:pPr>
       <w:r>
         <w:t xml:space="preserve">[0039] </w:t>
@@ -2510,9 +2175,6 @@
     <w:p>
       <w:pPr>
         <w:ind w:firstLineChars="0" w:firstLine="0"/>
-        <w:rPr>
-          <w:rFonts w:hint="eastAsia"/>
-        </w:rPr>
       </w:pPr>
       <w:r>
         <w:t xml:space="preserve">[0040] </w:t>
@@ -2524,9 +2186,6 @@
     <w:p>
       <w:pPr>
         <w:ind w:firstLineChars="0" w:firstLine="0"/>
-        <w:rPr>
-          <w:rFonts w:hint="eastAsia"/>
-        </w:rPr>
       </w:pPr>
       <w:r>
         <w:t xml:space="preserve">[0041] </w:t>
@@ -2538,9 +2197,6 @@
     <w:p>
       <w:pPr>
         <w:ind w:firstLineChars="0" w:firstLine="0"/>
-        <w:rPr>
-          <w:rFonts w:hint="eastAsia"/>
-        </w:rPr>
       </w:pPr>
       <w:r>
         <w:t xml:space="preserve">[0042] </w:t>
@@ -2568,9 +2224,6 @@
     <w:p>
       <w:pPr>
         <w:ind w:firstLineChars="0" w:firstLine="0"/>
-        <w:rPr>
-          <w:rFonts w:hint="eastAsia"/>
-        </w:rPr>
       </w:pPr>
       <w:r>
         <w:t xml:space="preserve">[0043] </w:t>
@@ -2594,9 +2247,6 @@
     <w:p>
       <w:pPr>
         <w:ind w:firstLineChars="0" w:firstLine="0"/>
-        <w:rPr>
-          <w:rFonts w:hint="eastAsia"/>
-        </w:rPr>
       </w:pPr>
       <w:r>
         <w:t xml:space="preserve">[0044] </w:t>
@@ -2608,9 +2258,6 @@
     <w:p>
       <w:pPr>
         <w:ind w:firstLineChars="0" w:firstLine="0"/>
-        <w:rPr>
-          <w:rFonts w:hint="eastAsia"/>
-        </w:rPr>
       </w:pPr>
       <w:r>
         <w:t xml:space="preserve">[0045] </w:t>
@@ -2622,9 +2269,6 @@
     <w:p>
       <w:pPr>
         <w:ind w:firstLineChars="0" w:firstLine="0"/>
-        <w:rPr>
-          <w:rFonts w:hint="eastAsia"/>
-        </w:rPr>
       </w:pPr>
       <w:r>
         <w:t xml:space="preserve">[0046] </w:t>
@@ -2636,9 +2280,6 @@
     <w:p>
       <w:pPr>
         <w:ind w:firstLineChars="0" w:firstLine="0"/>
-        <w:rPr>
-          <w:rFonts w:hint="eastAsia"/>
-        </w:rPr>
       </w:pPr>
       <w:r>
         <w:t>第一，通过在协议栈回调点联合获取窗口、确认、在途数据、往返时延、拥塞避免状态、拥塞事件与显式拥塞通知状态，并对超时、显式拥塞通知和普通丢包实施语义分类，本发明所述方法可减少仅依赖单一丢包或时延信号造成的响应滞后，并为差异化降窗提供状态依据。</w:t>
@@ -2647,9 +2288,6 @@
     <w:p>
       <w:pPr>
         <w:ind w:firstLineChars="0" w:firstLine="0"/>
-        <w:rPr>
-          <w:rFonts w:hint="eastAsia"/>
-        </w:rPr>
       </w:pPr>
       <w:r>
         <w:t>第二，通过在受上下界约束的滑动时间窗内按累计确认字节增量计算交付速率，结合最小往返时延、窗口化最大值滤波、相对基线反馈和有界目标窗口跟踪形成确定性启发式决策，可降低单次确认样本对带宽延迟积估计的影响，并改善对远距离传输、异构终端以及多样接入和路径条件的适配能力。</w:t>
@@ -2658,9 +2296,6 @@
     <w:p>
       <w:pPr>
         <w:ind w:firstLineChars="0" w:firstLine="0"/>
-        <w:rPr>
-          <w:rFonts w:hint="eastAsia"/>
-        </w:rPr>
       </w:pPr>
       <w:r>
         <w:t>第三，通过差异化窗口保留因子、连续缩减保护、降窗后冻结、慢启动阈值锚定、窗口上下界箝位以及陈旧待应用窗口作废等约束，可抑制不确定拥塞状态下的连续过度缩减、降窗后快速反弹和越界调整，有助于提高传输过程的稳定性与安全性。</w:t>
@@ -2697,9 +2332,6 @@
     <w:p>
       <w:pPr>
         <w:ind w:firstLineChars="0" w:firstLine="0"/>
-        <w:rPr>
-          <w:rFonts w:hint="eastAsia"/>
-        </w:rPr>
       </w:pPr>
       <w:r>
         <w:t xml:space="preserve">[0047] </w:t>
@@ -2805,9 +2437,6 @@
     <w:p>
       <w:pPr>
         <w:ind w:firstLineChars="0" w:firstLine="0"/>
-        <w:rPr>
-          <w:rFonts w:hint="eastAsia"/>
-        </w:rPr>
       </w:pPr>
       <w:r>
         <w:t xml:space="preserve">[0049] </w:t>
@@ -2831,9 +2460,6 @@
     <w:p>
       <w:pPr>
         <w:ind w:firstLineChars="0" w:firstLine="0"/>
-        <w:rPr>
-          <w:rFonts w:hint="eastAsia"/>
-        </w:rPr>
       </w:pPr>
       <w:r>
         <w:t xml:space="preserve">[0050] </w:t>
@@ -2885,9 +2511,6 @@
     <w:p>
       <w:pPr>
         <w:ind w:firstLineChars="0" w:firstLine="0"/>
-        <w:rPr>
-          <w:rFonts w:hint="eastAsia"/>
-        </w:rPr>
       </w:pPr>
       <w:r>
         <w:t xml:space="preserve">[0051] </w:t>
@@ -2935,9 +2558,6 @@
     <w:p>
       <w:pPr>
         <w:ind w:firstLineChars="0" w:firstLine="0"/>
-        <w:rPr>
-          <w:rFonts w:hint="eastAsia"/>
-        </w:rPr>
       </w:pPr>
       <w:r>
         <w:t xml:space="preserve">[0052] </w:t>
@@ -2985,9 +2605,6 @@
     <w:p>
       <w:pPr>
         <w:ind w:firstLineChars="0" w:firstLine="0"/>
-        <w:rPr>
-          <w:rFonts w:hint="eastAsia"/>
-        </w:rPr>
       </w:pPr>
       <w:r>
         <w:t xml:space="preserve">[0053] </w:t>
@@ -3139,9 +2756,6 @@
     <w:p>
       <w:pPr>
         <w:ind w:firstLineChars="0" w:firstLine="0"/>
-        <w:rPr>
-          <w:rFonts w:hint="eastAsia"/>
-        </w:rPr>
       </w:pPr>
       <w:r>
         <w:t xml:space="preserve">[0054] </w:t>
@@ -3249,9 +2863,6 @@
     <w:p>
       <w:pPr>
         <w:ind w:firstLineChars="0" w:firstLine="0"/>
-        <w:rPr>
-          <w:rFonts w:hint="eastAsia"/>
-        </w:rPr>
       </w:pPr>
       <w:r>
         <w:t xml:space="preserve">[0056] </w:t>
@@ -3269,9 +2880,6 @@
     <w:p>
       <w:pPr>
         <w:ind w:firstLineChars="0" w:firstLine="0"/>
-        <w:rPr>
-          <w:rFonts w:hint="eastAsia"/>
-        </w:rPr>
       </w:pPr>
       <w:r>
         <w:t xml:space="preserve">[0057] </w:t>
@@ -3295,9 +2903,6 @@
     <w:p>
       <w:pPr>
         <w:ind w:firstLineChars="0" w:firstLine="0"/>
-        <w:rPr>
-          <w:rFonts w:hint="eastAsia"/>
-        </w:rPr>
       </w:pPr>
       <w:r>
         <w:t xml:space="preserve">[0058] </w:t>
@@ -3333,9 +2938,6 @@
     <w:p>
       <w:pPr>
         <w:ind w:firstLineChars="0" w:firstLine="0"/>
-        <w:rPr>
-          <w:rFonts w:hint="eastAsia"/>
-        </w:rPr>
       </w:pPr>
       <w:r>
         <w:t xml:space="preserve">[0059] </w:t>
@@ -3347,9 +2949,6 @@
     <w:p>
       <w:pPr>
         <w:ind w:firstLineChars="0" w:firstLine="0"/>
-        <w:rPr>
-          <w:rFonts w:hint="eastAsia"/>
-        </w:rPr>
       </w:pPr>
       <w:r>
         <w:t xml:space="preserve">[0060] </w:t>
@@ -3408,9 +3007,6 @@
     <w:p>
       <w:pPr>
         <w:ind w:firstLineChars="0" w:firstLine="0"/>
-        <w:rPr>
-          <w:rFonts w:hint="eastAsia"/>
-        </w:rPr>
       </w:pPr>
       <w:r>
         <w:t xml:space="preserve">[0062] </w:t>
@@ -3428,9 +3024,6 @@
     <w:p>
       <w:pPr>
         <w:ind w:firstLineChars="0" w:firstLine="0"/>
-        <w:rPr>
-          <w:rFonts w:hint="eastAsia"/>
-        </w:rPr>
       </w:pPr>
       <w:r>
         <w:t xml:space="preserve">[0063] </w:t>
@@ -3448,9 +3041,6 @@
     <w:p>
       <w:pPr>
         <w:ind w:firstLineChars="0" w:firstLine="0"/>
-        <w:rPr>
-          <w:rFonts w:hint="eastAsia"/>
-        </w:rPr>
       </w:pPr>
       <w:r>
         <w:t xml:space="preserve">[0064] </w:t>
@@ -3514,9 +3104,6 @@
         <w:adjustRightInd w:val="0"/>
         <w:snapToGrid w:val="0"/>
         <w:ind w:firstLineChars="0" w:firstLine="0"/>
-        <w:rPr>
-          <w:rFonts w:hint="eastAsia"/>
-        </w:rPr>
       </w:pPr>
       <w:r>
         <w:t xml:space="preserve">[0066] </w:t>
@@ -3536,9 +3123,6 @@
         <w:adjustRightInd w:val="0"/>
         <w:snapToGrid w:val="0"/>
         <w:ind w:firstLineChars="0" w:firstLine="0"/>
-        <w:rPr>
-          <w:rFonts w:hint="eastAsia"/>
-        </w:rPr>
       </w:pPr>
       <w:r>
         <w:t xml:space="preserve">[0067] </w:t>
@@ -3568,9 +3152,6 @@
         <w:adjustRightInd w:val="0"/>
         <w:snapToGrid w:val="0"/>
         <w:ind w:firstLineChars="0" w:firstLine="0"/>
-        <w:rPr>
-          <w:rFonts w:hint="eastAsia"/>
-        </w:rPr>
       </w:pPr>
       <w:r>
         <w:t xml:space="preserve">[0068] </w:t>
@@ -3584,9 +3165,6 @@
         <w:adjustRightInd w:val="0"/>
         <w:snapToGrid w:val="0"/>
         <w:ind w:firstLineChars="0" w:firstLine="0"/>
-        <w:rPr>
-          <w:rFonts w:hint="eastAsia"/>
-        </w:rPr>
       </w:pPr>
       <w:r>
         <w:t xml:space="preserve">[0069] </w:t>
@@ -3606,9 +3184,6 @@
         <w:adjustRightInd w:val="0"/>
         <w:snapToGrid w:val="0"/>
         <w:ind w:firstLineChars="0" w:firstLine="0"/>
-        <w:rPr>
-          <w:rFonts w:hint="eastAsia"/>
-        </w:rPr>
       </w:pPr>
       <w:r>
         <w:t xml:space="preserve">[0070] </w:t>
@@ -3622,9 +3197,6 @@
         <w:adjustRightInd w:val="0"/>
         <w:snapToGrid w:val="0"/>
         <w:ind w:firstLineChars="0" w:firstLine="0"/>
-        <w:rPr>
-          <w:rFonts w:hint="eastAsia"/>
-        </w:rPr>
       </w:pPr>
       <w:r>
         <w:t xml:space="preserve">[0071] </w:t>
@@ -4564,9 +4136,6 @@
         <w:adjustRightInd w:val="0"/>
         <w:snapToGrid w:val="0"/>
         <w:ind w:firstLineChars="0" w:firstLine="0"/>
-        <w:rPr>
-          <w:rFonts w:hint="eastAsia"/>
-        </w:rPr>
       </w:pPr>
       <w:r>
         <w:t xml:space="preserve">[0075] </w:t>
@@ -5957,9 +5526,6 @@
         <w:adjustRightInd w:val="0"/>
         <w:snapToGrid w:val="0"/>
         <w:ind w:firstLineChars="0" w:firstLine="0"/>
-        <w:rPr>
-          <w:rFonts w:hint="eastAsia"/>
-        </w:rPr>
       </w:pPr>
       <w:r>
         <w:t xml:space="preserve">[0077] </w:t>
@@ -5985,9 +5551,6 @@
         <w:adjustRightInd w:val="0"/>
         <w:snapToGrid w:val="0"/>
         <w:ind w:firstLineChars="0" w:firstLine="0"/>
-        <w:rPr>
-          <w:rFonts w:hint="eastAsia"/>
-        </w:rPr>
       </w:pPr>
       <w:r>
         <w:t>第一，在远距离与大时延场景中，本发明方法的吞吐量达到最高或与最优对比方法相当。静止轨道卫星场景中本发明方法的瓶颈利用率为</w:t>
@@ -6058,9 +5621,6 @@
         <w:adjustRightInd w:val="0"/>
         <w:snapToGrid w:val="0"/>
         <w:ind w:firstLineChars="0" w:firstLine="0"/>
-        <w:rPr>
-          <w:rFonts w:hint="eastAsia"/>
-        </w:rPr>
       </w:pPr>
       <w:r>
         <w:t>第二，在达到相同瓶颈利用率时，本发明方法的平均单向时延低于两种丢包型对比方法。在重度拥塞汇聚与低带宽数据中心场景中，本发明方法与两种丢包型对比方法均达到</w:t>
@@ -6167,9 +5727,6 @@
         <w:adjustRightInd w:val="0"/>
         <w:snapToGrid w:val="0"/>
         <w:ind w:firstLineChars="0" w:firstLine="0"/>
-        <w:rPr>
-          <w:rFonts w:hint="eastAsia"/>
-        </w:rPr>
       </w:pPr>
       <w:r>
         <w:t>第三，存在应当如实说明的混合结果与局限。在广域长距离与静止轨道卫星场景中，本发明方法的平均单向时延（</w:t>
@@ -7214,9 +6771,6 @@
         <w:adjustRightInd w:val="0"/>
         <w:snapToGrid w:val="0"/>
         <w:ind w:firstLineChars="0" w:firstLine="0"/>
-        <w:rPr>
-          <w:rFonts w:hint="eastAsia"/>
-        </w:rPr>
       </w:pPr>
     </w:p>
     <w:p>
@@ -7412,10 +6966,10 @@
           <w:szCs w:val="24"/>
         </w:rPr>
         <w:drawing>
-          <wp:inline distT="0" distB="0" distL="0" distR="0" wp14:anchorId="4D68B44D" wp14:editId="1652B1BB">
-            <wp:extent cx="5939790" cy="4423410"/>
-            <wp:effectExtent l="0" t="0" r="3810" b="0"/>
-            <wp:docPr id="806060248" name="图片 2"/>
+          <wp:inline distT="0" distB="0" distL="0" distR="0" wp14:anchorId="40BE898E" wp14:editId="37DD7CBC">
+            <wp:extent cx="5935980" cy="4418965"/>
+            <wp:effectExtent l="0" t="0" r="7620" b="635"/>
+            <wp:docPr id="959202635" name="图片 2"/>
             <wp:cNvGraphicFramePr>
               <a:graphicFrameLocks xmlns:a="http://schemas.openxmlformats.org/drawingml/2006/main" noChangeAspect="1"/>
             </wp:cNvGraphicFramePr>
@@ -7423,14 +6977,95 @@
               <a:graphicData uri="http://schemas.openxmlformats.org/drawingml/2006/picture">
                 <pic:pic xmlns:pic="http://schemas.openxmlformats.org/drawingml/2006/picture">
                   <pic:nvPicPr>
-                    <pic:cNvPr id="806060248" name="图片 806060248"/>
-                    <pic:cNvPicPr/>
+                    <pic:cNvPr id="0" name="Picture 2"/>
+                    <pic:cNvPicPr>
+                      <a:picLocks noChangeAspect="1" noChangeArrowheads="1"/>
+                    </pic:cNvPicPr>
                   </pic:nvPicPr>
                   <pic:blipFill>
                     <a:blip r:embed="rId16" cstate="print">
                       <a:extLst>
                         <a:ext uri="{28A0092B-C50C-407E-A947-70E740481C1C}">
                           <a14:useLocalDpi xmlns:a14="http://schemas.microsoft.com/office/drawing/2010/main" val="0"/>
+                        </a:ext>
+                      </a:extLst>
+                    </a:blip>
+                    <a:srcRect/>
+                    <a:stretch>
+                      <a:fillRect/>
+                    </a:stretch>
+                  </pic:blipFill>
+                  <pic:spPr bwMode="auto">
+                    <a:xfrm>
+                      <a:off x="0" y="0"/>
+                      <a:ext cx="5935980" cy="4418965"/>
+                    </a:xfrm>
+                    <a:prstGeom prst="rect">
+                      <a:avLst/>
+                    </a:prstGeom>
+                    <a:noFill/>
+                    <a:ln>
+                      <a:noFill/>
+                    </a:ln>
+                  </pic:spPr>
+                </pic:pic>
+              </a:graphicData>
+            </a:graphic>
+          </wp:inline>
+        </w:drawing>
+      </w:r>
+    </w:p>
+    <w:p>
+      <w:pPr>
+        <w:adjustRightInd w:val="0"/>
+        <w:snapToGrid w:val="0"/>
+        <w:ind w:firstLineChars="0" w:firstLine="0"/>
+        <w:jc w:val="center"/>
+      </w:pPr>
+      <w:r>
+        <w:t>图</w:t>
+      </w:r>
+      <w:r>
+        <w:t>3</w:t>
+      </w:r>
+      <w:r>
+        <w:rPr>
+          <w:rFonts w:hint="eastAsia"/>
+        </w:rPr>
+        <w:t>.</w:t>
+      </w:r>
+      <w:r>
+        <w:t>本发明所述拥塞控制系统架构图。</w:t>
+      </w:r>
+    </w:p>
+    <w:p>
+      <w:pPr>
+        <w:ind w:firstLine="480"/>
+      </w:pPr>
+      <w:r>
+        <w:rPr>
+          <w:noProof/>
+        </w:rPr>
+        <w:drawing>
+          <wp:inline distT="0" distB="0" distL="0" distR="0" wp14:anchorId="56593CE2" wp14:editId="1FE1A970">
+            <wp:extent cx="5939790" cy="2973070"/>
+            <wp:effectExtent l="0" t="0" r="3810" b="0"/>
+            <wp:docPr id="366237166" name="图形 1"/>
+            <wp:cNvGraphicFramePr>
+              <a:graphicFrameLocks xmlns:a="http://schemas.openxmlformats.org/drawingml/2006/main" noChangeAspect="1"/>
+            </wp:cNvGraphicFramePr>
+            <a:graphic xmlns:a="http://schemas.openxmlformats.org/drawingml/2006/main">
+              <a:graphicData uri="http://schemas.openxmlformats.org/drawingml/2006/picture">
+                <pic:pic xmlns:pic="http://schemas.openxmlformats.org/drawingml/2006/picture">
+                  <pic:nvPicPr>
+                    <pic:cNvPr id="366237166" name=""/>
+                    <pic:cNvPicPr/>
+                  </pic:nvPicPr>
+                  <pic:blipFill>
+                    <a:blip r:embed="rId21">
+                      <a:extLst>
+                        <a:ext uri="{96DAC541-7B7A-43D3-8B79-37D633B846F1}">
+                          <asvg:svgBlip xmlns:asvg="http://schemas.microsoft.com/office/drawing/2016/SVG/main" r:embed="rId22"/>
                         </a:ext>
                       </a:extLst>
                     </a:blip>
@@ -7441,7 +7076,7 @@
                   <pic:spPr>
                     <a:xfrm>
                       <a:off x="0" y="0"/>
-                      <a:ext cx="5939790" cy="4423410"/>
+                      <a:ext cx="5939790" cy="2973070"/>
                     </a:xfrm>
                     <a:prstGeom prst="rect">
                       <a:avLst/>
@@ -7456,40 +7091,52 @@
     </w:p>
     <w:p>
       <w:pPr>
+        <w:widowControl/>
+        <w:spacing w:line="240" w:lineRule="auto"/>
+        <w:ind w:firstLineChars="0" w:firstLine="0"/>
+        <w:jc w:val="left"/>
+      </w:pPr>
+      <w:r>
+        <w:br w:type="page"/>
+      </w:r>
+    </w:p>
+    <w:p>
+      <w:pPr>
         <w:adjustRightInd w:val="0"/>
         <w:snapToGrid w:val="0"/>
         <w:ind w:firstLineChars="0" w:firstLine="0"/>
         <w:jc w:val="center"/>
       </w:pPr>
       <w:r>
+        <w:lastRenderedPageBreak/>
         <w:t>图</w:t>
       </w:r>
       <w:r>
-        <w:t>3</w:t>
-      </w:r>
-      <w:r>
+        <w:t>4.</w:t>
+      </w:r>
+      <w:r>
+        <w:t>多信号状态获取与拥塞语义分类流程图。</w:t>
+      </w:r>
+    </w:p>
+    <w:p>
+      <w:pPr>
+        <w:widowControl/>
+        <w:spacing w:line="240" w:lineRule="auto"/>
+        <w:ind w:firstLineChars="0" w:firstLine="0"/>
+        <w:jc w:val="left"/>
         <w:rPr>
           <w:rFonts w:hint="eastAsia"/>
         </w:rPr>
-        <w:t>.</w:t>
-      </w:r>
-      <w:r>
-        <w:t>本发明所述拥塞控制系统架构图。</w:t>
-      </w:r>
-    </w:p>
-    <w:p>
-      <w:pPr>
-        <w:ind w:firstLine="480"/>
       </w:pPr>
       <w:r>
         <w:rPr>
           <w:noProof/>
         </w:rPr>
         <w:drawing>
-          <wp:inline distT="0" distB="0" distL="0" distR="0" wp14:anchorId="4198BF5E" wp14:editId="62F61A10">
-            <wp:extent cx="5939790" cy="2969895"/>
-            <wp:effectExtent l="0" t="0" r="3810" b="1905"/>
-            <wp:docPr id="560685531" name="图片 3"/>
+          <wp:inline distT="0" distB="0" distL="0" distR="0" wp14:anchorId="54309D32" wp14:editId="3DD1E225">
+            <wp:extent cx="5935980" cy="4545330"/>
+            <wp:effectExtent l="0" t="0" r="7620" b="7620"/>
+            <wp:docPr id="1146757517" name="图片 3"/>
             <wp:cNvGraphicFramePr>
               <a:graphicFrameLocks xmlns:a="http://schemas.openxmlformats.org/drawingml/2006/main" noChangeAspect="1"/>
             </wp:cNvGraphicFramePr>
@@ -7497,158 +7144,10 @@
               <a:graphicData uri="http://schemas.openxmlformats.org/drawingml/2006/picture">
                 <pic:pic xmlns:pic="http://schemas.openxmlformats.org/drawingml/2006/picture">
                   <pic:nvPicPr>
-                    <pic:cNvPr id="560685531" name="图片 560685531"/>
-                    <pic:cNvPicPr/>
-                  </pic:nvPicPr>
-                  <pic:blipFill>
-                    <a:blip r:embed="rId21" cstate="print">
-                      <a:extLst>
-                        <a:ext uri="{28A0092B-C50C-407E-A947-70E740481C1C}">
-                          <a14:useLocalDpi xmlns:a14="http://schemas.microsoft.com/office/drawing/2010/main" val="0"/>
-                        </a:ext>
-                      </a:extLst>
-                    </a:blip>
-                    <a:stretch>
-                      <a:fillRect/>
-                    </a:stretch>
-                  </pic:blipFill>
-                  <pic:spPr>
-                    <a:xfrm>
-                      <a:off x="0" y="0"/>
-                      <a:ext cx="5939790" cy="2969895"/>
-                    </a:xfrm>
-                    <a:prstGeom prst="rect">
-                      <a:avLst/>
-                    </a:prstGeom>
-                  </pic:spPr>
-                </pic:pic>
-              </a:graphicData>
-            </a:graphic>
-          </wp:inline>
-        </w:drawing>
-      </w:r>
-    </w:p>
-    <w:p>
-      <w:pPr>
-        <w:adjustRightInd w:val="0"/>
-        <w:snapToGrid w:val="0"/>
-        <w:ind w:firstLineChars="0" w:firstLine="0"/>
-        <w:jc w:val="center"/>
-      </w:pPr>
-      <w:r>
-        <w:t>图</w:t>
-      </w:r>
-      <w:r>
-        <w:t>4.</w:t>
-      </w:r>
-      <w:r>
-        <w:t>多信号状态获取与拥塞语义分类流程图。</w:t>
-      </w:r>
-    </w:p>
-    <w:p>
-      <w:pPr>
-        <w:ind w:firstLine="480"/>
-      </w:pPr>
-      <w:r>
-        <w:rPr>
-          <w:noProof/>
-        </w:rPr>
-        <w:lastRenderedPageBreak/>
-        <w:drawing>
-          <wp:inline distT="0" distB="0" distL="0" distR="0" wp14:anchorId="6E380D1F" wp14:editId="37CA323D">
-            <wp:extent cx="5939790" cy="4549775"/>
-            <wp:effectExtent l="0" t="0" r="3810" b="0"/>
-            <wp:docPr id="971714140" name="图片 4"/>
-            <wp:cNvGraphicFramePr>
-              <a:graphicFrameLocks xmlns:a="http://schemas.openxmlformats.org/drawingml/2006/main" noChangeAspect="1"/>
-            </wp:cNvGraphicFramePr>
-            <a:graphic xmlns:a="http://schemas.openxmlformats.org/drawingml/2006/main">
-              <a:graphicData uri="http://schemas.openxmlformats.org/drawingml/2006/picture">
-                <pic:pic xmlns:pic="http://schemas.openxmlformats.org/drawingml/2006/picture">
-                  <pic:nvPicPr>
-                    <pic:cNvPr id="971714140" name="图片 971714140"/>
-                    <pic:cNvPicPr/>
-                  </pic:nvPicPr>
-                  <pic:blipFill>
-                    <a:blip r:embed="rId22" cstate="print">
-                      <a:extLst>
-                        <a:ext uri="{28A0092B-C50C-407E-A947-70E740481C1C}">
-                          <a14:useLocalDpi xmlns:a14="http://schemas.microsoft.com/office/drawing/2010/main" val="0"/>
-                        </a:ext>
-                      </a:extLst>
-                    </a:blip>
-                    <a:stretch>
-                      <a:fillRect/>
-                    </a:stretch>
-                  </pic:blipFill>
-                  <pic:spPr>
-                    <a:xfrm>
-                      <a:off x="0" y="0"/>
-                      <a:ext cx="5939790" cy="4549775"/>
-                    </a:xfrm>
-                    <a:prstGeom prst="rect">
-                      <a:avLst/>
-                    </a:prstGeom>
-                  </pic:spPr>
-                </pic:pic>
-              </a:graphicData>
-            </a:graphic>
-          </wp:inline>
-        </w:drawing>
-      </w:r>
-    </w:p>
-    <w:p>
-      <w:pPr>
-        <w:widowControl/>
-        <w:spacing w:line="240" w:lineRule="auto"/>
-        <w:ind w:firstLineChars="0" w:firstLine="0"/>
-        <w:jc w:val="left"/>
-        <w:rPr>
-          <w:rFonts w:hint="eastAsia"/>
-        </w:rPr>
-      </w:pPr>
-      <w:r>
-        <w:br w:type="page"/>
-      </w:r>
-    </w:p>
-    <w:p>
-      <w:pPr>
-        <w:adjustRightInd w:val="0"/>
-        <w:snapToGrid w:val="0"/>
-        <w:ind w:firstLineChars="0" w:firstLine="0"/>
-        <w:jc w:val="center"/>
-        <w:rPr>
-          <w:rFonts w:hint="eastAsia"/>
-        </w:rPr>
-      </w:pPr>
-      <w:r>
-        <w:lastRenderedPageBreak/>
-        <w:t>图</w:t>
-      </w:r>
-      <w:r>
-        <w:t>5.</w:t>
-      </w:r>
-      <w:r>
-        <w:t>带宽延迟积估计、参数自适应与拥塞窗口决策流程图。</w:t>
-      </w:r>
-      <w:r>
-        <w:rPr>
-          <w:noProof/>
-        </w:rPr>
-        <w:drawing>
-          <wp:inline distT="0" distB="0" distL="0" distR="0" wp14:anchorId="399F74A5" wp14:editId="268E2FBD">
-            <wp:extent cx="5939790" cy="4802505"/>
-            <wp:effectExtent l="0" t="0" r="3810" b="0"/>
-            <wp:docPr id="717206112" name="图片 5"/>
-            <wp:cNvGraphicFramePr>
-              <a:graphicFrameLocks xmlns:a="http://schemas.openxmlformats.org/drawingml/2006/main" noChangeAspect="1"/>
-            </wp:cNvGraphicFramePr>
-            <a:graphic xmlns:a="http://schemas.openxmlformats.org/drawingml/2006/main">
-              <a:graphicData uri="http://schemas.openxmlformats.org/drawingml/2006/picture">
-                <pic:pic xmlns:pic="http://schemas.openxmlformats.org/drawingml/2006/picture">
-                  <pic:nvPicPr>
-                    <pic:cNvPr id="717206112" name="图片 717206112"/>
-                    <pic:cNvPicPr/>
+                    <pic:cNvPr id="0" name="Picture 3"/>
+                    <pic:cNvPicPr>
+                      <a:picLocks noChangeAspect="1" noChangeArrowheads="1"/>
+                    </pic:cNvPicPr>
                   </pic:nvPicPr>
                   <pic:blipFill>
                     <a:blip r:embed="rId23" cstate="print">
@@ -7658,18 +7157,23 @@
                         </a:ext>
                       </a:extLst>
                     </a:blip>
+                    <a:srcRect/>
                     <a:stretch>
                       <a:fillRect/>
                     </a:stretch>
                   </pic:blipFill>
-                  <pic:spPr>
+                  <pic:spPr bwMode="auto">
                     <a:xfrm>
                       <a:off x="0" y="0"/>
-                      <a:ext cx="5939790" cy="4802505"/>
+                      <a:ext cx="5935980" cy="4545330"/>
                     </a:xfrm>
                     <a:prstGeom prst="rect">
                       <a:avLst/>
                     </a:prstGeom>
+                    <a:noFill/>
+                    <a:ln>
+                      <a:noFill/>
+                    </a:ln>
                   </pic:spPr>
                 </pic:pic>
               </a:graphicData>
@@ -7681,6 +7185,88 @@
     <w:p>
       <w:pPr>
         <w:widowControl/>
+        <w:spacing w:line="240" w:lineRule="auto"/>
+        <w:ind w:firstLineChars="0" w:firstLine="0"/>
+        <w:jc w:val="left"/>
+      </w:pPr>
+      <w:r>
+        <w:br w:type="page"/>
+      </w:r>
+    </w:p>
+    <w:p>
+      <w:pPr>
+        <w:adjustRightInd w:val="0"/>
+        <w:snapToGrid w:val="0"/>
+        <w:ind w:firstLineChars="0" w:firstLine="0"/>
+        <w:jc w:val="center"/>
+      </w:pPr>
+      <w:r>
+        <w:lastRenderedPageBreak/>
+        <w:t>图</w:t>
+      </w:r>
+      <w:r>
+        <w:t>5.</w:t>
+      </w:r>
+      <w:r>
+        <w:t>带宽延迟积估计、参数自适应与拥塞窗口决策流程图。</w:t>
+      </w:r>
+      <w:r>
+        <w:rPr>
+          <w:noProof/>
+        </w:rPr>
+        <w:drawing>
+          <wp:inline distT="0" distB="0" distL="0" distR="0" wp14:anchorId="63EF4708" wp14:editId="4293DEA9">
+            <wp:extent cx="5935980" cy="4799330"/>
+            <wp:effectExtent l="0" t="0" r="7620" b="1270"/>
+            <wp:docPr id="335494119" name="图片 4"/>
+            <wp:cNvGraphicFramePr>
+              <a:graphicFrameLocks xmlns:a="http://schemas.openxmlformats.org/drawingml/2006/main" noChangeAspect="1"/>
+            </wp:cNvGraphicFramePr>
+            <a:graphic xmlns:a="http://schemas.openxmlformats.org/drawingml/2006/main">
+              <a:graphicData uri="http://schemas.openxmlformats.org/drawingml/2006/picture">
+                <pic:pic xmlns:pic="http://schemas.openxmlformats.org/drawingml/2006/picture">
+                  <pic:nvPicPr>
+                    <pic:cNvPr id="0" name="Picture 4"/>
+                    <pic:cNvPicPr>
+                      <a:picLocks noChangeAspect="1" noChangeArrowheads="1"/>
+                    </pic:cNvPicPr>
+                  </pic:nvPicPr>
+                  <pic:blipFill>
+                    <a:blip r:embed="rId24" cstate="print">
+                      <a:extLst>
+                        <a:ext uri="{28A0092B-C50C-407E-A947-70E740481C1C}">
+                          <a14:useLocalDpi xmlns:a14="http://schemas.microsoft.com/office/drawing/2010/main" val="0"/>
+                        </a:ext>
+                      </a:extLst>
+                    </a:blip>
+                    <a:srcRect/>
+                    <a:stretch>
+                      <a:fillRect/>
+                    </a:stretch>
+                  </pic:blipFill>
+                  <pic:spPr bwMode="auto">
+                    <a:xfrm>
+                      <a:off x="0" y="0"/>
+                      <a:ext cx="5935980" cy="4799330"/>
+                    </a:xfrm>
+                    <a:prstGeom prst="rect">
+                      <a:avLst/>
+                    </a:prstGeom>
+                    <a:noFill/>
+                    <a:ln>
+                      <a:noFill/>
+                    </a:ln>
+                  </pic:spPr>
+                </pic:pic>
+              </a:graphicData>
+            </a:graphic>
+          </wp:inline>
+        </w:drawing>
+      </w:r>
+    </w:p>
+    <w:p>
+      <w:pPr>
+        <w:widowControl/>
         <w:ind w:firstLineChars="0" w:firstLine="0"/>
         <w:rPr>
           <w:kern w:val="0"/>
@@ -7689,8 +7275,8 @@
       </w:pPr>
     </w:p>
     <w:sectPr>
-      <w:headerReference w:type="default" r:id="rId24"/>
-      <w:footerReference w:type="default" r:id="rId25"/>
+      <w:headerReference w:type="default" r:id="rId25"/>
+      <w:footerReference w:type="default" r:id="rId26"/>
       <w:pgSz w:w="11906" w:h="16838"/>
       <w:pgMar w:top="1418" w:right="1134" w:bottom="1134" w:left="1418" w:header="567" w:footer="567" w:gutter="0"/>
       <w:pgNumType w:start="1"/>
@@ -7702,7 +7288,7 @@
 </file>
 
 <file path=word/endnotes.xml><?xml version="1.0" encoding="utf-8"?>
-<w:endnotes xmlns:wpc="http://schemas.microsoft.com/office/word/2010/wordprocessingCanvas" xmlns:cx="http://schemas.microsoft.com/office/drawing/2014/chartex" xmlns:cx1="http://schemas.microsoft.com/office/drawing/2015/9/8/chartex" xmlns:cx2="http://schemas.microsoft.com/office/drawing/2015/10/21/chartex" xmlns:cx3="http://schemas.microsoft.com/office/drawing/2016/5/9/chartex" xmlns:cx4="http://schemas.microsoft.com/office/drawing/2016/5/10/chartex" xmlns:cx5="http://schemas.microsoft.com/office/drawing/2016/5/11/chartex" xmlns:cx6="http://schemas.microsoft.com/office/drawing/2016/5/12/chartex" xmlns:cx7="http://schemas.microsoft.com/office/drawing/2016/5/13/chartex" xmlns:cx8="http://schemas.microsoft.com/office/drawing/2016/5/14/chartex" xmlns:mc="http://schemas.openxmlformats.org/markup-compatibility/2006" xmlns:m="http://schemas.openxmlformats.org/officeDocument/2006/math" xmlns:aink="http://schemas.microsoft.com/office/drawing/2016/ink" xmlns:am3d="http://schemas.microsoft.com/office/drawing/2017/model3d" xmlns:oel="http://schemas.microsoft.com/office/2019/extlst" xmlns:r="http://schemas.openxmlformats.org/officeDocument/2006/relationships" xmlns:wp14="http://schemas.microsoft.com/office/word/2010/wordprocessingDrawing" xmlns:wp="http://schemas.openxmlformats.org/drawingml/2006/wordprocessingDrawing" xmlns:wpg="http://schemas.microsoft.com/office/word/2010/wordprocessingGroup" xmlns:wpi="http://schemas.microsoft.com/office/word/2010/wordprocessingInk" xmlns:wps="http://schemas.microsoft.com/office/word/2010/wordprocessingShape" xmlns:o="urn:schemas-microsoft-com:office:office" xmlns:v="urn:schemas-microsoft-com:vml" xmlns:w10="urn:schemas-microsoft-com:office:word" xmlns:w="http://schemas.openxmlformats.org/wordprocessingml/2006/main" xmlns:w14="http://schemas.microsoft.com/office/word/2010/wordml" xmlns:w15="http://schemas.microsoft.com/office/word/2012/wordml" xmlns:w16cex="http://schemas.microsoft.com/office/word/2018/wordml/cex" xmlns:w16cid="http://schemas.microsoft.com/office/word/2016/wordml/cid" xmlns:w16="http://schemas.microsoft.com/office/word/2018/wordml" xmlns:w16sdtdh="http://schemas.microsoft.com/office/word/2020/wordml/sdtdatahash" xmlns:w16sdtfl="http://schemas.microsoft.com/office/word/2024/wordml/sdtformatlock" xmlns:w16se="http://schemas.microsoft.com/office/word/2015/wordml/symex" xmlns:w16du="http://schemas.microsoft.com/office/word/2023/wordml/word16du" xmlns:wne="http://schemas.microsoft.com/office/word/2006/wordml" mc:Ignorable="w14 w15 w16se w16cid w16 w16cex w16sdtdh w16sdtfl w16du wp14">
+<w:endnotes xmlns:wpc="http://schemas.microsoft.com/office/word/2010/wordprocessingCanvas" xmlns:cx="http://schemas.microsoft.com/office/drawing/2014/chartex" xmlns:cx1="http://schemas.microsoft.com/office/drawing/2015/9/8/chartex" xmlns:cx2="http://schemas.microsoft.com/office/drawing/2015/10/21/chartex" xmlns:cx3="http://schemas.microsoft.com/office/drawing/2016/5/9/chartex" xmlns:cx4="http://schemas.microsoft.com/office/drawing/2016/5/10/chartex" xmlns:cx5="http://schemas.microsoft.com/office/drawing/2016/5/11/chartex" xmlns:cx6="http://schemas.microsoft.com/office/drawing/2016/5/12/chartex" xmlns:cx7="http://schemas.microsoft.com/office/drawing/2016/5/13/chartex" xmlns:cx8="http://schemas.microsoft.com/office/drawing/2016/5/14/chartex" xmlns:mc="http://schemas.openxmlformats.org/markup-compatibility/2006" xmlns:aink="http://schemas.microsoft.com/office/drawing/2016/ink" xmlns:am3d="http://schemas.microsoft.com/office/drawing/2017/model3d" xmlns:o="urn:schemas-microsoft-com:office:office" xmlns:oel="http://schemas.microsoft.com/office/2019/extlst" xmlns:r="http://schemas.openxmlformats.org/officeDocument/2006/relationships" xmlns:m="http://schemas.openxmlformats.org/officeDocument/2006/math" xmlns:v="urn:schemas-microsoft-com:vml" xmlns:wp14="http://schemas.microsoft.com/office/word/2010/wordprocessingDrawing" xmlns:wp="http://schemas.openxmlformats.org/drawingml/2006/wordprocessingDrawing" xmlns:w10="urn:schemas-microsoft-com:office:word" xmlns:w="http://schemas.openxmlformats.org/wordprocessingml/2006/main" xmlns:w14="http://schemas.microsoft.com/office/word/2010/wordml" xmlns:w15="http://schemas.microsoft.com/office/word/2012/wordml" xmlns:w16cex="http://schemas.microsoft.com/office/word/2018/wordml/cex" xmlns:w16cid="http://schemas.microsoft.com/office/word/2016/wordml/cid" xmlns:w16="http://schemas.microsoft.com/office/word/2018/wordml" xmlns:w16du="http://schemas.microsoft.com/office/word/2023/wordml/word16du" xmlns:w16sdtdh="http://schemas.microsoft.com/office/word/2020/wordml/sdtdatahash" xmlns:w16sdtfl="http://schemas.microsoft.com/office/word/2024/wordml/sdtformatlock" xmlns:w16se="http://schemas.microsoft.com/office/word/2015/wordml/symex" xmlns:wpg="http://schemas.microsoft.com/office/word/2010/wordprocessingGroup" xmlns:wpi="http://schemas.microsoft.com/office/word/2010/wordprocessingInk" xmlns:wne="http://schemas.microsoft.com/office/word/2006/wordml" xmlns:wps="http://schemas.microsoft.com/office/word/2010/wordprocessingShape" mc:Ignorable="w14 w15 w16se w16cid w16 w16cex w16sdtdh w16sdtfl w16du wp14">
   <w:endnote w:type="separator" w:id="-1">
     <w:p>
       <w:pPr>
@@ -7729,7 +7315,7 @@
 </file>
 
 <file path=word/footer1.xml><?xml version="1.0" encoding="utf-8"?>
-<w:ftr xmlns:wpc="http://schemas.microsoft.com/office/word/2010/wordprocessingCanvas" xmlns:cx="http://schemas.microsoft.com/office/drawing/2014/chartex" xmlns:cx1="http://schemas.microsoft.com/office/drawing/2015/9/8/chartex" xmlns:cx2="http://schemas.microsoft.com/office/drawing/2015/10/21/chartex" xmlns:cx3="http://schemas.microsoft.com/office/drawing/2016/5/9/chartex" xmlns:cx4="http://schemas.microsoft.com/office/drawing/2016/5/10/chartex" xmlns:cx5="http://schemas.microsoft.com/office/drawing/2016/5/11/chartex" xmlns:cx6="http://schemas.microsoft.com/office/drawing/2016/5/12/chartex" xmlns:cx7="http://schemas.microsoft.com/office/drawing/2016/5/13/chartex" xmlns:cx8="http://schemas.microsoft.com/office/drawing/2016/5/14/chartex" xmlns:mc="http://schemas.openxmlformats.org/markup-compatibility/2006" xmlns:m="http://schemas.openxmlformats.org/officeDocument/2006/math" xmlns:aink="http://schemas.microsoft.com/office/drawing/2016/ink" xmlns:am3d="http://schemas.microsoft.com/office/drawing/2017/model3d" xmlns:oel="http://schemas.microsoft.com/office/2019/extlst" xmlns:r="http://schemas.openxmlformats.org/officeDocument/2006/relationships" xmlns:wp14="http://schemas.microsoft.com/office/word/2010/wordprocessingDrawing" xmlns:wp="http://schemas.openxmlformats.org/drawingml/2006/wordprocessingDrawing" xmlns:wpg="http://schemas.microsoft.com/office/word/2010/wordprocessingGroup" xmlns:wpi="http://schemas.microsoft.com/office/word/2010/wordprocessingInk" xmlns:wps="http://schemas.microsoft.com/office/word/2010/wordprocessingShape" xmlns:o="urn:schemas-microsoft-com:office:office" xmlns:v="urn:schemas-microsoft-com:vml" xmlns:w10="urn:schemas-microsoft-com:office:word" xmlns:w="http://schemas.openxmlformats.org/wordprocessingml/2006/main" xmlns:w14="http://schemas.microsoft.com/office/word/2010/wordml" xmlns:w15="http://schemas.microsoft.com/office/word/2012/wordml" xmlns:w16cex="http://schemas.microsoft.com/office/word/2018/wordml/cex" xmlns:w16cid="http://schemas.microsoft.com/office/word/2016/wordml/cid" xmlns:w16="http://schemas.microsoft.com/office/word/2018/wordml" xmlns:w16sdtdh="http://schemas.microsoft.com/office/word/2020/wordml/sdtdatahash" xmlns:w16sdtfl="http://schemas.microsoft.com/office/word/2024/wordml/sdtformatlock" xmlns:w16se="http://schemas.microsoft.com/office/word/2015/wordml/symex" xmlns:w16du="http://schemas.microsoft.com/office/word/2023/wordml/word16du" xmlns:wne="http://schemas.microsoft.com/office/word/2006/wordml" mc:Ignorable="w14 w15 w16se w16cid w16 w16cex w16sdtdh w16sdtfl w16du wp14">
+<w:ftr xmlns:wpc="http://schemas.microsoft.com/office/word/2010/wordprocessingCanvas" xmlns:cx="http://schemas.microsoft.com/office/drawing/2014/chartex" xmlns:cx1="http://schemas.microsoft.com/office/drawing/2015/9/8/chartex" xmlns:cx2="http://schemas.microsoft.com/office/drawing/2015/10/21/chartex" xmlns:cx3="http://schemas.microsoft.com/office/drawing/2016/5/9/chartex" xmlns:cx4="http://schemas.microsoft.com/office/drawing/2016/5/10/chartex" xmlns:cx5="http://schemas.microsoft.com/office/drawing/2016/5/11/chartex" xmlns:cx6="http://schemas.microsoft.com/office/drawing/2016/5/12/chartex" xmlns:cx7="http://schemas.microsoft.com/office/drawing/2016/5/13/chartex" xmlns:cx8="http://schemas.microsoft.com/office/drawing/2016/5/14/chartex" xmlns:mc="http://schemas.openxmlformats.org/markup-compatibility/2006" xmlns:aink="http://schemas.microsoft.com/office/drawing/2016/ink" xmlns:am3d="http://schemas.microsoft.com/office/drawing/2017/model3d" xmlns:o="urn:schemas-microsoft-com:office:office" xmlns:oel="http://schemas.microsoft.com/office/2019/extlst" xmlns:r="http://schemas.openxmlformats.org/officeDocument/2006/relationships" xmlns:m="http://schemas.openxmlformats.org/officeDocument/2006/math" xmlns:v="urn:schemas-microsoft-com:vml" xmlns:wp14="http://schemas.microsoft.com/office/word/2010/wordprocessingDrawing" xmlns:wp="http://schemas.openxmlformats.org/drawingml/2006/wordprocessingDrawing" xmlns:w10="urn:schemas-microsoft-com:office:word" xmlns:w="http://schemas.openxmlformats.org/wordprocessingml/2006/main" xmlns:w14="http://schemas.microsoft.com/office/word/2010/wordml" xmlns:w15="http://schemas.microsoft.com/office/word/2012/wordml" xmlns:w16cex="http://schemas.microsoft.com/office/word/2018/wordml/cex" xmlns:w16cid="http://schemas.microsoft.com/office/word/2016/wordml/cid" xmlns:w16="http://schemas.microsoft.com/office/word/2018/wordml" xmlns:w16du="http://schemas.microsoft.com/office/word/2023/wordml/word16du" xmlns:w16sdtdh="http://schemas.microsoft.com/office/word/2020/wordml/sdtdatahash" xmlns:w16sdtfl="http://schemas.microsoft.com/office/word/2024/wordml/sdtformatlock" xmlns:w16se="http://schemas.microsoft.com/office/word/2015/wordml/symex" xmlns:wpg="http://schemas.microsoft.com/office/word/2010/wordprocessingGroup" xmlns:wpi="http://schemas.microsoft.com/office/word/2010/wordprocessingInk" xmlns:wne="http://schemas.microsoft.com/office/word/2006/wordml" xmlns:wps="http://schemas.microsoft.com/office/word/2010/wordprocessingShape" mc:Ignorable="w14 w15 w16se w16cid w16 w16cex w16sdtdh w16sdtfl w16du wp14">
   <w:p>
     <w:pPr>
       <w:pStyle w:val="a5"/>
@@ -7740,7 +7326,7 @@
 </file>
 
 <file path=word/footer2.xml><?xml version="1.0" encoding="utf-8"?>
-<w:ftr xmlns:wpc="http://schemas.microsoft.com/office/word/2010/wordprocessingCanvas" xmlns:cx="http://schemas.microsoft.com/office/drawing/2014/chartex" xmlns:cx1="http://schemas.microsoft.com/office/drawing/2015/9/8/chartex" xmlns:cx2="http://schemas.microsoft.com/office/drawing/2015/10/21/chartex" xmlns:cx3="http://schemas.microsoft.com/office/drawing/2016/5/9/chartex" xmlns:cx4="http://schemas.microsoft.com/office/drawing/2016/5/10/chartex" xmlns:cx5="http://schemas.microsoft.com/office/drawing/2016/5/11/chartex" xmlns:cx6="http://schemas.microsoft.com/office/drawing/2016/5/12/chartex" xmlns:cx7="http://schemas.microsoft.com/office/drawing/2016/5/13/chartex" xmlns:cx8="http://schemas.microsoft.com/office/drawing/2016/5/14/chartex" xmlns:mc="http://schemas.openxmlformats.org/markup-compatibility/2006" xmlns:m="http://schemas.openxmlformats.org/officeDocument/2006/math" xmlns:aink="http://schemas.microsoft.com/office/drawing/2016/ink" xmlns:am3d="http://schemas.microsoft.com/office/drawing/2017/model3d" xmlns:oel="http://schemas.microsoft.com/office/2019/extlst" xmlns:r="http://schemas.openxmlformats.org/officeDocument/2006/relationships" xmlns:wp14="http://schemas.microsoft.com/office/word/2010/wordprocessingDrawing" xmlns:wp="http://schemas.openxmlformats.org/drawingml/2006/wordprocessingDrawing" xmlns:wpg="http://schemas.microsoft.com/office/word/2010/wordprocessingGroup" xmlns:wpi="http://schemas.microsoft.com/office/word/2010/wordprocessingInk" xmlns:wps="http://schemas.microsoft.com/office/word/2010/wordprocessingShape" xmlns:o="urn:schemas-microsoft-com:office:office" xmlns:v="urn:schemas-microsoft-com:vml" xmlns:w10="urn:schemas-microsoft-com:office:word" xmlns:w="http://schemas.openxmlformats.org/wordprocessingml/2006/main" xmlns:w14="http://schemas.microsoft.com/office/word/2010/wordml" xmlns:w15="http://schemas.microsoft.com/office/word/2012/wordml" xmlns:w16cex="http://schemas.microsoft.com/office/word/2018/wordml/cex" xmlns:w16cid="http://schemas.microsoft.com/office/word/2016/wordml/cid" xmlns:w16="http://schemas.microsoft.com/office/word/2018/wordml" xmlns:w16sdtdh="http://schemas.microsoft.com/office/word/2020/wordml/sdtdatahash" xmlns:w16sdtfl="http://schemas.microsoft.com/office/word/2024/wordml/sdtformatlock" xmlns:w16se="http://schemas.microsoft.com/office/word/2015/wordml/symex" xmlns:w16du="http://schemas.microsoft.com/office/word/2023/wordml/word16du" xmlns:wne="http://schemas.microsoft.com/office/word/2006/wordml" mc:Ignorable="w14 w15 w16se w16cid w16 w16cex w16sdtdh w16sdtfl w16du wp14">
+<w:ftr xmlns:wpc="http://schemas.microsoft.com/office/word/2010/wordprocessingCanvas" xmlns:cx="http://schemas.microsoft.com/office/drawing/2014/chartex" xmlns:cx1="http://schemas.microsoft.com/office/drawing/2015/9/8/chartex" xmlns:cx2="http://schemas.microsoft.com/office/drawing/2015/10/21/chartex" xmlns:cx3="http://schemas.microsoft.com/office/drawing/2016/5/9/chartex" xmlns:cx4="http://schemas.microsoft.com/office/drawing/2016/5/10/chartex" xmlns:cx5="http://schemas.microsoft.com/office/drawing/2016/5/11/chartex" xmlns:cx6="http://schemas.microsoft.com/office/drawing/2016/5/12/chartex" xmlns:cx7="http://schemas.microsoft.com/office/drawing/2016/5/13/chartex" xmlns:cx8="http://schemas.microsoft.com/office/drawing/2016/5/14/chartex" xmlns:mc="http://schemas.openxmlformats.org/markup-compatibility/2006" xmlns:aink="http://schemas.microsoft.com/office/drawing/2016/ink" xmlns:am3d="http://schemas.microsoft.com/office/drawing/2017/model3d" xmlns:o="urn:schemas-microsoft-com:office:office" xmlns:oel="http://schemas.microsoft.com/office/2019/extlst" xmlns:r="http://schemas.openxmlformats.org/officeDocument/2006/relationships" xmlns:m="http://schemas.openxmlformats.org/officeDocument/2006/math" xmlns:v="urn:schemas-microsoft-com:vml" xmlns:wp14="http://schemas.microsoft.com/office/word/2010/wordprocessingDrawing" xmlns:wp="http://schemas.openxmlformats.org/drawingml/2006/wordprocessingDrawing" xmlns:w10="urn:schemas-microsoft-com:office:word" xmlns:w="http://schemas.openxmlformats.org/wordprocessingml/2006/main" xmlns:w14="http://schemas.microsoft.com/office/word/2010/wordml" xmlns:w15="http://schemas.microsoft.com/office/word/2012/wordml" xmlns:w16cex="http://schemas.microsoft.com/office/word/2018/wordml/cex" xmlns:w16cid="http://schemas.microsoft.com/office/word/2016/wordml/cid" xmlns:w16="http://schemas.microsoft.com/office/word/2018/wordml" xmlns:w16du="http://schemas.microsoft.com/office/word/2023/wordml/word16du" xmlns:w16sdtdh="http://schemas.microsoft.com/office/word/2020/wordml/sdtdatahash" xmlns:w16sdtfl="http://schemas.microsoft.com/office/word/2024/wordml/sdtformatlock" xmlns:w16se="http://schemas.microsoft.com/office/word/2015/wordml/symex" xmlns:wpg="http://schemas.microsoft.com/office/word/2010/wordprocessingGroup" xmlns:wpi="http://schemas.microsoft.com/office/word/2010/wordprocessingInk" xmlns:wne="http://schemas.microsoft.com/office/word/2006/wordml" xmlns:wps="http://schemas.microsoft.com/office/word/2010/wordprocessingShape" mc:Ignorable="w14 w15 w16se w16cid w16 w16cex w16sdtdh w16sdtfl w16du wp14">
   <w:p>
     <w:pPr>
       <w:pStyle w:val="a5"/>
@@ -7791,7 +7377,7 @@
 </file>
 
 <file path=word/footer3.xml><?xml version="1.0" encoding="utf-8"?>
-<w:ftr xmlns:wpc="http://schemas.microsoft.com/office/word/2010/wordprocessingCanvas" xmlns:cx="http://schemas.microsoft.com/office/drawing/2014/chartex" xmlns:cx1="http://schemas.microsoft.com/office/drawing/2015/9/8/chartex" xmlns:cx2="http://schemas.microsoft.com/office/drawing/2015/10/21/chartex" xmlns:cx3="http://schemas.microsoft.com/office/drawing/2016/5/9/chartex" xmlns:cx4="http://schemas.microsoft.com/office/drawing/2016/5/10/chartex" xmlns:cx5="http://schemas.microsoft.com/office/drawing/2016/5/11/chartex" xmlns:cx6="http://schemas.microsoft.com/office/drawing/2016/5/12/chartex" xmlns:cx7="http://schemas.microsoft.com/office/drawing/2016/5/13/chartex" xmlns:cx8="http://schemas.microsoft.com/office/drawing/2016/5/14/chartex" xmlns:mc="http://schemas.openxmlformats.org/markup-compatibility/2006" xmlns:m="http://schemas.openxmlformats.org/officeDocument/2006/math" xmlns:aink="http://schemas.microsoft.com/office/drawing/2016/ink" xmlns:am3d="http://schemas.microsoft.com/office/drawing/2017/model3d" xmlns:oel="http://schemas.microsoft.com/office/2019/extlst" xmlns:r="http://schemas.openxmlformats.org/officeDocument/2006/relationships" xmlns:wp14="http://schemas.microsoft.com/office/word/2010/wordprocessingDrawing" xmlns:wp="http://schemas.openxmlformats.org/drawingml/2006/wordprocessingDrawing" xmlns:wpg="http://schemas.microsoft.com/office/word/2010/wordprocessingGroup" xmlns:wpi="http://schemas.microsoft.com/office/word/2010/wordprocessingInk" xmlns:wps="http://schemas.microsoft.com/office/word/2010/wordprocessingShape" xmlns:o="urn:schemas-microsoft-com:office:office" xmlns:v="urn:schemas-microsoft-com:vml" xmlns:w10="urn:schemas-microsoft-com:office:word" xmlns:w="http://schemas.openxmlformats.org/wordprocessingml/2006/main" xmlns:w14="http://schemas.microsoft.com/office/word/2010/wordml" xmlns:w15="http://schemas.microsoft.com/office/word/2012/wordml" xmlns:w16cex="http://schemas.microsoft.com/office/word/2018/wordml/cex" xmlns:w16cid="http://schemas.microsoft.com/office/word/2016/wordml/cid" xmlns:w16="http://schemas.microsoft.com/office/word/2018/wordml" xmlns:w16sdtdh="http://schemas.microsoft.com/office/word/2020/wordml/sdtdatahash" xmlns:w16sdtfl="http://schemas.microsoft.com/office/word/2024/wordml/sdtformatlock" xmlns:w16se="http://schemas.microsoft.com/office/word/2015/wordml/symex" xmlns:w16du="http://schemas.microsoft.com/office/word/2023/wordml/word16du" xmlns:wne="http://schemas.microsoft.com/office/word/2006/wordml" mc:Ignorable="w14 w15 w16se w16cid w16 w16cex w16sdtdh w16sdtfl w16du wp14">
+<w:ftr xmlns:wpc="http://schemas.microsoft.com/office/word/2010/wordprocessingCanvas" xmlns:cx="http://schemas.microsoft.com/office/drawing/2014/chartex" xmlns:cx1="http://schemas.microsoft.com/office/drawing/2015/9/8/chartex" xmlns:cx2="http://schemas.microsoft.com/office/drawing/2015/10/21/chartex" xmlns:cx3="http://schemas.microsoft.com/office/drawing/2016/5/9/chartex" xmlns:cx4="http://schemas.microsoft.com/office/drawing/2016/5/10/chartex" xmlns:cx5="http://schemas.microsoft.com/office/drawing/2016/5/11/chartex" xmlns:cx6="http://schemas.microsoft.com/office/drawing/2016/5/12/chartex" xmlns:cx7="http://schemas.microsoft.com/office/drawing/2016/5/13/chartex" xmlns:cx8="http://schemas.microsoft.com/office/drawing/2016/5/14/chartex" xmlns:mc="http://schemas.openxmlformats.org/markup-compatibility/2006" xmlns:aink="http://schemas.microsoft.com/office/drawing/2016/ink" xmlns:am3d="http://schemas.microsoft.com/office/drawing/2017/model3d" xmlns:o="urn:schemas-microsoft-com:office:office" xmlns:oel="http://schemas.microsoft.com/office/2019/extlst" xmlns:r="http://schemas.openxmlformats.org/officeDocument/2006/relationships" xmlns:m="http://schemas.openxmlformats.org/officeDocument/2006/math" xmlns:v="urn:schemas-microsoft-com:vml" xmlns:wp14="http://schemas.microsoft.com/office/word/2010/wordprocessingDrawing" xmlns:wp="http://schemas.openxmlformats.org/drawingml/2006/wordprocessingDrawing" xmlns:w10="urn:schemas-microsoft-com:office:word" xmlns:w="http://schemas.openxmlformats.org/wordprocessingml/2006/main" xmlns:w14="http://schemas.microsoft.com/office/word/2010/wordml" xmlns:w15="http://schemas.microsoft.com/office/word/2012/wordml" xmlns:w16cex="http://schemas.microsoft.com/office/word/2018/wordml/cex" xmlns:w16cid="http://schemas.microsoft.com/office/word/2016/wordml/cid" xmlns:w16="http://schemas.microsoft.com/office/word/2018/wordml" xmlns:w16du="http://schemas.microsoft.com/office/word/2023/wordml/word16du" xmlns:w16sdtdh="http://schemas.microsoft.com/office/word/2020/wordml/sdtdatahash" xmlns:w16sdtfl="http://schemas.microsoft.com/office/word/2024/wordml/sdtformatlock" xmlns:w16se="http://schemas.microsoft.com/office/word/2015/wordml/symex" xmlns:wpg="http://schemas.microsoft.com/office/word/2010/wordprocessingGroup" xmlns:wpi="http://schemas.microsoft.com/office/word/2010/wordprocessingInk" xmlns:wne="http://schemas.microsoft.com/office/word/2006/wordml" xmlns:wps="http://schemas.microsoft.com/office/word/2010/wordprocessingShape" mc:Ignorable="w14 w15 w16se w16cid w16 w16cex w16sdtdh w16sdtfl w16du wp14">
   <w:p>
     <w:pPr>
       <w:pStyle w:val="a5"/>
@@ -7935,7 +7521,7 @@
 </file>
 
 <file path=word/footer4.xml><?xml version="1.0" encoding="utf-8"?>
-<w:ftr xmlns:wpc="http://schemas.microsoft.com/office/word/2010/wordprocessingCanvas" xmlns:cx="http://schemas.microsoft.com/office/drawing/2014/chartex" xmlns:cx1="http://schemas.microsoft.com/office/drawing/2015/9/8/chartex" xmlns:cx2="http://schemas.microsoft.com/office/drawing/2015/10/21/chartex" xmlns:cx3="http://schemas.microsoft.com/office/drawing/2016/5/9/chartex" xmlns:cx4="http://schemas.microsoft.com/office/drawing/2016/5/10/chartex" xmlns:cx5="http://schemas.microsoft.com/office/drawing/2016/5/11/chartex" xmlns:cx6="http://schemas.microsoft.com/office/drawing/2016/5/12/chartex" xmlns:cx7="http://schemas.microsoft.com/office/drawing/2016/5/13/chartex" xmlns:cx8="http://schemas.microsoft.com/office/drawing/2016/5/14/chartex" xmlns:mc="http://schemas.openxmlformats.org/markup-compatibility/2006" xmlns:m="http://schemas.openxmlformats.org/officeDocument/2006/math" xmlns:aink="http://schemas.microsoft.com/office/drawing/2016/ink" xmlns:am3d="http://schemas.microsoft.com/office/drawing/2017/model3d" xmlns:oel="http://schemas.microsoft.com/office/2019/extlst" xmlns:r="http://schemas.openxmlformats.org/officeDocument/2006/relationships" xmlns:wp14="http://schemas.microsoft.com/office/word/2010/wordprocessingDrawing" xmlns:wp="http://schemas.openxmlformats.org/drawingml/2006/wordprocessingDrawing" xmlns:wpg="http://schemas.microsoft.com/office/word/2010/wordprocessingGroup" xmlns:wpi="http://schemas.microsoft.com/office/word/2010/wordprocessingInk" xmlns:wps="http://schemas.microsoft.com/office/word/2010/wordprocessingShape" xmlns:o="urn:schemas-microsoft-com:office:office" xmlns:v="urn:schemas-microsoft-com:vml" xmlns:w10="urn:schemas-microsoft-com:office:word" xmlns:w="http://schemas.openxmlformats.org/wordprocessingml/2006/main" xmlns:w14="http://schemas.microsoft.com/office/word/2010/wordml" xmlns:w15="http://schemas.microsoft.com/office/word/2012/wordml" xmlns:w16cex="http://schemas.microsoft.com/office/word/2018/wordml/cex" xmlns:w16cid="http://schemas.microsoft.com/office/word/2016/wordml/cid" xmlns:w16="http://schemas.microsoft.com/office/word/2018/wordml" xmlns:w16sdtdh="http://schemas.microsoft.com/office/word/2020/wordml/sdtdatahash" xmlns:w16sdtfl="http://schemas.microsoft.com/office/word/2024/wordml/sdtformatlock" xmlns:w16se="http://schemas.microsoft.com/office/word/2015/wordml/symex" xmlns:w16du="http://schemas.microsoft.com/office/word/2023/wordml/word16du" xmlns:wne="http://schemas.microsoft.com/office/word/2006/wordml" mc:Ignorable="w14 w15 w16se w16cid w16 w16cex w16sdtdh w16sdtfl w16du wp14">
+<w:ftr xmlns:wpc="http://schemas.microsoft.com/office/word/2010/wordprocessingCanvas" xmlns:cx="http://schemas.microsoft.com/office/drawing/2014/chartex" xmlns:cx1="http://schemas.microsoft.com/office/drawing/2015/9/8/chartex" xmlns:cx2="http://schemas.microsoft.com/office/drawing/2015/10/21/chartex" xmlns:cx3="http://schemas.microsoft.com/office/drawing/2016/5/9/chartex" xmlns:cx4="http://schemas.microsoft.com/office/drawing/2016/5/10/chartex" xmlns:cx5="http://schemas.microsoft.com/office/drawing/2016/5/11/chartex" xmlns:cx6="http://schemas.microsoft.com/office/drawing/2016/5/12/chartex" xmlns:cx7="http://schemas.microsoft.com/office/drawing/2016/5/13/chartex" xmlns:cx8="http://schemas.microsoft.com/office/drawing/2016/5/14/chartex" xmlns:mc="http://schemas.openxmlformats.org/markup-compatibility/2006" xmlns:aink="http://schemas.microsoft.com/office/drawing/2016/ink" xmlns:am3d="http://schemas.microsoft.com/office/drawing/2017/model3d" xmlns:o="urn:schemas-microsoft-com:office:office" xmlns:oel="http://schemas.microsoft.com/office/2019/extlst" xmlns:r="http://schemas.openxmlformats.org/officeDocument/2006/relationships" xmlns:m="http://schemas.openxmlformats.org/officeDocument/2006/math" xmlns:v="urn:schemas-microsoft-com:vml" xmlns:wp14="http://schemas.microsoft.com/office/word/2010/wordprocessingDrawing" xmlns:wp="http://schemas.openxmlformats.org/drawingml/2006/wordprocessingDrawing" xmlns:w10="urn:schemas-microsoft-com:office:word" xmlns:w="http://schemas.openxmlformats.org/wordprocessingml/2006/main" xmlns:w14="http://schemas.microsoft.com/office/word/2010/wordml" xmlns:w15="http://schemas.microsoft.com/office/word/2012/wordml" xmlns:w16cex="http://schemas.microsoft.com/office/word/2018/wordml/cex" xmlns:w16cid="http://schemas.microsoft.com/office/word/2016/wordml/cid" xmlns:w16="http://schemas.microsoft.com/office/word/2018/wordml" xmlns:w16du="http://schemas.microsoft.com/office/word/2023/wordml/word16du" xmlns:w16sdtdh="http://schemas.microsoft.com/office/word/2020/wordml/sdtdatahash" xmlns:w16sdtfl="http://schemas.microsoft.com/office/word/2024/wordml/sdtformatlock" xmlns:w16se="http://schemas.microsoft.com/office/word/2015/wordml/symex" xmlns:wpg="http://schemas.microsoft.com/office/word/2010/wordprocessingGroup" xmlns:wpi="http://schemas.microsoft.com/office/word/2010/wordprocessingInk" xmlns:wne="http://schemas.microsoft.com/office/word/2006/wordml" xmlns:wps="http://schemas.microsoft.com/office/word/2010/wordprocessingShape" mc:Ignorable="w14 w15 w16se w16cid w16 w16cex w16sdtdh w16sdtfl w16du wp14">
   <w:p>
     <w:pPr>
       <w:pStyle w:val="a5"/>
@@ -7986,7 +7572,7 @@
 </file>
 
 <file path=word/footer5.xml><?xml version="1.0" encoding="utf-8"?>
-<w:ftr xmlns:wpc="http://schemas.microsoft.com/office/word/2010/wordprocessingCanvas" xmlns:cx="http://schemas.microsoft.com/office/drawing/2014/chartex" xmlns:cx1="http://schemas.microsoft.com/office/drawing/2015/9/8/chartex" xmlns:cx2="http://schemas.microsoft.com/office/drawing/2015/10/21/chartex" xmlns:cx3="http://schemas.microsoft.com/office/drawing/2016/5/9/chartex" xmlns:cx4="http://schemas.microsoft.com/office/drawing/2016/5/10/chartex" xmlns:cx5="http://schemas.microsoft.com/office/drawing/2016/5/11/chartex" xmlns:cx6="http://schemas.microsoft.com/office/drawing/2016/5/12/chartex" xmlns:cx7="http://schemas.microsoft.com/office/drawing/2016/5/13/chartex" xmlns:cx8="http://schemas.microsoft.com/office/drawing/2016/5/14/chartex" xmlns:mc="http://schemas.openxmlformats.org/markup-compatibility/2006" xmlns:m="http://schemas.openxmlformats.org/officeDocument/2006/math" xmlns:aink="http://schemas.microsoft.com/office/drawing/2016/ink" xmlns:am3d="http://schemas.microsoft.com/office/drawing/2017/model3d" xmlns:oel="http://schemas.microsoft.com/office/2019/extlst" xmlns:r="http://schemas.openxmlformats.org/officeDocument/2006/relationships" xmlns:wp14="http://schemas.microsoft.com/office/word/2010/wordprocessingDrawing" xmlns:wp="http://schemas.openxmlformats.org/drawingml/2006/wordprocessingDrawing" xmlns:wpg="http://schemas.microsoft.com/office/word/2010/wordprocessingGroup" xmlns:wpi="http://schemas.microsoft.com/office/word/2010/wordprocessingInk" xmlns:wps="http://schemas.microsoft.com/office/word/2010/wordprocessingShape" xmlns:o="urn:schemas-microsoft-com:office:office" xmlns:v="urn:schemas-microsoft-com:vml" xmlns:w10="urn:schemas-microsoft-com:office:word" xmlns:w="http://schemas.openxmlformats.org/wordprocessingml/2006/main" xmlns:w14="http://schemas.microsoft.com/office/word/2010/wordml" xmlns:w15="http://schemas.microsoft.com/office/word/2012/wordml" xmlns:w16cex="http://schemas.microsoft.com/office/word/2018/wordml/cex" xmlns:w16cid="http://schemas.microsoft.com/office/word/2016/wordml/cid" xmlns:w16="http://schemas.microsoft.com/office/word/2018/wordml" xmlns:w16sdtdh="http://schemas.microsoft.com/office/word/2020/wordml/sdtdatahash" xmlns:w16sdtfl="http://schemas.microsoft.com/office/word/2024/wordml/sdtformatlock" xmlns:w16se="http://schemas.microsoft.com/office/word/2015/wordml/symex" xmlns:w16du="http://schemas.microsoft.com/office/word/2023/wordml/word16du" xmlns:wne="http://schemas.microsoft.com/office/word/2006/wordml" mc:Ignorable="w14 w15 w16se w16cid w16 w16cex w16sdtdh w16sdtfl w16du wp14">
+<w:ftr xmlns:wpc="http://schemas.microsoft.com/office/word/2010/wordprocessingCanvas" xmlns:cx="http://schemas.microsoft.com/office/drawing/2014/chartex" xmlns:cx1="http://schemas.microsoft.com/office/drawing/2015/9/8/chartex" xmlns:cx2="http://schemas.microsoft.com/office/drawing/2015/10/21/chartex" xmlns:cx3="http://schemas.microsoft.com/office/drawing/2016/5/9/chartex" xmlns:cx4="http://schemas.microsoft.com/office/drawing/2016/5/10/chartex" xmlns:cx5="http://schemas.microsoft.com/office/drawing/2016/5/11/chartex" xmlns:cx6="http://schemas.microsoft.com/office/drawing/2016/5/12/chartex" xmlns:cx7="http://schemas.microsoft.com/office/drawing/2016/5/13/chartex" xmlns:cx8="http://schemas.microsoft.com/office/drawing/2016/5/14/chartex" xmlns:mc="http://schemas.openxmlformats.org/markup-compatibility/2006" xmlns:aink="http://schemas.microsoft.com/office/drawing/2016/ink" xmlns:am3d="http://schemas.microsoft.com/office/drawing/2017/model3d" xmlns:o="urn:schemas-microsoft-com:office:office" xmlns:oel="http://schemas.microsoft.com/office/2019/extlst" xmlns:r="http://schemas.openxmlformats.org/officeDocument/2006/relationships" xmlns:m="http://schemas.openxmlformats.org/officeDocument/2006/math" xmlns:v="urn:schemas-microsoft-com:vml" xmlns:wp14="http://schemas.microsoft.com/office/word/2010/wordprocessingDrawing" xmlns:wp="http://schemas.openxmlformats.org/drawingml/2006/wordprocessingDrawing" xmlns:w10="urn:schemas-microsoft-com:office:word" xmlns:w="http://schemas.openxmlformats.org/wordprocessingml/2006/main" xmlns:w14="http://schemas.microsoft.com/office/word/2010/wordml" xmlns:w15="http://schemas.microsoft.com/office/word/2012/wordml" xmlns:w16cex="http://schemas.microsoft.com/office/word/2018/wordml/cex" xmlns:w16cid="http://schemas.microsoft.com/office/word/2016/wordml/cid" xmlns:w16="http://schemas.microsoft.com/office/word/2018/wordml" xmlns:w16du="http://schemas.microsoft.com/office/word/2023/wordml/word16du" xmlns:w16sdtdh="http://schemas.microsoft.com/office/word/2020/wordml/sdtdatahash" xmlns:w16sdtfl="http://schemas.microsoft.com/office/word/2024/wordml/sdtformatlock" xmlns:w16se="http://schemas.microsoft.com/office/word/2015/wordml/symex" xmlns:wpg="http://schemas.microsoft.com/office/word/2010/wordprocessingGroup" xmlns:wpi="http://schemas.microsoft.com/office/word/2010/wordprocessingInk" xmlns:wne="http://schemas.microsoft.com/office/word/2006/wordml" xmlns:wps="http://schemas.microsoft.com/office/word/2010/wordprocessingShape" mc:Ignorable="w14 w15 w16se w16cid w16 w16cex w16sdtdh w16sdtfl w16du wp14">
   <w:p>
     <w:pPr>
       <w:pStyle w:val="a5"/>
@@ -8037,7 +7623,7 @@
 </file>
 
 <file path=word/footer6.xml><?xml version="1.0" encoding="utf-8"?>
-<w:ftr xmlns:wpc="http://schemas.microsoft.com/office/word/2010/wordprocessingCanvas" xmlns:cx="http://schemas.microsoft.com/office/drawing/2014/chartex" xmlns:cx1="http://schemas.microsoft.com/office/drawing/2015/9/8/chartex" xmlns:cx2="http://schemas.microsoft.com/office/drawing/2015/10/21/chartex" xmlns:cx3="http://schemas.microsoft.com/office/drawing/2016/5/9/chartex" xmlns:cx4="http://schemas.microsoft.com/office/drawing/2016/5/10/chartex" xmlns:cx5="http://schemas.microsoft.com/office/drawing/2016/5/11/chartex" xmlns:cx6="http://schemas.microsoft.com/office/drawing/2016/5/12/chartex" xmlns:cx7="http://schemas.microsoft.com/office/drawing/2016/5/13/chartex" xmlns:cx8="http://schemas.microsoft.com/office/drawing/2016/5/14/chartex" xmlns:mc="http://schemas.openxmlformats.org/markup-compatibility/2006" xmlns:m="http://schemas.openxmlformats.org/officeDocument/2006/math" xmlns:aink="http://schemas.microsoft.com/office/drawing/2016/ink" xmlns:am3d="http://schemas.microsoft.com/office/drawing/2017/model3d" xmlns:oel="http://schemas.microsoft.com/office/2019/extlst" xmlns:r="http://schemas.openxmlformats.org/officeDocument/2006/relationships" xmlns:wp14="http://schemas.microsoft.com/office/word/2010/wordprocessingDrawing" xmlns:wp="http://schemas.openxmlformats.org/drawingml/2006/wordprocessingDrawing" xmlns:wpg="http://schemas.microsoft.com/office/word/2010/wordprocessingGroup" xmlns:wpi="http://schemas.microsoft.com/office/word/2010/wordprocessingInk" xmlns:wps="http://schemas.microsoft.com/office/word/2010/wordprocessingShape" xmlns:o="urn:schemas-microsoft-com:office:office" xmlns:v="urn:schemas-microsoft-com:vml" xmlns:w10="urn:schemas-microsoft-com:office:word" xmlns:w="http://schemas.openxmlformats.org/wordprocessingml/2006/main" xmlns:w14="http://schemas.microsoft.com/office/word/2010/wordml" xmlns:w15="http://schemas.microsoft.com/office/word/2012/wordml" xmlns:w16cex="http://schemas.microsoft.com/office/word/2018/wordml/cex" xmlns:w16cid="http://schemas.microsoft.com/office/word/2016/wordml/cid" xmlns:w16="http://schemas.microsoft.com/office/word/2018/wordml" xmlns:w16sdtdh="http://schemas.microsoft.com/office/word/2020/wordml/sdtdatahash" xmlns:w16sdtfl="http://schemas.microsoft.com/office/word/2024/wordml/sdtformatlock" xmlns:w16se="http://schemas.microsoft.com/office/word/2015/wordml/symex" xmlns:w16du="http://schemas.microsoft.com/office/word/2023/wordml/word16du" xmlns:wne="http://schemas.microsoft.com/office/word/2006/wordml" mc:Ignorable="w14 w15 w16se w16cid w16 w16cex w16sdtdh w16sdtfl w16du wp14">
+<w:ftr xmlns:wpc="http://schemas.microsoft.com/office/word/2010/wordprocessingCanvas" xmlns:cx="http://schemas.microsoft.com/office/drawing/2014/chartex" xmlns:cx1="http://schemas.microsoft.com/office/drawing/2015/9/8/chartex" xmlns:cx2="http://schemas.microsoft.com/office/drawing/2015/10/21/chartex" xmlns:cx3="http://schemas.microsoft.com/office/drawing/2016/5/9/chartex" xmlns:cx4="http://schemas.microsoft.com/office/drawing/2016/5/10/chartex" xmlns:cx5="http://schemas.microsoft.com/office/drawing/2016/5/11/chartex" xmlns:cx6="http://schemas.microsoft.com/office/drawing/2016/5/12/chartex" xmlns:cx7="http://schemas.microsoft.com/office/drawing/2016/5/13/chartex" xmlns:cx8="http://schemas.microsoft.com/office/drawing/2016/5/14/chartex" xmlns:mc="http://schemas.openxmlformats.org/markup-compatibility/2006" xmlns:aink="http://schemas.microsoft.com/office/drawing/2016/ink" xmlns:am3d="http://schemas.microsoft.com/office/drawing/2017/model3d" xmlns:o="urn:schemas-microsoft-com:office:office" xmlns:oel="http://schemas.microsoft.com/office/2019/extlst" xmlns:r="http://schemas.openxmlformats.org/officeDocument/2006/relationships" xmlns:m="http://schemas.openxmlformats.org/officeDocument/2006/math" xmlns:v="urn:schemas-microsoft-com:vml" xmlns:wp14="http://schemas.microsoft.com/office/word/2010/wordprocessingDrawing" xmlns:wp="http://schemas.openxmlformats.org/drawingml/2006/wordprocessingDrawing" xmlns:w10="urn:schemas-microsoft-com:office:word" xmlns:w="http://schemas.openxmlformats.org/wordprocessingml/2006/main" xmlns:w14="http://schemas.microsoft.com/office/word/2010/wordml" xmlns:w15="http://schemas.microsoft.com/office/word/2012/wordml" xmlns:w16cex="http://schemas.microsoft.com/office/word/2018/wordml/cex" xmlns:w16cid="http://schemas.microsoft.com/office/word/2016/wordml/cid" xmlns:w16="http://schemas.microsoft.com/office/word/2018/wordml" xmlns:w16du="http://schemas.microsoft.com/office/word/2023/wordml/word16du" xmlns:w16sdtdh="http://schemas.microsoft.com/office/word/2020/wordml/sdtdatahash" xmlns:w16sdtfl="http://schemas.microsoft.com/office/word/2024/wordml/sdtformatlock" xmlns:w16se="http://schemas.microsoft.com/office/word/2015/wordml/symex" xmlns:wpg="http://schemas.microsoft.com/office/word/2010/wordprocessingGroup" xmlns:wpi="http://schemas.microsoft.com/office/word/2010/wordprocessingInk" xmlns:wne="http://schemas.microsoft.com/office/word/2006/wordml" xmlns:wps="http://schemas.microsoft.com/office/word/2010/wordprocessingShape" mc:Ignorable="w14 w15 w16se w16cid w16 w16cex w16sdtdh w16sdtfl w16du wp14">
   <w:p>
     <w:pPr>
       <w:pStyle w:val="a5"/>
@@ -8088,7 +7674,7 @@
 </file>
 
 <file path=word/footer7.xml><?xml version="1.0" encoding="utf-8"?>
-<w:ftr xmlns:wpc="http://schemas.microsoft.com/office/word/2010/wordprocessingCanvas" xmlns:cx="http://schemas.microsoft.com/office/drawing/2014/chartex" xmlns:cx1="http://schemas.microsoft.com/office/drawing/2015/9/8/chartex" xmlns:cx2="http://schemas.microsoft.com/office/drawing/2015/10/21/chartex" xmlns:cx3="http://schemas.microsoft.com/office/drawing/2016/5/9/chartex" xmlns:cx4="http://schemas.microsoft.com/office/drawing/2016/5/10/chartex" xmlns:cx5="http://schemas.microsoft.com/office/drawing/2016/5/11/chartex" xmlns:cx6="http://schemas.microsoft.com/office/drawing/2016/5/12/chartex" xmlns:cx7="http://schemas.microsoft.com/office/drawing/2016/5/13/chartex" xmlns:cx8="http://schemas.microsoft.com/office/drawing/2016/5/14/chartex" xmlns:mc="http://schemas.openxmlformats.org/markup-compatibility/2006" xmlns:m="http://schemas.openxmlformats.org/officeDocument/2006/math" xmlns:aink="http://schemas.microsoft.com/office/drawing/2016/ink" xmlns:am3d="http://schemas.microsoft.com/office/drawing/2017/model3d" xmlns:oel="http://schemas.microsoft.com/office/2019/extlst" xmlns:r="http://schemas.openxmlformats.org/officeDocument/2006/relationships" xmlns:wp14="http://schemas.microsoft.com/office/word/2010/wordprocessingDrawing" xmlns:wp="http://schemas.openxmlformats.org/drawingml/2006/wordprocessingDrawing" xmlns:wpg="http://schemas.microsoft.com/office/word/2010/wordprocessingGroup" xmlns:wpi="http://schemas.microsoft.com/office/word/2010/wordprocessingInk" xmlns:wps="http://schemas.microsoft.com/office/word/2010/wordprocessingShape" xmlns:o="urn:schemas-microsoft-com:office:office" xmlns:v="urn:schemas-microsoft-com:vml" xmlns:w10="urn:schemas-microsoft-com:office:word" xmlns:w="http://schemas.openxmlformats.org/wordprocessingml/2006/main" xmlns:w14="http://schemas.microsoft.com/office/word/2010/wordml" xmlns:w15="http://schemas.microsoft.com/office/word/2012/wordml" xmlns:w16cex="http://schemas.microsoft.com/office/word/2018/wordml/cex" xmlns:w16cid="http://schemas.microsoft.com/office/word/2016/wordml/cid" xmlns:w16="http://schemas.microsoft.com/office/word/2018/wordml" xmlns:w16sdtdh="http://schemas.microsoft.com/office/word/2020/wordml/sdtdatahash" xmlns:w16sdtfl="http://schemas.microsoft.com/office/word/2024/wordml/sdtformatlock" xmlns:w16se="http://schemas.microsoft.com/office/word/2015/wordml/symex" xmlns:w16du="http://schemas.microsoft.com/office/word/2023/wordml/word16du" xmlns:wne="http://schemas.microsoft.com/office/word/2006/wordml" mc:Ignorable="w14 w15 w16se w16cid w16 w16cex w16sdtdh w16sdtfl w16du wp14">
+<w:ftr xmlns:wpc="http://schemas.microsoft.com/office/word/2010/wordprocessingCanvas" xmlns:cx="http://schemas.microsoft.com/office/drawing/2014/chartex" xmlns:cx1="http://schemas.microsoft.com/office/drawing/2015/9/8/chartex" xmlns:cx2="http://schemas.microsoft.com/office/drawing/2015/10/21/chartex" xmlns:cx3="http://schemas.microsoft.com/office/drawing/2016/5/9/chartex" xmlns:cx4="http://schemas.microsoft.com/office/drawing/2016/5/10/chartex" xmlns:cx5="http://schemas.microsoft.com/office/drawing/2016/5/11/chartex" xmlns:cx6="http://schemas.microsoft.com/office/drawing/2016/5/12/chartex" xmlns:cx7="http://schemas.microsoft.com/office/drawing/2016/5/13/chartex" xmlns:cx8="http://schemas.microsoft.com/office/drawing/2016/5/14/chartex" xmlns:mc="http://schemas.openxmlformats.org/markup-compatibility/2006" xmlns:aink="http://schemas.microsoft.com/office/drawing/2016/ink" xmlns:am3d="http://schemas.microsoft.com/office/drawing/2017/model3d" xmlns:o="urn:schemas-microsoft-com:office:office" xmlns:oel="http://schemas.microsoft.com/office/2019/extlst" xmlns:r="http://schemas.openxmlformats.org/officeDocument/2006/relationships" xmlns:m="http://schemas.openxmlformats.org/officeDocument/2006/math" xmlns:v="urn:schemas-microsoft-com:vml" xmlns:wp14="http://schemas.microsoft.com/office/word/2010/wordprocessingDrawing" xmlns:wp="http://schemas.openxmlformats.org/drawingml/2006/wordprocessingDrawing" xmlns:w10="urn:schemas-microsoft-com:office:word" xmlns:w="http://schemas.openxmlformats.org/wordprocessingml/2006/main" xmlns:w14="http://schemas.microsoft.com/office/word/2010/wordml" xmlns:w15="http://schemas.microsoft.com/office/word/2012/wordml" xmlns:w16cex="http://schemas.microsoft.com/office/word/2018/wordml/cex" xmlns:w16cid="http://schemas.microsoft.com/office/word/2016/wordml/cid" xmlns:w16="http://schemas.microsoft.com/office/word/2018/wordml" xmlns:w16du="http://schemas.microsoft.com/office/word/2023/wordml/word16du" xmlns:w16sdtdh="http://schemas.microsoft.com/office/word/2020/wordml/sdtdatahash" xmlns:w16sdtfl="http://schemas.microsoft.com/office/word/2024/wordml/sdtformatlock" xmlns:w16se="http://schemas.microsoft.com/office/word/2015/wordml/symex" xmlns:wpg="http://schemas.microsoft.com/office/word/2010/wordprocessingGroup" xmlns:wpi="http://schemas.microsoft.com/office/word/2010/wordprocessingInk" xmlns:wne="http://schemas.microsoft.com/office/word/2006/wordml" xmlns:wps="http://schemas.microsoft.com/office/word/2010/wordprocessingShape" mc:Ignorable="w14 w15 w16se w16cid w16 w16cex w16sdtdh w16sdtfl w16du wp14">
   <w:p>
     <w:pPr>
       <w:pStyle w:val="a5"/>
@@ -8139,7 +7725,7 @@
 </file>
 
 <file path=word/footnotes.xml><?xml version="1.0" encoding="utf-8"?>
-<w:footnotes xmlns:wpc="http://schemas.microsoft.com/office/word/2010/wordprocessingCanvas" xmlns:cx="http://schemas.microsoft.com/office/drawing/2014/chartex" xmlns:cx1="http://schemas.microsoft.com/office/drawing/2015/9/8/chartex" xmlns:cx2="http://schemas.microsoft.com/office/drawing/2015/10/21/chartex" xmlns:cx3="http://schemas.microsoft.com/office/drawing/2016/5/9/chartex" xmlns:cx4="http://schemas.microsoft.com/office/drawing/2016/5/10/chartex" xmlns:cx5="http://schemas.microsoft.com/office/drawing/2016/5/11/chartex" xmlns:cx6="http://schemas.microsoft.com/office/drawing/2016/5/12/chartex" xmlns:cx7="http://schemas.microsoft.com/office/drawing/2016/5/13/chartex" xmlns:cx8="http://schemas.microsoft.com/office/drawing/2016/5/14/chartex" xmlns:mc="http://schemas.openxmlformats.org/markup-compatibility/2006" xmlns:m="http://schemas.openxmlformats.org/officeDocument/2006/math" xmlns:aink="http://schemas.microsoft.com/office/drawing/2016/ink" xmlns:am3d="http://schemas.microsoft.com/office/drawing/2017/model3d" xmlns:oel="http://schemas.microsoft.com/office/2019/extlst" xmlns:r="http://schemas.openxmlformats.org/officeDocument/2006/relationships" xmlns:wp14="http://schemas.microsoft.com/office/word/2010/wordprocessingDrawing" xmlns:wp="http://schemas.openxmlformats.org/drawingml/2006/wordprocessingDrawing" xmlns:wpg="http://schemas.microsoft.com/office/word/2010/wordprocessingGroup" xmlns:wpi="http://schemas.microsoft.com/office/word/2010/wordprocessingInk" xmlns:wps="http://schemas.microsoft.com/office/word/2010/wordprocessingShape" xmlns:o="urn:schemas-microsoft-com:office:office" xmlns:v="urn:schemas-microsoft-com:vml" xmlns:w10="urn:schemas-microsoft-com:office:word" xmlns:w="http://schemas.openxmlformats.org/wordprocessingml/2006/main" xmlns:w14="http://schemas.microsoft.com/office/word/2010/wordml" xmlns:w15="http://schemas.microsoft.com/office/word/2012/wordml" xmlns:w16cex="http://schemas.microsoft.com/office/word/2018/wordml/cex" xmlns:w16cid="http://schemas.microsoft.com/office/word/2016/wordml/cid" xmlns:w16="http://schemas.microsoft.com/office/word/2018/wordml" xmlns:w16sdtdh="http://schemas.microsoft.com/office/word/2020/wordml/sdtdatahash" xmlns:w16sdtfl="http://schemas.microsoft.com/office/word/2024/wordml/sdtformatlock" xmlns:w16se="http://schemas.microsoft.com/office/word/2015/wordml/symex" xmlns:w16du="http://schemas.microsoft.com/office/word/2023/wordml/word16du" xmlns:wne="http://schemas.microsoft.com/office/word/2006/wordml" mc:Ignorable="w14 w15 w16se w16cid w16 w16cex w16sdtdh w16sdtfl w16du wp14">
+<w:footnotes xmlns:wpc="http://schemas.microsoft.com/office/word/2010/wordprocessingCanvas" xmlns:cx="http://schemas.microsoft.com/office/drawing/2014/chartex" xmlns:cx1="http://schemas.microsoft.com/office/drawing/2015/9/8/chartex" xmlns:cx2="http://schemas.microsoft.com/office/drawing/2015/10/21/chartex" xmlns:cx3="http://schemas.microsoft.com/office/drawing/2016/5/9/chartex" xmlns:cx4="http://schemas.microsoft.com/office/drawing/2016/5/10/chartex" xmlns:cx5="http://schemas.microsoft.com/office/drawing/2016/5/11/chartex" xmlns:cx6="http://schemas.microsoft.com/office/drawing/2016/5/12/chartex" xmlns:cx7="http://schemas.microsoft.com/office/drawing/2016/5/13/chartex" xmlns:cx8="http://schemas.microsoft.com/office/drawing/2016/5/14/chartex" xmlns:mc="http://schemas.openxmlformats.org/markup-compatibility/2006" xmlns:aink="http://schemas.microsoft.com/office/drawing/2016/ink" xmlns:am3d="http://schemas.microsoft.com/office/drawing/2017/model3d" xmlns:o="urn:schemas-microsoft-com:office:office" xmlns:oel="http://schemas.microsoft.com/office/2019/extlst" xmlns:r="http://schemas.openxmlformats.org/officeDocument/2006/relationships" xmlns:m="http://schemas.openxmlformats.org/officeDocument/2006/math" xmlns:v="urn:schemas-microsoft-com:vml" xmlns:wp14="http://schemas.microsoft.com/office/word/2010/wordprocessingDrawing" xmlns:wp="http://schemas.openxmlformats.org/drawingml/2006/wordprocessingDrawing" xmlns:w10="urn:schemas-microsoft-com:office:word" xmlns:w="http://schemas.openxmlformats.org/wordprocessingml/2006/main" xmlns:w14="http://schemas.microsoft.com/office/word/2010/wordml" xmlns:w15="http://schemas.microsoft.com/office/word/2012/wordml" xmlns:w16cex="http://schemas.microsoft.com/office/word/2018/wordml/cex" xmlns:w16cid="http://schemas.microsoft.com/office/word/2016/wordml/cid" xmlns:w16="http://schemas.microsoft.com/office/word/2018/wordml" xmlns:w16du="http://schemas.microsoft.com/office/word/2023/wordml/word16du" xmlns:w16sdtdh="http://schemas.microsoft.com/office/word/2020/wordml/sdtdatahash" xmlns:w16sdtfl="http://schemas.microsoft.com/office/word/2024/wordml/sdtformatlock" xmlns:w16se="http://schemas.microsoft.com/office/word/2015/wordml/symex" xmlns:wpg="http://schemas.microsoft.com/office/word/2010/wordprocessingGroup" xmlns:wpi="http://schemas.microsoft.com/office/word/2010/wordprocessingInk" xmlns:wne="http://schemas.microsoft.com/office/word/2006/wordml" xmlns:wps="http://schemas.microsoft.com/office/word/2010/wordprocessingShape" mc:Ignorable="w14 w15 w16se w16cid w16 w16cex w16sdtdh w16sdtfl w16du wp14">
   <w:footnote w:type="separator" w:id="-1">
     <w:p>
       <w:pPr>
@@ -8166,7 +7752,7 @@
 </file>
 
 <file path=word/header1.xml><?xml version="1.0" encoding="utf-8"?>
-<w:hdr xmlns:wpc="http://schemas.microsoft.com/office/word/2010/wordprocessingCanvas" xmlns:cx="http://schemas.microsoft.com/office/drawing/2014/chartex" xmlns:cx1="http://schemas.microsoft.com/office/drawing/2015/9/8/chartex" xmlns:cx2="http://schemas.microsoft.com/office/drawing/2015/10/21/chartex" xmlns:cx3="http://schemas.microsoft.com/office/drawing/2016/5/9/chartex" xmlns:cx4="http://schemas.microsoft.com/office/drawing/2016/5/10/chartex" xmlns:cx5="http://schemas.microsoft.com/office/drawing/2016/5/11/chartex" xmlns:cx6="http://schemas.microsoft.com/office/drawing/2016/5/12/chartex" xmlns:cx7="http://schemas.microsoft.com/office/drawing/2016/5/13/chartex" xmlns:cx8="http://schemas.microsoft.com/office/drawing/2016/5/14/chartex" xmlns:mc="http://schemas.openxmlformats.org/markup-compatibility/2006" xmlns:m="http://schemas.openxmlformats.org/officeDocument/2006/math" xmlns:aink="http://schemas.microsoft.com/office/drawing/2016/ink" xmlns:am3d="http://schemas.microsoft.com/office/drawing/2017/model3d" xmlns:oel="http://schemas.microsoft.com/office/2019/extlst" xmlns:r="http://schemas.openxmlformats.org/officeDocument/2006/relationships" xmlns:wp14="http://schemas.microsoft.com/office/word/2010/wordprocessingDrawing" xmlns:wp="http://schemas.openxmlformats.org/drawingml/2006/wordprocessingDrawing" xmlns:wpg="http://schemas.microsoft.com/office/word/2010/wordprocessingGroup" xmlns:wpi="http://schemas.microsoft.com/office/word/2010/wordprocessingInk" xmlns:wps="http://schemas.microsoft.com/office/word/2010/wordprocessingShape" xmlns:o="urn:schemas-microsoft-com:office:office" xmlns:v="urn:schemas-microsoft-com:vml" xmlns:w10="urn:schemas-microsoft-com:office:word" xmlns:w="http://schemas.openxmlformats.org/wordprocessingml/2006/main" xmlns:w14="http://schemas.microsoft.com/office/word/2010/wordml" xmlns:w15="http://schemas.microsoft.com/office/word/2012/wordml" xmlns:w16cex="http://schemas.microsoft.com/office/word/2018/wordml/cex" xmlns:w16cid="http://schemas.microsoft.com/office/word/2016/wordml/cid" xmlns:w16="http://schemas.microsoft.com/office/word/2018/wordml" xmlns:w16sdtdh="http://schemas.microsoft.com/office/word/2020/wordml/sdtdatahash" xmlns:w16sdtfl="http://schemas.microsoft.com/office/word/2024/wordml/sdtformatlock" xmlns:w16se="http://schemas.microsoft.com/office/word/2015/wordml/symex" xmlns:w16du="http://schemas.microsoft.com/office/word/2023/wordml/word16du" xmlns:wne="http://schemas.microsoft.com/office/word/2006/wordml" mc:Ignorable="w14 w15 w16se w16cid w16 w16cex w16sdtdh w16sdtfl w16du wp14">
+<w:hdr xmlns:wpc="http://schemas.microsoft.com/office/word/2010/wordprocessingCanvas" xmlns:cx="http://schemas.microsoft.com/office/drawing/2014/chartex" xmlns:cx1="http://schemas.microsoft.com/office/drawing/2015/9/8/chartex" xmlns:cx2="http://schemas.microsoft.com/office/drawing/2015/10/21/chartex" xmlns:cx3="http://schemas.microsoft.com/office/drawing/2016/5/9/chartex" xmlns:cx4="http://schemas.microsoft.com/office/drawing/2016/5/10/chartex" xmlns:cx5="http://schemas.microsoft.com/office/drawing/2016/5/11/chartex" xmlns:cx6="http://schemas.microsoft.com/office/drawing/2016/5/12/chartex" xmlns:cx7="http://schemas.microsoft.com/office/drawing/2016/5/13/chartex" xmlns:cx8="http://schemas.microsoft.com/office/drawing/2016/5/14/chartex" xmlns:mc="http://schemas.openxmlformats.org/markup-compatibility/2006" xmlns:aink="http://schemas.microsoft.com/office/drawing/2016/ink" xmlns:am3d="http://schemas.microsoft.com/office/drawing/2017/model3d" xmlns:o="urn:schemas-microsoft-com:office:office" xmlns:oel="http://schemas.microsoft.com/office/2019/extlst" xmlns:r="http://schemas.openxmlformats.org/officeDocument/2006/relationships" xmlns:m="http://schemas.openxmlformats.org/officeDocument/2006/math" xmlns:v="urn:schemas-microsoft-com:vml" xmlns:wp14="http://schemas.microsoft.com/office/word/2010/wordprocessingDrawing" xmlns:wp="http://schemas.openxmlformats.org/drawingml/2006/wordprocessingDrawing" xmlns:w10="urn:schemas-microsoft-com:office:word" xmlns:w="http://schemas.openxmlformats.org/wordprocessingml/2006/main" xmlns:w14="http://schemas.microsoft.com/office/word/2010/wordml" xmlns:w15="http://schemas.microsoft.com/office/word/2012/wordml" xmlns:w16cex="http://schemas.microsoft.com/office/word/2018/wordml/cex" xmlns:w16cid="http://schemas.microsoft.com/office/word/2016/wordml/cid" xmlns:w16="http://schemas.microsoft.com/office/word/2018/wordml" xmlns:w16du="http://schemas.microsoft.com/office/word/2023/wordml/word16du" xmlns:w16sdtdh="http://schemas.microsoft.com/office/word/2020/wordml/sdtdatahash" xmlns:w16sdtfl="http://schemas.microsoft.com/office/word/2024/wordml/sdtformatlock" xmlns:w16se="http://schemas.microsoft.com/office/word/2015/wordml/symex" xmlns:wpg="http://schemas.microsoft.com/office/word/2010/wordprocessingGroup" xmlns:wpi="http://schemas.microsoft.com/office/word/2010/wordprocessingInk" xmlns:wne="http://schemas.microsoft.com/office/word/2006/wordml" xmlns:wps="http://schemas.microsoft.com/office/word/2010/wordprocessingShape" mc:Ignorable="w14 w15 w16se w16cid w16 w16cex w16sdtdh w16sdtfl w16du wp14">
   <w:p>
     <w:pPr>
       <w:pStyle w:val="a3"/>
@@ -8177,7 +7763,7 @@
 </file>
 
 <file path=word/header2.xml><?xml version="1.0" encoding="utf-8"?>
-<w:hdr xmlns:wpc="http://schemas.microsoft.com/office/word/2010/wordprocessingCanvas" xmlns:cx="http://schemas.microsoft.com/office/drawing/2014/chartex" xmlns:cx1="http://schemas.microsoft.com/office/drawing/2015/9/8/chartex" xmlns:cx2="http://schemas.microsoft.com/office/drawing/2015/10/21/chartex" xmlns:cx3="http://schemas.microsoft.com/office/drawing/2016/5/9/chartex" xmlns:cx4="http://schemas.microsoft.com/office/drawing/2016/5/10/chartex" xmlns:cx5="http://schemas.microsoft.com/office/drawing/2016/5/11/chartex" xmlns:cx6="http://schemas.microsoft.com/office/drawing/2016/5/12/chartex" xmlns:cx7="http://schemas.microsoft.com/office/drawing/2016/5/13/chartex" xmlns:cx8="http://schemas.microsoft.com/office/drawing/2016/5/14/chartex" xmlns:mc="http://schemas.openxmlformats.org/markup-compatibility/2006" xmlns:m="http://schemas.openxmlformats.org/officeDocument/2006/math" xmlns:aink="http://schemas.microsoft.com/office/drawing/2016/ink" xmlns:am3d="http://schemas.microsoft.com/office/drawing/2017/model3d" xmlns:oel="http://schemas.microsoft.com/office/2019/extlst" xmlns:r="http://schemas.openxmlformats.org/officeDocument/2006/relationships" xmlns:wp14="http://schemas.microsoft.com/office/word/2010/wordprocessingDrawing" xmlns:wp="http://schemas.openxmlformats.org/drawingml/2006/wordprocessingDrawing" xmlns:wpg="http://schemas.microsoft.com/office/word/2010/wordprocessingGroup" xmlns:wpi="http://schemas.microsoft.com/office/word/2010/wordprocessingInk" xmlns:wps="http://schemas.microsoft.com/office/word/2010/wordprocessingShape" xmlns:o="urn:schemas-microsoft-com:office:office" xmlns:v="urn:schemas-microsoft-com:vml" xmlns:w10="urn:schemas-microsoft-com:office:word" xmlns:w="http://schemas.openxmlformats.org/wordprocessingml/2006/main" xmlns:w14="http://schemas.microsoft.com/office/word/2010/wordml" xmlns:w15="http://schemas.microsoft.com/office/word/2012/wordml" xmlns:w16cex="http://schemas.microsoft.com/office/word/2018/wordml/cex" xmlns:w16cid="http://schemas.microsoft.com/office/word/2016/wordml/cid" xmlns:w16="http://schemas.microsoft.com/office/word/2018/wordml" xmlns:w16sdtdh="http://schemas.microsoft.com/office/word/2020/wordml/sdtdatahash" xmlns:w16sdtfl="http://schemas.microsoft.com/office/word/2024/wordml/sdtformatlock" xmlns:w16se="http://schemas.microsoft.com/office/word/2015/wordml/symex" xmlns:w16du="http://schemas.microsoft.com/office/word/2023/wordml/word16du" xmlns:wne="http://schemas.microsoft.com/office/word/2006/wordml" mc:Ignorable="w14 w15 w16se w16cid w16 w16cex w16sdtdh w16sdtfl w16du wp14">
+<w:hdr xmlns:wpc="http://schemas.microsoft.com/office/word/2010/wordprocessingCanvas" xmlns:cx="http://schemas.microsoft.com/office/drawing/2014/chartex" xmlns:cx1="http://schemas.microsoft.com/office/drawing/2015/9/8/chartex" xmlns:cx2="http://schemas.microsoft.com/office/drawing/2015/10/21/chartex" xmlns:cx3="http://schemas.microsoft.com/office/drawing/2016/5/9/chartex" xmlns:cx4="http://schemas.microsoft.com/office/drawing/2016/5/10/chartex" xmlns:cx5="http://schemas.microsoft.com/office/drawing/2016/5/11/chartex" xmlns:cx6="http://schemas.microsoft.com/office/drawing/2016/5/12/chartex" xmlns:cx7="http://schemas.microsoft.com/office/drawing/2016/5/13/chartex" xmlns:cx8="http://schemas.microsoft.com/office/drawing/2016/5/14/chartex" xmlns:mc="http://schemas.openxmlformats.org/markup-compatibility/2006" xmlns:aink="http://schemas.microsoft.com/office/drawing/2016/ink" xmlns:am3d="http://schemas.microsoft.com/office/drawing/2017/model3d" xmlns:o="urn:schemas-microsoft-com:office:office" xmlns:oel="http://schemas.microsoft.com/office/2019/extlst" xmlns:r="http://schemas.openxmlformats.org/officeDocument/2006/relationships" xmlns:m="http://schemas.openxmlformats.org/officeDocument/2006/math" xmlns:v="urn:schemas-microsoft-com:vml" xmlns:wp14="http://schemas.microsoft.com/office/word/2010/wordprocessingDrawing" xmlns:wp="http://schemas.openxmlformats.org/drawingml/2006/wordprocessingDrawing" xmlns:w10="urn:schemas-microsoft-com:office:word" xmlns:w="http://schemas.openxmlformats.org/wordprocessingml/2006/main" xmlns:w14="http://schemas.microsoft.com/office/word/2010/wordml" xmlns:w15="http://schemas.microsoft.com/office/word/2012/wordml" xmlns:w16cex="http://schemas.microsoft.com/office/word/2018/wordml/cex" xmlns:w16cid="http://schemas.microsoft.com/office/word/2016/wordml/cid" xmlns:w16="http://schemas.microsoft.com/office/word/2018/wordml" xmlns:w16du="http://schemas.microsoft.com/office/word/2023/wordml/word16du" xmlns:w16sdtdh="http://schemas.microsoft.com/office/word/2020/wordml/sdtdatahash" xmlns:w16sdtfl="http://schemas.microsoft.com/office/word/2024/wordml/sdtformatlock" xmlns:w16se="http://schemas.microsoft.com/office/word/2015/wordml/symex" xmlns:wpg="http://schemas.microsoft.com/office/word/2010/wordprocessingGroup" xmlns:wpi="http://schemas.microsoft.com/office/word/2010/wordprocessingInk" xmlns:wne="http://schemas.microsoft.com/office/word/2006/wordml" xmlns:wps="http://schemas.microsoft.com/office/word/2010/wordprocessingShape" mc:Ignorable="w14 w15 w16se w16cid w16 w16cex w16sdtdh w16sdtfl w16du wp14">
   <w:p>
     <w:pPr>
       <w:pBdr>
@@ -8205,7 +7791,7 @@
 </file>
 
 <file path=word/header3.xml><?xml version="1.0" encoding="utf-8"?>
-<w:hdr xmlns:wpc="http://schemas.microsoft.com/office/word/2010/wordprocessingCanvas" xmlns:cx="http://schemas.microsoft.com/office/drawing/2014/chartex" xmlns:cx1="http://schemas.microsoft.com/office/drawing/2015/9/8/chartex" xmlns:cx2="http://schemas.microsoft.com/office/drawing/2015/10/21/chartex" xmlns:cx3="http://schemas.microsoft.com/office/drawing/2016/5/9/chartex" xmlns:cx4="http://schemas.microsoft.com/office/drawing/2016/5/10/chartex" xmlns:cx5="http://schemas.microsoft.com/office/drawing/2016/5/11/chartex" xmlns:cx6="http://schemas.microsoft.com/office/drawing/2016/5/12/chartex" xmlns:cx7="http://schemas.microsoft.com/office/drawing/2016/5/13/chartex" xmlns:cx8="http://schemas.microsoft.com/office/drawing/2016/5/14/chartex" xmlns:mc="http://schemas.openxmlformats.org/markup-compatibility/2006" xmlns:m="http://schemas.openxmlformats.org/officeDocument/2006/math" xmlns:aink="http://schemas.microsoft.com/office/drawing/2016/ink" xmlns:am3d="http://schemas.microsoft.com/office/drawing/2017/model3d" xmlns:oel="http://schemas.microsoft.com/office/2019/extlst" xmlns:r="http://schemas.openxmlformats.org/officeDocument/2006/relationships" xmlns:wp14="http://schemas.microsoft.com/office/word/2010/wordprocessingDrawing" xmlns:wp="http://schemas.openxmlformats.org/drawingml/2006/wordprocessingDrawing" xmlns:wpg="http://schemas.microsoft.com/office/word/2010/wordprocessingGroup" xmlns:wpi="http://schemas.microsoft.com/office/word/2010/wordprocessingInk" xmlns:wps="http://schemas.microsoft.com/office/word/2010/wordprocessingShape" xmlns:o="urn:schemas-microsoft-com:office:office" xmlns:v="urn:schemas-microsoft-com:vml" xmlns:w10="urn:schemas-microsoft-com:office:word" xmlns:w="http://schemas.openxmlformats.org/wordprocessingml/2006/main" xmlns:w14="http://schemas.microsoft.com/office/word/2010/wordml" xmlns:w15="http://schemas.microsoft.com/office/word/2012/wordml" xmlns:w16cex="http://schemas.microsoft.com/office/word/2018/wordml/cex" xmlns:w16cid="http://schemas.microsoft.com/office/word/2016/wordml/cid" xmlns:w16="http://schemas.microsoft.com/office/word/2018/wordml" xmlns:w16sdtdh="http://schemas.microsoft.com/office/word/2020/wordml/sdtdatahash" xmlns:w16sdtfl="http://schemas.microsoft.com/office/word/2024/wordml/sdtformatlock" xmlns:w16se="http://schemas.microsoft.com/office/word/2015/wordml/symex" xmlns:w16du="http://schemas.microsoft.com/office/word/2023/wordml/word16du" xmlns:wne="http://schemas.microsoft.com/office/word/2006/wordml" mc:Ignorable="w14 w15 w16se w16cid w16 w16cex w16sdtdh w16sdtfl w16du wp14">
+<w:hdr xmlns:wpc="http://schemas.microsoft.com/office/word/2010/wordprocessingCanvas" xmlns:cx="http://schemas.microsoft.com/office/drawing/2014/chartex" xmlns:cx1="http://schemas.microsoft.com/office/drawing/2015/9/8/chartex" xmlns:cx2="http://schemas.microsoft.com/office/drawing/2015/10/21/chartex" xmlns:cx3="http://schemas.microsoft.com/office/drawing/2016/5/9/chartex" xmlns:cx4="http://schemas.microsoft.com/office/drawing/2016/5/10/chartex" xmlns:cx5="http://schemas.microsoft.com/office/drawing/2016/5/11/chartex" xmlns:cx6="http://schemas.microsoft.com/office/drawing/2016/5/12/chartex" xmlns:cx7="http://schemas.microsoft.com/office/drawing/2016/5/13/chartex" xmlns:cx8="http://schemas.microsoft.com/office/drawing/2016/5/14/chartex" xmlns:mc="http://schemas.openxmlformats.org/markup-compatibility/2006" xmlns:aink="http://schemas.microsoft.com/office/drawing/2016/ink" xmlns:am3d="http://schemas.microsoft.com/office/drawing/2017/model3d" xmlns:o="urn:schemas-microsoft-com:office:office" xmlns:oel="http://schemas.microsoft.com/office/2019/extlst" xmlns:r="http://schemas.openxmlformats.org/officeDocument/2006/relationships" xmlns:m="http://schemas.openxmlformats.org/officeDocument/2006/math" xmlns:v="urn:schemas-microsoft-com:vml" xmlns:wp14="http://schemas.microsoft.com/office/word/2010/wordprocessingDrawing" xmlns:wp="http://schemas.openxmlformats.org/drawingml/2006/wordprocessingDrawing" xmlns:w10="urn:schemas-microsoft-com:office:word" xmlns:w="http://schemas.openxmlformats.org/wordprocessingml/2006/main" xmlns:w14="http://schemas.microsoft.com/office/word/2010/wordml" xmlns:w15="http://schemas.microsoft.com/office/word/2012/wordml" xmlns:w16cex="http://schemas.microsoft.com/office/word/2018/wordml/cex" xmlns:w16cid="http://schemas.microsoft.com/office/word/2016/wordml/cid" xmlns:w16="http://schemas.microsoft.com/office/word/2018/wordml" xmlns:w16du="http://schemas.microsoft.com/office/word/2023/wordml/word16du" xmlns:w16sdtdh="http://schemas.microsoft.com/office/word/2020/wordml/sdtdatahash" xmlns:w16sdtfl="http://schemas.microsoft.com/office/word/2024/wordml/sdtformatlock" xmlns:w16se="http://schemas.microsoft.com/office/word/2015/wordml/symex" xmlns:wpg="http://schemas.microsoft.com/office/word/2010/wordprocessingGroup" xmlns:wpi="http://schemas.microsoft.com/office/word/2010/wordprocessingInk" xmlns:wne="http://schemas.microsoft.com/office/word/2006/wordml" xmlns:wps="http://schemas.microsoft.com/office/word/2010/wordprocessingShape" mc:Ignorable="w14 w15 w16se w16cid w16 w16cex w16sdtdh w16sdtfl w16du wp14">
   <w:p>
     <w:pPr>
       <w:pStyle w:val="a3"/>
@@ -8244,7 +7830,7 @@
       <w:pBdr>
         <w:bottom w:val="single" w:sz="4" w:space="1" w:color="auto"/>
       </w:pBdr>
-      <w:ind w:firstLine="653"/>
+      <w:ind w:firstLine="643"/>
       <w:jc w:val="center"/>
       <w:outlineLvl w:val="0"/>
       <w:rPr>
@@ -8266,7 +7852,7 @@
 </file>
 
 <file path=word/header4.xml><?xml version="1.0" encoding="utf-8"?>
-<w:hdr xmlns:wpc="http://schemas.microsoft.com/office/word/2010/wordprocessingCanvas" xmlns:cx="http://schemas.microsoft.com/office/drawing/2014/chartex" xmlns:cx1="http://schemas.microsoft.com/office/drawing/2015/9/8/chartex" xmlns:cx2="http://schemas.microsoft.com/office/drawing/2015/10/21/chartex" xmlns:cx3="http://schemas.microsoft.com/office/drawing/2016/5/9/chartex" xmlns:cx4="http://schemas.microsoft.com/office/drawing/2016/5/10/chartex" xmlns:cx5="http://schemas.microsoft.com/office/drawing/2016/5/11/chartex" xmlns:cx6="http://schemas.microsoft.com/office/drawing/2016/5/12/chartex" xmlns:cx7="http://schemas.microsoft.com/office/drawing/2016/5/13/chartex" xmlns:cx8="http://schemas.microsoft.com/office/drawing/2016/5/14/chartex" xmlns:mc="http://schemas.openxmlformats.org/markup-compatibility/2006" xmlns:m="http://schemas.openxmlformats.org/officeDocument/2006/math" xmlns:aink="http://schemas.microsoft.com/office/drawing/2016/ink" xmlns:am3d="http://schemas.microsoft.com/office/drawing/2017/model3d" xmlns:oel="http://schemas.microsoft.com/office/2019/extlst" xmlns:r="http://schemas.openxmlformats.org/officeDocument/2006/relationships" xmlns:wp14="http://schemas.microsoft.com/office/word/2010/wordprocessingDrawing" xmlns:wp="http://schemas.openxmlformats.org/drawingml/2006/wordprocessingDrawing" xmlns:wpg="http://schemas.microsoft.com/office/word/2010/wordprocessingGroup" xmlns:wpi="http://schemas.microsoft.com/office/word/2010/wordprocessingInk" xmlns:wps="http://schemas.microsoft.com/office/word/2010/wordprocessingShape" xmlns:o="urn:schemas-microsoft-com:office:office" xmlns:v="urn:schemas-microsoft-com:vml" xmlns:w10="urn:schemas-microsoft-com:office:word" xmlns:w="http://schemas.openxmlformats.org/wordprocessingml/2006/main" xmlns:w14="http://schemas.microsoft.com/office/word/2010/wordml" xmlns:w15="http://schemas.microsoft.com/office/word/2012/wordml" xmlns:w16cex="http://schemas.microsoft.com/office/word/2018/wordml/cex" xmlns:w16cid="http://schemas.microsoft.com/office/word/2016/wordml/cid" xmlns:w16="http://schemas.microsoft.com/office/word/2018/wordml" xmlns:w16sdtdh="http://schemas.microsoft.com/office/word/2020/wordml/sdtdatahash" xmlns:w16sdtfl="http://schemas.microsoft.com/office/word/2024/wordml/sdtformatlock" xmlns:w16se="http://schemas.microsoft.com/office/word/2015/wordml/symex" xmlns:w16du="http://schemas.microsoft.com/office/word/2023/wordml/word16du" xmlns:wne="http://schemas.microsoft.com/office/word/2006/wordml" mc:Ignorable="w14 w15 w16se w16cid w16 w16cex w16sdtdh w16sdtfl w16du wp14">
+<w:hdr xmlns:wpc="http://schemas.microsoft.com/office/word/2010/wordprocessingCanvas" xmlns:cx="http://schemas.microsoft.com/office/drawing/2014/chartex" xmlns:cx1="http://schemas.microsoft.com/office/drawing/2015/9/8/chartex" xmlns:cx2="http://schemas.microsoft.com/office/drawing/2015/10/21/chartex" xmlns:cx3="http://schemas.microsoft.com/office/drawing/2016/5/9/chartex" xmlns:cx4="http://schemas.microsoft.com/office/drawing/2016/5/10/chartex" xmlns:cx5="http://schemas.microsoft.com/office/drawing/2016/5/11/chartex" xmlns:cx6="http://schemas.microsoft.com/office/drawing/2016/5/12/chartex" xmlns:cx7="http://schemas.microsoft.com/office/drawing/2016/5/13/chartex" xmlns:cx8="http://schemas.microsoft.com/office/drawing/2016/5/14/chartex" xmlns:mc="http://schemas.openxmlformats.org/markup-compatibility/2006" xmlns:aink="http://schemas.microsoft.com/office/drawing/2016/ink" xmlns:am3d="http://schemas.microsoft.com/office/drawing/2017/model3d" xmlns:o="urn:schemas-microsoft-com:office:office" xmlns:oel="http://schemas.microsoft.com/office/2019/extlst" xmlns:r="http://schemas.openxmlformats.org/officeDocument/2006/relationships" xmlns:m="http://schemas.openxmlformats.org/officeDocument/2006/math" xmlns:v="urn:schemas-microsoft-com:vml" xmlns:wp14="http://schemas.microsoft.com/office/word/2010/wordprocessingDrawing" xmlns:wp="http://schemas.openxmlformats.org/drawingml/2006/wordprocessingDrawing" xmlns:w10="urn:schemas-microsoft-com:office:word" xmlns:w="http://schemas.openxmlformats.org/wordprocessingml/2006/main" xmlns:w14="http://schemas.microsoft.com/office/word/2010/wordml" xmlns:w15="http://schemas.microsoft.com/office/word/2012/wordml" xmlns:w16cex="http://schemas.microsoft.com/office/word/2018/wordml/cex" xmlns:w16cid="http://schemas.microsoft.com/office/word/2016/wordml/cid" xmlns:w16="http://schemas.microsoft.com/office/word/2018/wordml" xmlns:w16du="http://schemas.microsoft.com/office/word/2023/wordml/word16du" xmlns:w16sdtdh="http://schemas.microsoft.com/office/word/2020/wordml/sdtdatahash" xmlns:w16sdtfl="http://schemas.microsoft.com/office/word/2024/wordml/sdtformatlock" xmlns:w16se="http://schemas.microsoft.com/office/word/2015/wordml/symex" xmlns:wpg="http://schemas.microsoft.com/office/word/2010/wordprocessingGroup" xmlns:wpi="http://schemas.microsoft.com/office/word/2010/wordprocessingInk" xmlns:wne="http://schemas.microsoft.com/office/word/2006/wordml" xmlns:wps="http://schemas.microsoft.com/office/word/2010/wordprocessingShape" mc:Ignorable="w14 w15 w16se w16cid w16 w16cex w16sdtdh w16sdtfl w16du wp14">
   <w:p>
     <w:pPr>
       <w:pBdr>
@@ -8294,7 +7880,7 @@
 </file>
 
 <file path=word/header5.xml><?xml version="1.0" encoding="utf-8"?>
-<w:hdr xmlns:wpc="http://schemas.microsoft.com/office/word/2010/wordprocessingCanvas" xmlns:cx="http://schemas.microsoft.com/office/drawing/2014/chartex" xmlns:cx1="http://schemas.microsoft.com/office/drawing/2015/9/8/chartex" xmlns:cx2="http://schemas.microsoft.com/office/drawing/2015/10/21/chartex" xmlns:cx3="http://schemas.microsoft.com/office/drawing/2016/5/9/chartex" xmlns:cx4="http://schemas.microsoft.com/office/drawing/2016/5/10/chartex" xmlns:cx5="http://schemas.microsoft.com/office/drawing/2016/5/11/chartex" xmlns:cx6="http://schemas.microsoft.com/office/drawing/2016/5/12/chartex" xmlns:cx7="http://schemas.microsoft.com/office/drawing/2016/5/13/chartex" xmlns:cx8="http://schemas.microsoft.com/office/drawing/2016/5/14/chartex" xmlns:mc="http://schemas.openxmlformats.org/markup-compatibility/2006" xmlns:m="http://schemas.openxmlformats.org/officeDocument/2006/math" xmlns:aink="http://schemas.microsoft.com/office/drawing/2016/ink" xmlns:am3d="http://schemas.microsoft.com/office/drawing/2017/model3d" xmlns:oel="http://schemas.microsoft.com/office/2019/extlst" xmlns:r="http://schemas.openxmlformats.org/officeDocument/2006/relationships" xmlns:wp14="http://schemas.microsoft.com/office/word/2010/wordprocessingDrawing" xmlns:wp="http://schemas.openxmlformats.org/drawingml/2006/wordprocessingDrawing" xmlns:wpg="http://schemas.microsoft.com/office/word/2010/wordprocessingGroup" xmlns:wpi="http://schemas.microsoft.com/office/word/2010/wordprocessingInk" xmlns:wps="http://schemas.microsoft.com/office/word/2010/wordprocessingShape" xmlns:o="urn:schemas-microsoft-com:office:office" xmlns:v="urn:schemas-microsoft-com:vml" xmlns:w10="urn:schemas-microsoft-com:office:word" xmlns:w="http://schemas.openxmlformats.org/wordprocessingml/2006/main" xmlns:w14="http://schemas.microsoft.com/office/word/2010/wordml" xmlns:w15="http://schemas.microsoft.com/office/word/2012/wordml" xmlns:w16cex="http://schemas.microsoft.com/office/word/2018/wordml/cex" xmlns:w16cid="http://schemas.microsoft.com/office/word/2016/wordml/cid" xmlns:w16="http://schemas.microsoft.com/office/word/2018/wordml" xmlns:w16sdtdh="http://schemas.microsoft.com/office/word/2020/wordml/sdtdatahash" xmlns:w16sdtfl="http://schemas.microsoft.com/office/word/2024/wordml/sdtformatlock" xmlns:w16se="http://schemas.microsoft.com/office/word/2015/wordml/symex" xmlns:w16du="http://schemas.microsoft.com/office/word/2023/wordml/word16du" xmlns:wne="http://schemas.microsoft.com/office/word/2006/wordml" mc:Ignorable="w14 w15 w16se w16cid w16 w16cex w16sdtdh w16sdtfl w16du wp14">
+<w:hdr xmlns:wpc="http://schemas.microsoft.com/office/word/2010/wordprocessingCanvas" xmlns:cx="http://schemas.microsoft.com/office/drawing/2014/chartex" xmlns:cx1="http://schemas.microsoft.com/office/drawing/2015/9/8/chartex" xmlns:cx2="http://schemas.microsoft.com/office/drawing/2015/10/21/chartex" xmlns:cx3="http://schemas.microsoft.com/office/drawing/2016/5/9/chartex" xmlns:cx4="http://schemas.microsoft.com/office/drawing/2016/5/10/chartex" xmlns:cx5="http://schemas.microsoft.com/office/drawing/2016/5/11/chartex" xmlns:cx6="http://schemas.microsoft.com/office/drawing/2016/5/12/chartex" xmlns:cx7="http://schemas.microsoft.com/office/drawing/2016/5/13/chartex" xmlns:cx8="http://schemas.microsoft.com/office/drawing/2016/5/14/chartex" xmlns:mc="http://schemas.openxmlformats.org/markup-compatibility/2006" xmlns:aink="http://schemas.microsoft.com/office/drawing/2016/ink" xmlns:am3d="http://schemas.microsoft.com/office/drawing/2017/model3d" xmlns:o="urn:schemas-microsoft-com:office:office" xmlns:oel="http://schemas.microsoft.com/office/2019/extlst" xmlns:r="http://schemas.openxmlformats.org/officeDocument/2006/relationships" xmlns:m="http://schemas.openxmlformats.org/officeDocument/2006/math" xmlns:v="urn:schemas-microsoft-com:vml" xmlns:wp14="http://schemas.microsoft.com/office/word/2010/wordprocessingDrawing" xmlns:wp="http://schemas.openxmlformats.org/drawingml/2006/wordprocessingDrawing" xmlns:w10="urn:schemas-microsoft-com:office:word" xmlns:w="http://schemas.openxmlformats.org/wordprocessingml/2006/main" xmlns:w14="http://schemas.microsoft.com/office/word/2010/wordml" xmlns:w15="http://schemas.microsoft.com/office/word/2012/wordml" xmlns:w16cex="http://schemas.microsoft.com/office/word/2018/wordml/cex" xmlns:w16cid="http://schemas.microsoft.com/office/word/2016/wordml/cid" xmlns:w16="http://schemas.microsoft.com/office/word/2018/wordml" xmlns:w16du="http://schemas.microsoft.com/office/word/2023/wordml/word16du" xmlns:w16sdtdh="http://schemas.microsoft.com/office/word/2020/wordml/sdtdatahash" xmlns:w16sdtfl="http://schemas.microsoft.com/office/word/2024/wordml/sdtformatlock" xmlns:w16se="http://schemas.microsoft.com/office/word/2015/wordml/symex" xmlns:wpg="http://schemas.microsoft.com/office/word/2010/wordprocessingGroup" xmlns:wpi="http://schemas.microsoft.com/office/word/2010/wordprocessingInk" xmlns:wne="http://schemas.microsoft.com/office/word/2006/wordml" xmlns:wps="http://schemas.microsoft.com/office/word/2010/wordprocessingShape" mc:Ignorable="w14 w15 w16se w16cid w16 w16cex w16sdtdh w16sdtfl w16du wp14">
   <w:p>
     <w:pPr>
       <w:pBdr>
@@ -8322,7 +7908,7 @@
 </file>
 
 <file path=word/header6.xml><?xml version="1.0" encoding="utf-8"?>
-<w:hdr xmlns:wpc="http://schemas.microsoft.com/office/word/2010/wordprocessingCanvas" xmlns:cx="http://schemas.microsoft.com/office/drawing/2014/chartex" xmlns:cx1="http://schemas.microsoft.com/office/drawing/2015/9/8/chartex" xmlns:cx2="http://schemas.microsoft.com/office/drawing/2015/10/21/chartex" xmlns:cx3="http://schemas.microsoft.com/office/drawing/2016/5/9/chartex" xmlns:cx4="http://schemas.microsoft.com/office/drawing/2016/5/10/chartex" xmlns:cx5="http://schemas.microsoft.com/office/drawing/2016/5/11/chartex" xmlns:cx6="http://schemas.microsoft.com/office/drawing/2016/5/12/chartex" xmlns:cx7="http://schemas.microsoft.com/office/drawing/2016/5/13/chartex" xmlns:cx8="http://schemas.microsoft.com/office/drawing/2016/5/14/chartex" xmlns:mc="http://schemas.openxmlformats.org/markup-compatibility/2006" xmlns:m="http://schemas.openxmlformats.org/officeDocument/2006/math" xmlns:aink="http://schemas.microsoft.com/office/drawing/2016/ink" xmlns:am3d="http://schemas.microsoft.com/office/drawing/2017/model3d" xmlns:oel="http://schemas.microsoft.com/office/2019/extlst" xmlns:r="http://schemas.openxmlformats.org/officeDocument/2006/relationships" xmlns:wp14="http://schemas.microsoft.com/office/word/2010/wordprocessingDrawing" xmlns:wp="http://schemas.openxmlformats.org/drawingml/2006/wordprocessingDrawing" xmlns:wpg="http://schemas.microsoft.com/office/word/2010/wordprocessingGroup" xmlns:wpi="http://schemas.microsoft.com/office/word/2010/wordprocessingInk" xmlns:wps="http://schemas.microsoft.com/office/word/2010/wordprocessingShape" xmlns:o="urn:schemas-microsoft-com:office:office" xmlns:v="urn:schemas-microsoft-com:vml" xmlns:w10="urn:schemas-microsoft-com:office:word" xmlns:w="http://schemas.openxmlformats.org/wordprocessingml/2006/main" xmlns:w14="http://schemas.microsoft.com/office/word/2010/wordml" xmlns:w15="http://schemas.microsoft.com/office/word/2012/wordml" xmlns:w16cex="http://schemas.microsoft.com/office/word/2018/wordml/cex" xmlns:w16cid="http://schemas.microsoft.com/office/word/2016/wordml/cid" xmlns:w16="http://schemas.microsoft.com/office/word/2018/wordml" xmlns:w16sdtdh="http://schemas.microsoft.com/office/word/2020/wordml/sdtdatahash" xmlns:w16sdtfl="http://schemas.microsoft.com/office/word/2024/wordml/sdtformatlock" xmlns:w16se="http://schemas.microsoft.com/office/word/2015/wordml/symex" xmlns:w16du="http://schemas.microsoft.com/office/word/2023/wordml/word16du" xmlns:wne="http://schemas.microsoft.com/office/word/2006/wordml" mc:Ignorable="w14 w15 w16se w16cid w16 w16cex w16sdtdh w16sdtfl w16du wp14">
+<w:hdr xmlns:wpc="http://schemas.microsoft.com/office/word/2010/wordprocessingCanvas" xmlns:cx="http://schemas.microsoft.com/office/drawing/2014/chartex" xmlns:cx1="http://schemas.microsoft.com/office/drawing/2015/9/8/chartex" xmlns:cx2="http://schemas.microsoft.com/office/drawing/2015/10/21/chartex" xmlns:cx3="http://schemas.microsoft.com/office/drawing/2016/5/9/chartex" xmlns:cx4="http://schemas.microsoft.com/office/drawing/2016/5/10/chartex" xmlns:cx5="http://schemas.microsoft.com/office/drawing/2016/5/11/chartex" xmlns:cx6="http://schemas.microsoft.com/office/drawing/2016/5/12/chartex" xmlns:cx7="http://schemas.microsoft.com/office/drawing/2016/5/13/chartex" xmlns:cx8="http://schemas.microsoft.com/office/drawing/2016/5/14/chartex" xmlns:mc="http://schemas.openxmlformats.org/markup-compatibility/2006" xmlns:aink="http://schemas.microsoft.com/office/drawing/2016/ink" xmlns:am3d="http://schemas.microsoft.com/office/drawing/2017/model3d" xmlns:o="urn:schemas-microsoft-com:office:office" xmlns:oel="http://schemas.microsoft.com/office/2019/extlst" xmlns:r="http://schemas.openxmlformats.org/officeDocument/2006/relationships" xmlns:m="http://schemas.openxmlformats.org/officeDocument/2006/math" xmlns:v="urn:schemas-microsoft-com:vml" xmlns:wp14="http://schemas.microsoft.com/office/word/2010/wordprocessingDrawing" xmlns:wp="http://schemas.openxmlformats.org/drawingml/2006/wordprocessingDrawing" xmlns:w10="urn:schemas-microsoft-com:office:word" xmlns:w="http://schemas.openxmlformats.org/wordprocessingml/2006/main" xmlns:w14="http://schemas.microsoft.com/office/word/2010/wordml" xmlns:w15="http://schemas.microsoft.com/office/word/2012/wordml" xmlns:w16cex="http://schemas.microsoft.com/office/word/2018/wordml/cex" xmlns:w16cid="http://schemas.microsoft.com/office/word/2016/wordml/cid" xmlns:w16="http://schemas.microsoft.com/office/word/2018/wordml" xmlns:w16du="http://schemas.microsoft.com/office/word/2023/wordml/word16du" xmlns:w16sdtdh="http://schemas.microsoft.com/office/word/2020/wordml/sdtdatahash" xmlns:w16sdtfl="http://schemas.microsoft.com/office/word/2024/wordml/sdtformatlock" xmlns:w16se="http://schemas.microsoft.com/office/word/2015/wordml/symex" xmlns:wpg="http://schemas.microsoft.com/office/word/2010/wordprocessingGroup" xmlns:wpi="http://schemas.microsoft.com/office/word/2010/wordprocessingInk" xmlns:wne="http://schemas.microsoft.com/office/word/2006/wordml" xmlns:wps="http://schemas.microsoft.com/office/word/2010/wordprocessingShape" mc:Ignorable="w14 w15 w16se w16cid w16 w16cex w16sdtdh w16sdtfl w16du wp14">
   <w:p>
     <w:pPr>
       <w:pBdr>
@@ -8350,7 +7936,7 @@
 </file>
 
 <file path=word/header7.xml><?xml version="1.0" encoding="utf-8"?>
-<w:hdr xmlns:wpc="http://schemas.microsoft.com/office/word/2010/wordprocessingCanvas" xmlns:cx="http://schemas.microsoft.com/office/drawing/2014/chartex" xmlns:cx1="http://schemas.microsoft.com/office/drawing/2015/9/8/chartex" xmlns:cx2="http://schemas.microsoft.com/office/drawing/2015/10/21/chartex" xmlns:cx3="http://schemas.microsoft.com/office/drawing/2016/5/9/chartex" xmlns:cx4="http://schemas.microsoft.com/office/drawing/2016/5/10/chartex" xmlns:cx5="http://schemas.microsoft.com/office/drawing/2016/5/11/chartex" xmlns:cx6="http://schemas.microsoft.com/office/drawing/2016/5/12/chartex" xmlns:cx7="http://schemas.microsoft.com/office/drawing/2016/5/13/chartex" xmlns:cx8="http://schemas.microsoft.com/office/drawing/2016/5/14/chartex" xmlns:mc="http://schemas.openxmlformats.org/markup-compatibility/2006" xmlns:m="http://schemas.openxmlformats.org/officeDocument/2006/math" xmlns:aink="http://schemas.microsoft.com/office/drawing/2016/ink" xmlns:am3d="http://schemas.microsoft.com/office/drawing/2017/model3d" xmlns:oel="http://schemas.microsoft.com/office/2019/extlst" xmlns:r="http://schemas.openxmlformats.org/officeDocument/2006/relationships" xmlns:wp14="http://schemas.microsoft.com/office/word/2010/wordprocessingDrawing" xmlns:wp="http://schemas.openxmlformats.org/drawingml/2006/wordprocessingDrawing" xmlns:wpg="http://schemas.microsoft.com/office/word/2010/wordprocessingGroup" xmlns:wpi="http://schemas.microsoft.com/office/word/2010/wordprocessingInk" xmlns:wps="http://schemas.microsoft.com/office/word/2010/wordprocessingShape" xmlns:o="urn:schemas-microsoft-com:office:office" xmlns:v="urn:schemas-microsoft-com:vml" xmlns:w10="urn:schemas-microsoft-com:office:word" xmlns:w="http://schemas.openxmlformats.org/wordprocessingml/2006/main" xmlns:w14="http://schemas.microsoft.com/office/word/2010/wordml" xmlns:w15="http://schemas.microsoft.com/office/word/2012/wordml" xmlns:w16cex="http://schemas.microsoft.com/office/word/2018/wordml/cex" xmlns:w16cid="http://schemas.microsoft.com/office/word/2016/wordml/cid" xmlns:w16="http://schemas.microsoft.com/office/word/2018/wordml" xmlns:w16sdtdh="http://schemas.microsoft.com/office/word/2020/wordml/sdtdatahash" xmlns:w16sdtfl="http://schemas.microsoft.com/office/word/2024/wordml/sdtformatlock" xmlns:w16se="http://schemas.microsoft.com/office/word/2015/wordml/symex" xmlns:w16du="http://schemas.microsoft.com/office/word/2023/wordml/word16du" xmlns:wne="http://schemas.microsoft.com/office/word/2006/wordml" mc:Ignorable="w14 w15 w16se w16cid w16 w16cex w16sdtdh w16sdtfl w16du wp14">
+<w:hdr xmlns:wpc="http://schemas.microsoft.com/office/word/2010/wordprocessingCanvas" xmlns:cx="http://schemas.microsoft.com/office/drawing/2014/chartex" xmlns:cx1="http://schemas.microsoft.com/office/drawing/2015/9/8/chartex" xmlns:cx2="http://schemas.microsoft.com/office/drawing/2015/10/21/chartex" xmlns:cx3="http://schemas.microsoft.com/office/drawing/2016/5/9/chartex" xmlns:cx4="http://schemas.microsoft.com/office/drawing/2016/5/10/chartex" xmlns:cx5="http://schemas.microsoft.com/office/drawing/2016/5/11/chartex" xmlns:cx6="http://schemas.microsoft.com/office/drawing/2016/5/12/chartex" xmlns:cx7="http://schemas.microsoft.com/office/drawing/2016/5/13/chartex" xmlns:cx8="http://schemas.microsoft.com/office/drawing/2016/5/14/chartex" xmlns:mc="http://schemas.openxmlformats.org/markup-compatibility/2006" xmlns:aink="http://schemas.microsoft.com/office/drawing/2016/ink" xmlns:am3d="http://schemas.microsoft.com/office/drawing/2017/model3d" xmlns:o="urn:schemas-microsoft-com:office:office" xmlns:oel="http://schemas.microsoft.com/office/2019/extlst" xmlns:r="http://schemas.openxmlformats.org/officeDocument/2006/relationships" xmlns:m="http://schemas.openxmlformats.org/officeDocument/2006/math" xmlns:v="urn:schemas-microsoft-com:vml" xmlns:wp14="http://schemas.microsoft.com/office/word/2010/wordprocessingDrawing" xmlns:wp="http://schemas.openxmlformats.org/drawingml/2006/wordprocessingDrawing" xmlns:w10="urn:schemas-microsoft-com:office:word" xmlns:w="http://schemas.openxmlformats.org/wordprocessingml/2006/main" xmlns:w14="http://schemas.microsoft.com/office/word/2010/wordml" xmlns:w15="http://schemas.microsoft.com/office/word/2012/wordml" xmlns:w16cex="http://schemas.microsoft.com/office/word/2018/wordml/cex" xmlns:w16cid="http://schemas.microsoft.com/office/word/2016/wordml/cid" xmlns:w16="http://schemas.microsoft.com/office/word/2018/wordml" xmlns:w16du="http://schemas.microsoft.com/office/word/2023/wordml/word16du" xmlns:w16sdtdh="http://schemas.microsoft.com/office/word/2020/wordml/sdtdatahash" xmlns:w16sdtfl="http://schemas.microsoft.com/office/word/2024/wordml/sdtformatlock" xmlns:w16se="http://schemas.microsoft.com/office/word/2015/wordml/symex" xmlns:wpg="http://schemas.microsoft.com/office/word/2010/wordprocessingGroup" xmlns:wpi="http://schemas.microsoft.com/office/word/2010/wordprocessingInk" xmlns:wne="http://schemas.microsoft.com/office/word/2006/wordml" xmlns:wps="http://schemas.microsoft.com/office/word/2010/wordprocessingShape" mc:Ignorable="w14 w15 w16se w16cid w16 w16cex w16sdtdh w16sdtfl w16du wp14">
   <w:p>
     <w:pPr>
       <w:pBdr>
@@ -8388,7 +7974,7 @@
 </file>
 
 <file path=word/numbering.xml><?xml version="1.0" encoding="utf-8"?>
-<w:numbering xmlns:wpc="http://schemas.microsoft.com/office/word/2010/wordprocessingCanvas" xmlns:cx="http://schemas.microsoft.com/office/drawing/2014/chartex" xmlns:cx1="http://schemas.microsoft.com/office/drawing/2015/9/8/chartex" xmlns:cx2="http://schemas.microsoft.com/office/drawing/2015/10/21/chartex" xmlns:cx3="http://schemas.microsoft.com/office/drawing/2016/5/9/chartex" xmlns:cx4="http://schemas.microsoft.com/office/drawing/2016/5/10/chartex" xmlns:cx5="http://schemas.microsoft.com/office/drawing/2016/5/11/chartex" xmlns:cx6="http://schemas.microsoft.com/office/drawing/2016/5/12/chartex" xmlns:cx7="http://schemas.microsoft.com/office/drawing/2016/5/13/chartex" xmlns:cx8="http://schemas.microsoft.com/office/drawing/2016/5/14/chartex" xmlns:mc="http://schemas.openxmlformats.org/markup-compatibility/2006" xmlns:m="http://schemas.openxmlformats.org/officeDocument/2006/math" xmlns:aink="http://schemas.microsoft.com/office/drawing/2016/ink" xmlns:am3d="http://schemas.microsoft.com/office/drawing/2017/model3d" xmlns:oel="http://schemas.microsoft.com/office/2019/extlst" xmlns:r="http://schemas.openxmlformats.org/officeDocument/2006/relationships" xmlns:wp14="http://schemas.microsoft.com/office/word/2010/wordprocessingDrawing" xmlns:wp="http://schemas.openxmlformats.org/drawingml/2006/wordprocessingDrawing" xmlns:wpg="http://schemas.microsoft.com/office/word/2010/wordprocessingGroup" xmlns:wpi="http://schemas.microsoft.com/office/word/2010/wordprocessingInk" xmlns:wps="http://schemas.microsoft.com/office/word/2010/wordprocessingShape" xmlns:o="urn:schemas-microsoft-com:office:office" xmlns:v="urn:schemas-microsoft-com:vml" xmlns:w10="urn:schemas-microsoft-com:office:word" xmlns:w="http://schemas.openxmlformats.org/wordprocessingml/2006/main" xmlns:w14="http://schemas.microsoft.com/office/word/2010/wordml" xmlns:w15="http://schemas.microsoft.com/office/word/2012/wordml" xmlns:w16cex="http://schemas.microsoft.com/office/word/2018/wordml/cex" xmlns:w16cid="http://schemas.microsoft.com/office/word/2016/wordml/cid" xmlns:w16="http://schemas.microsoft.com/office/word/2018/wordml" xmlns:w16sdtdh="http://schemas.microsoft.com/office/word/2020/wordml/sdtdatahash" xmlns:w16sdtfl="http://schemas.microsoft.com/office/word/2024/wordml/sdtformatlock" xmlns:w16se="http://schemas.microsoft.com/office/word/2015/wordml/symex" xmlns:w16du="http://schemas.microsoft.com/office/word/2023/wordml/word16du" xmlns:wne="http://schemas.microsoft.com/office/word/2006/wordml" mc:Ignorable="w14 w15 w16se w16cid w16 w16cex w16sdtdh w16sdtfl w16du wp14">
+<w:numbering xmlns:wpc="http://schemas.microsoft.com/office/word/2010/wordprocessingCanvas" xmlns:cx="http://schemas.microsoft.com/office/drawing/2014/chartex" xmlns:cx1="http://schemas.microsoft.com/office/drawing/2015/9/8/chartex" xmlns:cx2="http://schemas.microsoft.com/office/drawing/2015/10/21/chartex" xmlns:cx3="http://schemas.microsoft.com/office/drawing/2016/5/9/chartex" xmlns:cx4="http://schemas.microsoft.com/office/drawing/2016/5/10/chartex" xmlns:cx5="http://schemas.microsoft.com/office/drawing/2016/5/11/chartex" xmlns:cx6="http://schemas.microsoft.com/office/drawing/2016/5/12/chartex" xmlns:cx7="http://schemas.microsoft.com/office/drawing/2016/5/13/chartex" xmlns:cx8="http://schemas.microsoft.com/office/drawing/2016/5/14/chartex" xmlns:mc="http://schemas.openxmlformats.org/markup-compatibility/2006" xmlns:aink="http://schemas.microsoft.com/office/drawing/2016/ink" xmlns:am3d="http://schemas.microsoft.com/office/drawing/2017/model3d" xmlns:o="urn:schemas-microsoft-com:office:office" xmlns:oel="http://schemas.microsoft.com/office/2019/extlst" xmlns:r="http://schemas.openxmlformats.org/officeDocument/2006/relationships" xmlns:m="http://schemas.openxmlformats.org/officeDocument/2006/math" xmlns:v="urn:schemas-microsoft-com:vml" xmlns:wp14="http://schemas.microsoft.com/office/word/2010/wordprocessingDrawing" xmlns:wp="http://schemas.openxmlformats.org/drawingml/2006/wordprocessingDrawing" xmlns:w10="urn:schemas-microsoft-com:office:word" xmlns:w="http://schemas.openxmlformats.org/wordprocessingml/2006/main" xmlns:w14="http://schemas.microsoft.com/office/word/2010/wordml" xmlns:w15="http://schemas.microsoft.com/office/word/2012/wordml" xmlns:w16cex="http://schemas.microsoft.com/office/word/2018/wordml/cex" xmlns:w16cid="http://schemas.microsoft.com/office/word/2016/wordml/cid" xmlns:w16="http://schemas.microsoft.com/office/word/2018/wordml" xmlns:w16du="http://schemas.microsoft.com/office/word/2023/wordml/word16du" xmlns:w16sdtdh="http://schemas.microsoft.com/office/word/2020/wordml/sdtdatahash" xmlns:w16sdtfl="http://schemas.microsoft.com/office/word/2024/wordml/sdtformatlock" xmlns:w16se="http://schemas.microsoft.com/office/word/2015/wordml/symex" xmlns:wpg="http://schemas.microsoft.com/office/word/2010/wordprocessingGroup" xmlns:wpi="http://schemas.microsoft.com/office/word/2010/wordprocessingInk" xmlns:wne="http://schemas.microsoft.com/office/word/2006/wordml" xmlns:wps="http://schemas.microsoft.com/office/word/2010/wordprocessingShape" mc:Ignorable="w14 w15 w16se w16cid w16 w16cex w16sdtdh w16sdtfl w16du wp14">
   <w:abstractNum w:abstractNumId="0" w15:restartNumberingAfterBreak="0">
     <w:nsid w:val="1B7632DA"/>
     <w:multiLevelType w:val="hybridMultilevel"/>
@@ -9093,7 +8679,7 @@
 </file>
 
 <file path=word/styles.xml><?xml version="1.0" encoding="utf-8"?>
-<w:styles xmlns:mc="http://schemas.openxmlformats.org/markup-compatibility/2006" xmlns:r="http://schemas.openxmlformats.org/officeDocument/2006/relationships" xmlns:w="http://schemas.openxmlformats.org/wordprocessingml/2006/main" xmlns:w14="http://schemas.microsoft.com/office/word/2010/wordml" xmlns:w15="http://schemas.microsoft.com/office/word/2012/wordml" xmlns:w16cex="http://schemas.microsoft.com/office/word/2018/wordml/cex" xmlns:w16cid="http://schemas.microsoft.com/office/word/2016/wordml/cid" xmlns:w16="http://schemas.microsoft.com/office/word/2018/wordml" xmlns:w16sdtdh="http://schemas.microsoft.com/office/word/2020/wordml/sdtdatahash" xmlns:w16sdtfl="http://schemas.microsoft.com/office/word/2024/wordml/sdtformatlock" xmlns:w16se="http://schemas.microsoft.com/office/word/2015/wordml/symex" xmlns:w16du="http://schemas.microsoft.com/office/word/2023/wordml/word16du" mc:Ignorable="w14 w15 w16se w16cid w16 w16cex w16sdtdh w16sdtfl w16du">
+<w:styles xmlns:mc="http://schemas.openxmlformats.org/markup-compatibility/2006" xmlns:r="http://schemas.openxmlformats.org/officeDocument/2006/relationships" xmlns:w="http://schemas.openxmlformats.org/wordprocessingml/2006/main" xmlns:w14="http://schemas.microsoft.com/office/word/2010/wordml" xmlns:w15="http://schemas.microsoft.com/office/word/2012/wordml" xmlns:w16cex="http://schemas.microsoft.com/office/word/2018/wordml/cex" xmlns:w16cid="http://schemas.microsoft.com/office/word/2016/wordml/cid" xmlns:w16="http://schemas.microsoft.com/office/word/2018/wordml" xmlns:w16du="http://schemas.microsoft.com/office/word/2023/wordml/word16du" xmlns:w16sdtdh="http://schemas.microsoft.com/office/word/2020/wordml/sdtdatahash" xmlns:w16sdtfl="http://schemas.microsoft.com/office/word/2024/wordml/sdtformatlock" xmlns:w16se="http://schemas.microsoft.com/office/word/2015/wordml/symex" mc:Ignorable="w14 w15 w16se w16cid w16 w16cex w16sdtdh w16sdtfl w16du">
   <w:docDefaults>
     <w:rPrDefault>
       <w:rPr>
@@ -9532,6 +9118,7 @@
   <w:style w:type="character" w:default="1" w:styleId="a0">
     <w:name w:val="Default Paragraph Font"/>
     <w:uiPriority w:val="1"/>
+    <w:semiHidden/>
     <w:unhideWhenUsed/>
   </w:style>
   <w:style w:type="table" w:default="1" w:styleId="a1">

</xml_diff>